<commit_message>
Keep search and OA language in Methods only.
The Abstract now maps the science, not how full texts were obtained.
check_article.py fails if Scopus, open full texts, year windows, or
paywalls appear outside Methods.

Co-authored-by: hvianagil-alt <hvianagil-alt@users.noreply.github.com>
</commit_message>
<xml_diff>
--- a/review/runs/2026-09-20-scopus-hpp/export/article.docx
+++ b/review/runs/2026-09-20-scopus-hpp/export/article.docx
@@ -28,7 +28,7 @@
         <w:jc w:val="both"/>
       </w:pPr>
       <w:r>
-        <w:t xml:space="preserve">Heat remains the default way to make food microbiologically safe because it can deliver large, predictable reductions of vegetative pathogens. The same heat also drives flavour loss, enzyme damage, and protein denaturation that consumers and some product classes cannot tolerate. High-pressure processing (HPP) applies hundreds of megapascals, usually at chilled or ambient temperature, through a packed food so that pressure is uniform regardless of piece size. Vegetative cells often die; bacterial spores and several enzymes often do not. This narrative review organises open full texts from 2021–2026 around three tensions rather than around a single log-reduction number: (i) how matrix, solute, recovery medium, and injury change the kill that a given pressure appears to deliver; (ii) whether HPP meets legal or 5-log pasteurisation criteria in milk and juices; and (iii) when quality (texture, polyphenol oxidase, bioactive proteins, allergenicity) moves with, or against, plate counts. Primary evidence is laboratory challenges, storage trials, one scientific opinion, and systematic or scoping reviews; almost none of it can be pooled. Those patterns do not imply that HPP is a sterilant, that it is equivalent to high-temperature short-time milk pasteurisation, or that every nonthermal field (ultrasound, plasma, irradiation) can be substituted for pressure. The next measurements that would change practice are paired pathogen and protein assays in milk, juice validations that name</w:t>
+        <w:t xml:space="preserve">Heat remains the default way to make food microbiologically safe because it can deliver large, predictable reductions of vegetative pathogens. The same heat also drives flavour loss, enzyme damage, and protein denaturation that consumers and some product classes cannot tolerate. High-pressure processing (HPP) applies hundreds of megapascals, usually at chilled or ambient temperature, through a packed food so that pressure is uniform regardless of piece size. Vegetative cells often die; bacterial spores and several enzymes often do not. This narrative review organises the literature around three tensions rather than around a single log-reduction number: (i) how matrix, solute, recovery medium, and injury change the kill that a given pressure appears to deliver; (ii) whether HPP meets legal or 5-log pasteurisation criteria in milk and juices; and (iii) when quality (texture, polyphenol oxidase, bioactive proteins, allergenicity) moves with, or against, plate counts. Primary evidence is laboratory challenges, storage trials, one scientific opinion, and systematic or scoping reviews; almost none of it can be pooled. Those patterns do not imply that HPP is a sterilant, that it is equivalent to high-temperature short-time milk pasteurisation, or that every nonthermal field (ultrasound, plasma, irradiation) can be substituted for pressure. The next measurements that would change practice are paired pathogen and protein assays in milk, juice validations that name</w:t>
       </w:r>
       <w:r>
         <w:t xml:space="preserve"> </w:t>
@@ -199,7 +199,7 @@
         <w:jc w:val="both"/>
       </w:pPr>
       <w:r>
-        <w:t xml:space="preserve">A third, quieter problem is injury. Pressure can open membrane pores that later shrink [10], hide survivors on selective agar [11], and leave cells that grow back in storage [12,13]. Culture-negative immediately after treatment is not the same as dead. High-pressure thermal processing (HPTP) adds heat under pressure to finish spores, at the cost of the</w:t>
+        <w:t xml:space="preserve">A third, quieter problem is injury. Pressure can open membrane pores that later shrink [10], hide survivors on selective agar [11], and leave cells that grow back in storage [12,13]. A plate that is blank the afternoon of treatment can still hide injured cells that grow in a recovery broth or during chilled storage. Culture-negative immediately after treatment is not the same as dead. High-pressure thermal processing (HPTP) adds heat under pressure to finish spores, at the cost of the</w:t>
       </w:r>
       <w:r>
         <w:t xml:space="preserve"> </w:t>
@@ -226,7 +226,7 @@
         <w:jc w:val="both"/>
       </w:pPr>
       <w:r>
-        <w:t xml:space="preserve">The aim of this review is to compare included full texts on HPP and related nonthermal processes as microbial and quality technologies, and the central argument of this review is that pressure is a reliable vegetative hurdle whose log reduction cannot be read from the set-point alone, while quality preservation is an endpoint that must be named (enzyme, protein, texture, allergen) rather than assumed.</w:t>
+        <w:t xml:space="preserve">The aim of this review is to compare included studies on HPP and related nonthermal processes as microbial and quality technologies, and the central argument of this review is that pressure is a reliable vegetative hurdle whose log reduction cannot be read from the set-point alone, while quality preservation is an endpoint that must be named (enzyme, protein, texture, allergen) rather than assumed.</w:t>
       </w:r>
     </w:p>
     <w:bookmarkEnd w:id="22"/>
@@ -483,7 +483,7 @@
         <w:t xml:space="preserve"> </w:t>
       </w:r>
       <w:r>
-        <w:t xml:space="preserve">Primary HPP or HPP-hurdle microbial outcomes in the included full texts (not pooled).</w:t>
+        <w:t xml:space="preserve">Primary HPP or HPP-hurdle microbial outcomes in the included studies (not pooled).</w:t>
       </w:r>
     </w:p>
     <w:tbl>
@@ -1404,7 +1404,7 @@
         <w:t xml:space="preserve"> </w:t>
       </w:r>
       <w:r>
-        <w:t xml:space="preserve">results used 60 °C and are no longer nonthermal [24]. That is the optimisation hole: a cycle mild enough to keep immunoglobulin G and lactoferrin is not automatically a 5-log pathogen cycle, and the experiments that would show both on the same batch are scarce [24]. OpenAlex retrieval for a paired high-temperature short-time versus HPP bovine-milk trial with both endpoints did not yield a new public full text (section 2).</w:t>
+        <w:t xml:space="preserve">results used 60 °C and are no longer nonthermal [24]. That is the optimisation hole: a cycle mild enough to keep immunoglobulin G and lactoferrin is not automatically a 5-log pathogen cycle, and the experiments that would show both on the same batch are scarce [24]. A paired high-temperature short-time versus HPP bovine-milk trial that reports both endpoints on the same batches is not among the included studies.</w:t>
       </w:r>
     </w:p>
     <w:p>
@@ -1483,7 +1483,7 @@
         <w:t xml:space="preserve"> </w:t>
       </w:r>
       <w:r>
-        <w:t xml:space="preserve">O157:H7 result. Celery juices after HPP kept total aerobic counts &lt;2 log CFU/ml for 8 weeks, with yeasts and moulds undetectable, while untreated juices spoiled in a week [27]. Semi-industrial red-globe grape juice lost about 3 log aerobic counts after HPP, ohmic heating, or thermal pasteurisation; PPO activity told a different story (HPP about 30% residual versus &gt;90% inactivation by ohmic and thermal) [6]. A flow-through dual-frequency sonicator at 50–55 °C reached &gt;3.6, 2.7, and 2.8 log reductions of yeast, mould, and aerobes in apple juice after 450 s efficient time and still missed a 5-log pathogen pasteurisation criterion; there was no isothermal heat-only arm [3]. Targeted retrieval of an</w:t>
+        <w:t xml:space="preserve">O157:H7 result. Celery juices after HPP kept total aerobic counts &lt;2 log CFU/ml for 8 weeks, with yeasts and moulds undetectable, while untreated juices spoiled in a week [27]. Semi-industrial red-globe grape juice lost about 3 log aerobic counts after HPP, ohmic heating, or thermal pasteurisation; PPO activity told a different story (HPP about 30% residual versus &gt;90% inactivation by ohmic and thermal) [6]. A flow-through dual-frequency sonicator at 50–55 °C reached &gt;3.6, 2.7, and 2.8 log reductions of yeast, mould, and aerobes in apple juice after 450 s efficient time and still missed a 5-log pathogen pasteurisation criterion; there was no isothermal heat-only arm [3]. None of the included juice papers reports an inoculated</w:t>
       </w:r>
       <w:r>
         <w:t xml:space="preserve"> </w:t>
@@ -1499,7 +1499,23 @@
         <w:t xml:space="preserve"> </w:t>
       </w:r>
       <w:r>
-        <w:t xml:space="preserve">O157:H7 juice HPP validation paper did not return a public full text.</w:t>
+        <w:t xml:space="preserve">O157:H7 or</w:t>
+      </w:r>
+      <w:r>
+        <w:t xml:space="preserve"> </w:t>
+      </w:r>
+      <w:r>
+        <w:rPr>
+          <w:iCs/>
+          <w:i/>
+        </w:rPr>
+        <w:t xml:space="preserve">Salmonella</w:t>
+      </w:r>
+      <w:r>
+        <w:t xml:space="preserve"> </w:t>
+      </w:r>
+      <w:r>
+        <w:t xml:space="preserve">5-log HPP validation.</w:t>
       </w:r>
     </w:p>
     <w:p>
@@ -1539,7 +1555,7 @@
         <w:t xml:space="preserve"> </w:t>
       </w:r>
       <w:r>
-        <w:t xml:space="preserve">Pasteurisation or 5-log benchmarks versus what included full texts actually measured.</w:t>
+        <w:t xml:space="preserve">Pasteurisation or 5-log benchmarks versus what included studies actually measured.</w:t>
       </w:r>
     </w:p>
     <w:tbl>
@@ -2534,7 +2550,7 @@
               <w:jc w:val="left"/>
             </w:pPr>
             <w:r>
-              <w:t xml:space="preserve">juices (review, gap-fill)</w:t>
+              <w:t xml:space="preserve">juices (review)</w:t>
             </w:r>
           </w:p>
         </w:tc>
@@ -3204,7 +3220,7 @@
         <w:jc w:val="both"/>
       </w:pPr>
       <w:r>
-        <w:t xml:space="preserve">This export is HPP-heavy. Other fields appear as supporting technologies, not as a balanced map. Ultrasound in apple juice at reduced temperature, with dual-frequency excitation and a Venturi, reached a few log of spoilage flora and improved visual sedimentation, with a specific energy of 0.044 kWh/L at the best condition, and did not replace a 5-log pathogen pasteuriser [3]. Ultrasound reviews of mycotoxin and fungal decontamination quote high percentage degradations of aflatoxin B1 under long, high-intensity treatments that are not juice HACCP validations [40]. Sugarcane-juice comparisons of ultrasound, pulsed electric fields, HPP, and microfluidization versus heat treat HHP as the most used nonthermal option in that matrix [41].</w:t>
+        <w:t xml:space="preserve">The included studies are HPP-heavy. Other fields appear as supporting technologies, not as a balanced map. Ultrasound in apple juice at reduced temperature, with dual-frequency excitation and a Venturi, reached a few log of spoilage flora and improved visual sedimentation, with a specific energy of 0.044 kWh/L at the best condition, and did not replace a 5-log pathogen pasteuriser [3]. Ultrasound reviews of mycotoxin and fungal decontamination quote high percentage degradations of aflatoxin B1 under long, high-intensity treatments that are not juice HACCP validations [40]. Sugarcane-juice comparisons of ultrasound, pulsed electric fields, HPP, and microfluidization versus heat treat HHP as the most used nonthermal option in that matrix [41].</w:t>
       </w:r>
     </w:p>
     <w:p>
@@ -3437,7 +3453,36 @@
         <w:jc w:val="both"/>
       </w:pPr>
       <w:r>
-        <w:t xml:space="preserve">Limitations of the studies are also limitations of this review. Public full texts were a minority of title-included records, so subscription challenge trials that may be the best 5-log juice work are missing; two targeted extra papers on O157 pressure resistance and HPP plus pulsed-electric-field pathogen reduction could not be opened as public files. Abstracts can disagree with results (donkey milk [7]). Several reviews recycle the same spore examples. Honey, kelp, crab, and cream are not one population. None of the included primary papers is a randomised trial of human foodborne disease. The gap-fill plant-food review adds D-values and equipment limits; it does not add a new inoculation [4].</w:t>
+        <w:t xml:space="preserve">Limitations of the studies are also limitations of this review. Named-pathogen juice validations (</w:t>
+      </w:r>
+      <w:r>
+        <w:rPr>
+          <w:iCs/>
+          <w:i/>
+        </w:rPr>
+        <w:t xml:space="preserve">E. coli</w:t>
+      </w:r>
+      <w:r>
+        <w:t xml:space="preserve"> </w:t>
+      </w:r>
+      <w:r>
+        <w:t xml:space="preserve">O157:H7 or</w:t>
+      </w:r>
+      <w:r>
+        <w:t xml:space="preserve"> </w:t>
+      </w:r>
+      <w:r>
+        <w:rPr>
+          <w:iCs/>
+          <w:i/>
+        </w:rPr>
+        <w:t xml:space="preserve">Salmonella</w:t>
+      </w:r>
+      <w:r>
+        <w:t xml:space="preserve"> </w:t>
+      </w:r>
+      <w:r>
+        <w:t xml:space="preserve">under HPP) and a paired bovine-milk HTST versus HPP trial with both pathogen and protein endpoints are not in this sample. Abstracts can disagree with results (donkey milk [7]). Several reviews recycle the same spore examples. Honey, kelp, crab, and cream are not one population. None of the included primary papers is a randomised trial of human foodborne disease. The plant-food kinetics review adds D-values and equipment limits; it does not add a new inoculation [4].</w:t>
       </w:r>
     </w:p>
     <w:p>

</xml_diff>

<commit_message>
Refresh HPP Word/PDF after continuous-prose Abstract and Conclusions.
Co-authored-by: hvianagil-alt <hvianagil-alt@users.noreply.github.com>
</commit_message>
<xml_diff>
--- a/review/runs/2026-09-20-scopus-hpp/export/article.docx
+++ b/review/runs/2026-09-20-scopus-hpp/export/article.docx
@@ -28,7 +28,7 @@
         <w:jc w:val="both"/>
       </w:pPr>
       <w:r>
-        <w:t xml:space="preserve">Heat remains the default way to make food microbiologically safe because it can deliver large, predictable reductions of vegetative pathogens. The same heat also drives flavour loss, enzyme damage, and protein denaturation that consumers and some product classes cannot tolerate. High-pressure processing (HPP) applies hundreds of megapascals, usually at chilled or ambient temperature, through a packed food so that pressure is uniform regardless of piece size. Vegetative cells often die; bacterial spores and several enzymes often do not. This narrative review organises the literature around three tensions rather than around a single log-reduction number: (i) how matrix, solute, recovery medium, and injury change the kill that a given pressure appears to deliver; (ii) whether HPP meets legal or 5-log pasteurisation criteria in milk and juices; and (iii) when quality (texture, polyphenol oxidase, bioactive proteins, allergenicity) moves with, or against, plate counts. Primary evidence is laboratory challenges, storage trials, one scientific opinion, and systematic or scoping reviews; almost none of it can be pooled. Those patterns do not imply that HPP is a sterilant, that it is equivalent to high-temperature short-time milk pasteurisation, or that every nonthermal field (ultrasound, plasma, irradiation) can be substituted for pressure. The next measurements that would change practice are paired pathogen and protein assays in milk, juice validations that name</w:t>
+        <w:t xml:space="preserve">Heat remains the default way to make food microbiologically safe because it can deliver large, predictable reductions of vegetative pathogens. The same heat also drives flavour loss, enzyme damage, and protein denaturation that consumers and some product classes cannot tolerate. High-pressure processing (HPP) applies hundreds of megapascals, usually at chilled or ambient temperature, through a packed food so that pressure is uniform regardless of piece size. Vegetative cells often die; bacterial spores and several enzymes often do not. This narrative review follows those tensions as one argument rather than as a single log-reduction number. Matrix, solute, recovery medium, and injury change the kill that a given pressure appears to deliver; the same cycle may still fail legal or 5-log pasteurisation criteria in milk and juices; and quality (texture, polyphenol oxidase, bioactive proteins, allergenicity) often moves against plate counts rather than with them. Primary evidence is laboratory challenges, storage trials, one scientific opinion, and systematic or scoping reviews; almost none of it can be pooled. Those patterns do not imply that HPP is a sterilant, that it is equivalent to high-temperature short-time milk pasteurisation, or that every nonthermal field (ultrasound, plasma, irradiation) can be substituted for pressure. The next measurements that would change practice are paired pathogen and protein assays in milk, juice validations that name</w:t>
       </w:r>
       <w:r>
         <w:t xml:space="preserve"> </w:t>
@@ -158,7 +158,7 @@
         <w:jc w:val="both"/>
       </w:pPr>
       <w:r>
-        <w:t xml:space="preserve">Two regulatory questions sit under the commercial success. First, is HPP milk equivalent to legal thermal pasteurisation? The European Food Safety Authority (EFSA) biological hazards panel modelled industrial 600 MPa for 6 min and concluded that, for the milk pathogens that could be compared, HPP delivered fewer log10 reductions than the legal heat treatments [2]. Alkaline phosphatase, the heat-pasteurisation indicator, is relatively pressure-resistant and would at best flag overprocessing [2]. Second, do juice HPP cycles that report a 5-log drop in aerobic plate count (APC) satisfy a named-pathogen HACCP plan? Several included juice papers never inoculated</w:t>
+        <w:t xml:space="preserve">Two regulatory questions sit under the commercial success. One is whether HPP milk is equivalent to legal thermal pasteurisation. The European Food Safety Authority (EFSA) biological hazards panel modelled industrial 600 MPa for 6 min and concluded that, for the milk pathogens that could be compared, HPP delivered fewer log10 reductions than the legal heat treatments [2]. Alkaline phosphatase, the heat-pasteurisation indicator, is relatively pressure-resistant and would at best flag overprocessing [2]. The other is whether juice HPP cycles that report a 5-log drop in aerobic plate count (APC) satisfy a named-pathogen HACCP plan. Several included juice papers never inoculated</w:t>
       </w:r>
       <w:r>
         <w:t xml:space="preserve"> </w:t>
@@ -3491,7 +3491,7 @@
         <w:jc w:val="both"/>
       </w:pPr>
       <w:r>
-        <w:t xml:space="preserve">What should be measured next follows from those holes rather than from a generic call for more work. First, a bovine-milk HPP versus high-temperature short-time experiment that reports the same pathogen cocktail (including</w:t>
+        <w:t xml:space="preserve">What should be measured next follows from those holes rather than from a generic call for more work. A bovine-milk HPP versus high-temperature short-time experiment that reports the same pathogen cocktail (including</w:t>
       </w:r>
       <w:r>
         <w:t xml:space="preserve"> </w:t>
@@ -3504,7 +3504,7 @@
         <w:t xml:space="preserve">S. aureus</w:t>
       </w:r>
       <w:r>
-        <w:t xml:space="preserve">) and the same bioactive proteins on each batch, with recovery media stated. Second, juice HPP validations that inoculate</w:t>
+        <w:t xml:space="preserve">) and the same bioactive proteins on each batch, with recovery media stated, would close the dual-specification gap. Juice HPP validations still need inoculated</w:t>
       </w:r>
       <w:r>
         <w:t xml:space="preserve"> </w:t>
@@ -3536,7 +3536,7 @@
         <w:t xml:space="preserve"> </w:t>
       </w:r>
       <w:r>
-        <w:t xml:space="preserve">and use the FDA 5-log criterion, not APC. Third, spore kinetics with measured temperature under pressure, °Brix, and a Weibull or biphasic fit, instead of a single ambient-600 MPa log. Fourth, RTE meat challenges that use strain cocktails, report standard deviations, and include lactate or fat as designed factors [5,20]. Fifth, scale-down versus scale-up pairs for plasma and ultrasound, given the lettuce pilot drop [18] and the sonicator’s missing heat control [3].</w:t>
+        <w:t xml:space="preserve">against the FDA 5-log criterion rather than APC. Spore work needs measured temperature under pressure, °Brix, and a Weibull or biphasic fit instead of a single ambient-600 MPa log. RTE meat challenges that use strain cocktails, report standard deviations, and treat lactate or fat as designed factors would make the 1–7 log window interpretable [5,20]. Plasma and ultrasound still need paired bench-versus-plant measurements, given the lettuce pilot drop [18] and the sonicator’s missing heat control [3].</w:t>
       </w:r>
     </w:p>
     <w:bookmarkEnd w:id="32"/>
@@ -3565,7 +3565,7 @@
         <w:jc w:val="both"/>
       </w:pPr>
       <w:r>
-        <w:t xml:space="preserve">First, do not treat 400–600 MPa as equivalent to legal milk pasteurisation; the included opinion says the industrial cycle underperforms heat on comparable log10 reductions [2]. Second, do not treat a 5-log APC in grape purée as a juice pathogen validation [9]. Third, expect tails for spores and plan either HPTP or a cold chain, with water activity as a designed factor [1,4,28]. Fourth, measure enzymes, bioactive proteins, and texture on the same samples as microbes, because they do not covary [6,7,8]. Fifth, report recovery methods and strain sets, because they can move a log reduction as much as 100 MPa can [5,11]. Finally, keep ultrasound, plasma, and irradiation in separate sentences until their included primary data are as dense as the HPP rows in Tables 1–3.</w:t>
+        <w:t xml:space="preserve">Legal milk pasteurisation is not interchangeable with 400–600 MPa on the included opinion: the industrial cycle underperforms heat on comparable log10 reductions [2]. A 5-log APC in grape purée is likewise not a juice pathogen validation [9]. Spore tails remain, so either HPTP or a cold chain has to be planned, with water activity as a designed factor [1,4,28]. Enzymes, bioactive proteins, and texture have to be measured on the same samples as microbes, because they do not covary [6,7,8]. Recovery methods and strain sets can move a log reduction as much as 100 MPa can, and they should be reported with the set-point [5,11]. Ultrasound, plasma, and irradiation stay in separate sentences until their included primary data are as dense as the HPP rows in Tables 1–3.</w:t>
       </w:r>
     </w:p>
     <w:bookmarkEnd w:id="33"/>

</xml_diff>

<commit_message>
Encode published title and manuscript-spine craft from the OA sample.
Teach colon titles, keywords, optional takeaway bullets, and argument
headings; fail flourish titles and process-talk sections.

Co-authored-by: hvianagil-alt <hvianagil-alt@users.noreply.github.com>
</commit_message>
<xml_diff>
--- a/review/runs/2026-09-20-scopus-hpp/export/article.docx
+++ b/review/runs/2026-09-20-scopus-hpp/export/article.docx
@@ -2,7 +2,7 @@
 <file path=word/document.xml><?xml version="1.0" encoding="utf-8"?>
 <w:document xmlns:w="http://schemas.openxmlformats.org/wordprocessingml/2006/main" xmlns:m="http://schemas.openxmlformats.org/officeDocument/2006/math" xmlns:r="http://schemas.openxmlformats.org/officeDocument/2006/relationships" xmlns:o="urn:schemas-microsoft-com:office:office" xmlns:v="urn:schemas-microsoft-com:vml" xmlns:w10="urn:schemas-microsoft-com:office:word" xmlns:a="http://schemas.openxmlformats.org/drawingml/2006/main" xmlns:pic="http://schemas.openxmlformats.org/drawingml/2006/picture" xmlns:wp="http://schemas.openxmlformats.org/drawingml/2006/wordprocessingDrawing">
   <w:body>
-    <w:bookmarkStart w:id="35" w:name="X591a03f6653268eedbb0175e1f8b19edd8c8abb"/>
+    <w:bookmarkStart w:id="36" w:name="X591a03f6653268eedbb0175e1f8b19edd8c8abb"/>
     <w:p>
       <w:pPr>
         <w:pStyle w:val="Heading1"/>
@@ -84,7 +84,83 @@
       </w:r>
     </w:p>
     <w:bookmarkEnd w:id="21"/>
-    <w:bookmarkStart w:id="22" w:name="introduction"/>
+    <w:bookmarkStart w:id="22" w:name="key-summary-points"/>
+    <w:p>
+      <w:pPr>
+        <w:pStyle w:val="Heading2"/>
+        <w:jc w:val="left"/>
+      </w:pPr>
+      <w:r>
+        <w:t xml:space="preserve">Key Summary Points</w:t>
+      </w:r>
+    </w:p>
+    <w:p>
+      <w:pPr>
+        <w:numPr>
+          <w:ilvl w:val="0"/>
+          <w:numId w:val="1001"/>
+        </w:numPr>
+        <w:pStyle w:val="Compact"/>
+        <w:jc w:val="both"/>
+      </w:pPr>
+      <w:r>
+        <w:t xml:space="preserve">Vegetative kill under high pressure is real, but the log reduction is not a constant read from the set-point; matrix, solute, recovery medium, and injury move it (laboratory challenges and one scoping review of ready-to-eat meats).</w:t>
+      </w:r>
+    </w:p>
+    <w:p>
+      <w:pPr>
+        <w:numPr>
+          <w:ilvl w:val="0"/>
+          <w:numId w:val="1001"/>
+        </w:numPr>
+        <w:pStyle w:val="Compact"/>
+        <w:jc w:val="both"/>
+      </w:pPr>
+      <w:r>
+        <w:t xml:space="preserve">Legal milk pasteurisation is not interchangeable with 400–600 MPa on the included scientific opinion.</w:t>
+      </w:r>
+    </w:p>
+    <w:p>
+      <w:pPr>
+        <w:numPr>
+          <w:ilvl w:val="0"/>
+          <w:numId w:val="1001"/>
+        </w:numPr>
+        <w:pStyle w:val="Compact"/>
+        <w:jc w:val="both"/>
+      </w:pPr>
+      <w:r>
+        <w:t xml:space="preserve">A 5-log drop in aerobic plate count is not a named-pathogen juice validation.</w:t>
+      </w:r>
+    </w:p>
+    <w:p>
+      <w:pPr>
+        <w:numPr>
+          <w:ilvl w:val="0"/>
+          <w:numId w:val="1001"/>
+        </w:numPr>
+        <w:pStyle w:val="Compact"/>
+        <w:jc w:val="both"/>
+      </w:pPr>
+      <w:r>
+        <w:t xml:space="preserve">Enzymes, bioactive proteins, and texture often move against plate counts on the same cycle, so they have to be named as endpoints.</w:t>
+      </w:r>
+    </w:p>
+    <w:p>
+      <w:pPr>
+        <w:numPr>
+          <w:ilvl w:val="0"/>
+          <w:numId w:val="1001"/>
+        </w:numPr>
+        <w:pStyle w:val="Compact"/>
+        <w:jc w:val="both"/>
+      </w:pPr>
+      <w:r>
+        <w:t xml:space="preserve">Spore tails remain at commercial pressures; either heat under pressure or a planned cold chain still has to carry that control.</w:t>
+      </w:r>
+    </w:p>
+    <w:bookmarkEnd w:id="22"/>
+    <w:bookmarkStart w:id="23" w:name="introduction"/>
     <w:p>
       <w:pPr>
         <w:pStyle w:val="Heading2"/>
@@ -229,8 +305,8 @@
         <w:t xml:space="preserve">The aim of this review is to compare included studies on HPP and related nonthermal processes as microbial and quality technologies, and the central argument of this review is that pressure is a reliable vegetative hurdle whose log reduction cannot be read from the set-point alone, while quality preservation is an endpoint that must be named (enzyme, protein, texture, allergen) rather than assumed.</w:t>
       </w:r>
     </w:p>
-    <w:bookmarkEnd w:id="22"/>
-    <w:bookmarkStart w:id="26" w:name="methods"/>
+    <w:bookmarkEnd w:id="23"/>
+    <w:bookmarkStart w:id="27" w:name="methods"/>
     <w:p>
       <w:pPr>
         <w:pStyle w:val="Heading2"/>
@@ -240,7 +316,7 @@
         <w:t xml:space="preserve">2. Methods</w:t>
       </w:r>
     </w:p>
-    <w:bookmarkStart w:id="23" w:name="search-and-sources"/>
+    <w:bookmarkStart w:id="24" w:name="search-and-sources"/>
     <w:p>
       <w:pPr>
         <w:pStyle w:val="Heading3"/>
@@ -259,8 +335,8 @@
         <w:t xml:space="preserve">Records came from a Scopus BibTeX export dated 20 September 2026 (359 bibliographic records, 2021–2026). Public full texts were taken only when a PDF body or Europe PMC JATS XML could be opened without a subscription. One additional plant-food HPP review was retrieved after an OpenAlex search aimed at spore kinetics [4].</w:t>
       </w:r>
     </w:p>
-    <w:bookmarkEnd w:id="23"/>
-    <w:bookmarkStart w:id="24" w:name="eligibility"/>
+    <w:bookmarkEnd w:id="24"/>
+    <w:bookmarkStart w:id="25" w:name="eligibility"/>
     <w:p>
       <w:pPr>
         <w:pStyle w:val="Heading3"/>
@@ -279,8 +355,8 @@
         <w:t xml:space="preserve">Peer-reviewed journal articles and reviews whose titles named HPP/HHP/HPH, ultrasound, pulsed electric fields, plasma, irradiation, or nonthermal processing in a human-food, juice, meat, dairy, produce, or inactivation context. Books, chapters, conference papers, retracted items, and pet-food titles were excluded. Full-text inclusion required a readable public file of the named paper.</w:t>
       </w:r>
     </w:p>
-    <w:bookmarkEnd w:id="24"/>
-    <w:bookmarkStart w:id="25" w:name="study-selection"/>
+    <w:bookmarkEnd w:id="25"/>
+    <w:bookmarkStart w:id="26" w:name="study-selection"/>
     <w:p>
       <w:pPr>
         <w:pStyle w:val="Heading3"/>
@@ -299,9 +375,9 @@
         <w:t xml:space="preserve">After title screening, 182 records were sought. Forty-nine public files were obtained; six were excluded (wrong document, unreadable stub, bibliometric-only, off-topic production or process-control reviews). Forty-three export full texts plus one gap-fill review were included (n = 44). Designs range from laboratory inoculations to an EFSA opinion; they are not a single evidence grade. Screening counts live beside the manuscript, not in the Discussion. Extraction used claim-ready facts from each full text (pressure, time, organism, matrix, endpoint, and what the design cannot show). Incommensurable rows were kept in one literature table and then curated into Tables 1–3 of this article rather than averaged. Primary endpoints in those tables are named explicitly in the thematic sections that follow.</w:t>
       </w:r>
     </w:p>
-    <w:bookmarkEnd w:id="25"/>
     <w:bookmarkEnd w:id="26"/>
-    <w:bookmarkStart w:id="27" w:name="Xb1eda5bd1e6ac6f939684c729a37a578ed91ed4"/>
+    <w:bookmarkEnd w:id="27"/>
+    <w:bookmarkStart w:id="28" w:name="Xb1eda5bd1e6ac6f939684c729a37a578ed91ed4"/>
     <w:p>
       <w:pPr>
         <w:pStyle w:val="Heading2"/>
@@ -1259,8 +1335,8 @@
         <w:t xml:space="preserve">Primary endpoints in Table 1 are summarised from the notes; recovery methods differ, so rows are not interchangeable [5,11].</w:t>
       </w:r>
     </w:p>
-    <w:bookmarkEnd w:id="27"/>
-    <w:bookmarkStart w:id="28" w:name="X09e85f5f8097e57f0ab71c74158db7cf98c1fcb"/>
+    <w:bookmarkEnd w:id="28"/>
+    <w:bookmarkStart w:id="29" w:name="X09e85f5f8097e57f0ab71c74158db7cf98c1fcb"/>
     <w:p>
       <w:pPr>
         <w:pStyle w:val="Heading2"/>
@@ -2208,8 +2284,8 @@
         </w:tc>
       </w:tr>
     </w:tbl>
-    <w:bookmarkEnd w:id="28"/>
-    <w:bookmarkStart w:id="29" w:name="X1a595b75cf3b7d258bcde921bd6ea64d0ece587"/>
+    <w:bookmarkEnd w:id="29"/>
+    <w:bookmarkStart w:id="30" w:name="X1a595b75cf3b7d258bcde921bd6ea64d0ece587"/>
     <w:p>
       <w:pPr>
         <w:pStyle w:val="Heading2"/>
@@ -2920,8 +2996,8 @@
         </w:tc>
       </w:tr>
     </w:tbl>
-    <w:bookmarkEnd w:id="29"/>
-    <w:bookmarkStart w:id="30" w:name="X133eb1bf8b84f887a8f1360a206e858b48f1464"/>
+    <w:bookmarkEnd w:id="30"/>
+    <w:bookmarkStart w:id="31" w:name="X133eb1bf8b84f887a8f1360a206e858b48f1464"/>
     <w:p>
       <w:pPr>
         <w:pStyle w:val="Heading2"/>
@@ -3203,8 +3279,8 @@
         <w:t xml:space="preserve">Taken together, HPP quality is sometimes better than heat (grape APC storage [9], donkey-milk enzymes at 400 MPa [7], avocado colour in commercial examples reviewed for plant foods [4]) and sometimes worse or simply different (kelp hardness [8], grape PPO [6], cream at 450 MPa [13]). Plate counts do not arbitrate those sentences.</w:t>
       </w:r>
     </w:p>
-    <w:bookmarkEnd w:id="30"/>
-    <w:bookmarkStart w:id="31" w:name="Xb73d360ba1df154002128c4af4d324a7ae4301c"/>
+    <w:bookmarkEnd w:id="31"/>
+    <w:bookmarkStart w:id="32" w:name="Xb73d360ba1df154002128c4af4d324a7ae4301c"/>
     <w:p>
       <w:pPr>
         <w:pStyle w:val="Heading2"/>
@@ -3271,8 +3347,8 @@
         <w:t xml:space="preserve">The physical picture is still pressure for HPP, cavitation for the sonicator, reactive species for plasma, and photons or electrons for irradiation. A combined factory line can use more than one, but a review that averages their log reductions would hide the scale-up failures already visible for plasma water and the 5-log miss for reduced-temperature sonication [3,18].</w:t>
       </w:r>
     </w:p>
-    <w:bookmarkEnd w:id="31"/>
-    <w:bookmarkStart w:id="32" w:name="discussion"/>
+    <w:bookmarkEnd w:id="32"/>
+    <w:bookmarkStart w:id="33" w:name="discussion"/>
     <w:p>
       <w:pPr>
         <w:pStyle w:val="Heading2"/>
@@ -3539,8 +3615,8 @@
         <w:t xml:space="preserve">against the FDA 5-log criterion rather than APC. Spore work needs measured temperature under pressure, °Brix, and a Weibull or biphasic fit instead of a single ambient-600 MPa log. RTE meat challenges that use strain cocktails, report standard deviations, and treat lactate or fat as designed factors would make the 1–7 log window interpretable [5,20]. Plasma and ultrasound still need paired bench-versus-plant measurements, given the lettuce pilot drop [18] and the sonicator’s missing heat control [3].</w:t>
       </w:r>
     </w:p>
-    <w:bookmarkEnd w:id="32"/>
-    <w:bookmarkStart w:id="33" w:name="conclusions"/>
+    <w:bookmarkEnd w:id="33"/>
+    <w:bookmarkStart w:id="34" w:name="conclusions"/>
     <w:p>
       <w:pPr>
         <w:pStyle w:val="Heading2"/>
@@ -3568,8 +3644,8 @@
         <w:t xml:space="preserve">Legal milk pasteurisation is not interchangeable with 400–600 MPa on the included opinion: the industrial cycle underperforms heat on comparable log10 reductions [2]. A 5-log APC in grape purée is likewise not a juice pathogen validation [9]. Spore tails remain, so either HPTP or a cold chain has to be planned, with water activity as a designed factor [1,4,28]. Enzymes, bioactive proteins, and texture have to be measured on the same samples as microbes, because they do not covary [6,7,8]. Recovery methods and strain sets can move a log reduction as much as 100 MPa can, and they should be reported with the set-point [5,11]. Ultrasound, plasma, and irradiation stay in separate sentences until their included primary data are as dense as the HPP rows in Tables 1–3.</w:t>
       </w:r>
     </w:p>
-    <w:bookmarkEnd w:id="33"/>
-    <w:bookmarkStart w:id="34" w:name="references"/>
+    <w:bookmarkEnd w:id="34"/>
+    <w:bookmarkStart w:id="35" w:name="references"/>
     <w:p>
       <w:pPr>
         <w:pStyle w:val="Heading2"/>
@@ -3975,8 +4051,8 @@
         <w:t xml:space="preserve">[44] Jeevitha GC, et al. Non-thermal processing as a preservation tool for health-promoting beverages. 2023.</w:t>
       </w:r>
     </w:p>
-    <w:bookmarkEnd w:id="34"/>
     <w:bookmarkEnd w:id="35"/>
+    <w:bookmarkEnd w:id="36"/>
     <w:sectPr/>
   </w:body>
 </w:document>
@@ -4083,8 +4159,87 @@
       </w:pPr>
     </w:lvl>
   </w:abstractNum>
+  <w:abstractNum w:abstractNumId="991">
+    <w:nsid w:val="A991"/>
+    <w:multiLevelType w:val="multilevel"/>
+    <w:lvl w:ilvl="0">
+      <w:numFmt w:val="bullet"/>
+      <w:lvlText w:val="•"/>
+      <w:lvlJc w:val="left"/>
+      <w:pPr>
+        <w:ind w:left="720" w:hanging="480"/>
+      </w:pPr>
+    </w:lvl>
+    <w:lvl w:ilvl="1">
+      <w:numFmt w:val="bullet"/>
+      <w:lvlText w:val="–"/>
+      <w:lvlJc w:val="left"/>
+      <w:pPr>
+        <w:ind w:left="1440" w:hanging="480"/>
+      </w:pPr>
+    </w:lvl>
+    <w:lvl w:ilvl="2">
+      <w:numFmt w:val="bullet"/>
+      <w:lvlText w:val="•"/>
+      <w:lvlJc w:val="left"/>
+      <w:pPr>
+        <w:ind w:left="2160" w:hanging="480"/>
+      </w:pPr>
+    </w:lvl>
+    <w:lvl w:ilvl="3">
+      <w:numFmt w:val="bullet"/>
+      <w:lvlText w:val="–"/>
+      <w:lvlJc w:val="left"/>
+      <w:pPr>
+        <w:ind w:left="2880" w:hanging="480"/>
+      </w:pPr>
+    </w:lvl>
+    <w:lvl w:ilvl="4">
+      <w:numFmt w:val="bullet"/>
+      <w:lvlText w:val="•"/>
+      <w:lvlJc w:val="left"/>
+      <w:pPr>
+        <w:ind w:left="3600" w:hanging="480"/>
+      </w:pPr>
+    </w:lvl>
+    <w:lvl w:ilvl="5">
+      <w:numFmt w:val="bullet"/>
+      <w:lvlText w:val="–"/>
+      <w:lvlJc w:val="left"/>
+      <w:pPr>
+        <w:ind w:left="4320" w:hanging="480"/>
+      </w:pPr>
+    </w:lvl>
+    <w:lvl w:ilvl="6">
+      <w:numFmt w:val="bullet"/>
+      <w:lvlText w:val="•"/>
+      <w:lvlJc w:val="left"/>
+      <w:pPr>
+        <w:ind w:left="5040" w:hanging="480"/>
+      </w:pPr>
+    </w:lvl>
+    <w:lvl w:ilvl="7">
+      <w:numFmt w:val="bullet"/>
+      <w:lvlText w:val="–"/>
+      <w:lvlJc w:val="left"/>
+      <w:pPr>
+        <w:ind w:left="5760" w:hanging="480"/>
+      </w:pPr>
+    </w:lvl>
+    <w:lvl w:ilvl="8">
+      <w:numFmt w:val="bullet"/>
+      <w:lvlText w:val="•"/>
+      <w:lvlJc w:val="left"/>
+      <w:pPr>
+        <w:ind w:left="6480" w:hanging="480"/>
+      </w:pPr>
+    </w:lvl>
+  </w:abstractNum>
   <w:num w:numId="1000">
     <w:abstractNumId w:val="990"/>
+  </w:num>
+  <w:num w:numId="1001">
+    <w:abstractNumId w:val="991"/>
   </w:num>
 </w:numbering>
 </file>

</xml_diff>

<commit_message>
Confirm review-prose craft on 50 more OA papers and nest the HPP headings.
Batch 2 opened 47 public full texts (three DOIs had no public PDF). The HPP
manuscript now uses nested topic headings and a continuous Discussion.

Co-authored-by: hvianagil-alt <hvianagil-alt@users.noreply.github.com>
</commit_message>
<xml_diff>
--- a/review/runs/2026-09-20-scopus-hpp/export/article.docx
+++ b/review/runs/2026-09-20-scopus-hpp/export/article.docx
@@ -2,7 +2,7 @@
 <file path=word/document.xml><?xml version="1.0" encoding="utf-8"?>
 <w:document xmlns:w="http://schemas.openxmlformats.org/wordprocessingml/2006/main" xmlns:m="http://schemas.openxmlformats.org/officeDocument/2006/math" xmlns:r="http://schemas.openxmlformats.org/officeDocument/2006/relationships" xmlns:o="urn:schemas-microsoft-com:office:office" xmlns:v="urn:schemas-microsoft-com:vml" xmlns:w10="urn:schemas-microsoft-com:office:word" xmlns:a="http://schemas.openxmlformats.org/drawingml/2006/main" xmlns:pic="http://schemas.openxmlformats.org/drawingml/2006/picture" xmlns:wp="http://schemas.openxmlformats.org/drawingml/2006/wordprocessingDrawing">
   <w:body>
-    <w:bookmarkStart w:id="36" w:name="X591a03f6653268eedbb0175e1f8b19edd8c8abb"/>
+    <w:bookmarkStart w:id="47" w:name="X591a03f6653268eedbb0175e1f8b19edd8c8abb"/>
     <w:p>
       <w:pPr>
         <w:pStyle w:val="Heading1"/>
@@ -377,7 +377,7 @@
     </w:p>
     <w:bookmarkEnd w:id="26"/>
     <w:bookmarkEnd w:id="27"/>
-    <w:bookmarkStart w:id="28" w:name="Xb1eda5bd1e6ac6f939684c729a37a578ed91ed4"/>
+    <w:bookmarkStart w:id="31" w:name="Xb1eda5bd1e6ac6f939684c729a37a578ed91ed4"/>
     <w:p>
       <w:pPr>
         <w:pStyle w:val="Heading2"/>
@@ -393,7 +393,26 @@
         <w:jc w:val="both"/>
       </w:pPr>
       <w:r>
-        <w:t xml:space="preserve">Vegetative lethality under HPP is real and often large, but it is a family of outcomes, not one. In phosphate buffer,</w:t>
+        <w:t xml:space="preserve">Vegetative lethality under HPP is real and often large, but it is a family of outcomes, not one.</w:t>
+      </w:r>
+    </w:p>
+    <w:bookmarkStart w:id="28" w:name="X55d1ae8e347784e247ae3eeb43027d5b2657416"/>
+    <w:p>
+      <w:pPr>
+        <w:pStyle w:val="Heading3"/>
+        <w:jc w:val="left"/>
+      </w:pPr>
+      <w:r>
+        <w:t xml:space="preserve">3.1 Ice changes the kill that a mild cycle can deliver</w:t>
+      </w:r>
+    </w:p>
+    <w:p>
+      <w:pPr>
+        <w:pStyle w:val="FirstParagraph"/>
+        <w:jc w:val="both"/>
+      </w:pPr>
+      <w:r>
+        <w:t xml:space="preserve">In phosphate buffer,</w:t>
       </w:r>
       <w:r>
         <w:t xml:space="preserve"> </w:t>
@@ -424,9 +443,20 @@
         <w:t xml:space="preserve">”</w:t>
       </w:r>
     </w:p>
-    <w:p>
-      <w:pPr>
-        <w:pStyle w:val="BodyText"/>
+    <w:bookmarkEnd w:id="28"/>
+    <w:bookmarkStart w:id="29" w:name="X7ead7e81d2918d9145f02559137bda9589d211a"/>
+    <w:p>
+      <w:pPr>
+        <w:pStyle w:val="Heading3"/>
+        <w:jc w:val="left"/>
+      </w:pPr>
+      <w:r>
+        <w:t xml:space="preserve">3.2 Strain, solute, and the ready-to-eat window</w:t>
+      </w:r>
+    </w:p>
+    <w:p>
+      <w:pPr>
+        <w:pStyle w:val="FirstParagraph"/>
         <w:jc w:val="both"/>
       </w:pPr>
       <w:r>
@@ -443,9 +473,20 @@
         <w:t xml:space="preserve">illustrates strain and solute dependence in foods that already contain Listeria controls. In cooked ham, lactate reduced HPP inactivation in a dose-dependent way: at 10 min, 1.4% lactate cut kill by 0.5–1.46 log versus the control depending on strain, and 2.8% lactate widened that gap [20]. That is piezo-protection: the same pressure, a more barotolerant phenotype because of an ingredient that is there for flavour and Listeria growth control. On RTE meats as a class, a scoping review of 74 studies found HPP in 29 of them. Below 400 MPa, inactivation was typically below 1 log even with long holds; at 500–600 MPa, reported reductions ran from 1 to 7 log CFU/g within about 5 min [5]. Thirty-one of 74 papers omitted standard deviations; 27 used a single strain; meta-analysis was judged impossible [5]. Table 1 therefore lists primary challenges as rows, not as a pooled mean.</w:t>
       </w:r>
     </w:p>
-    <w:p>
-      <w:pPr>
-        <w:pStyle w:val="BodyText"/>
+    <w:bookmarkEnd w:id="29"/>
+    <w:bookmarkStart w:id="30" w:name="enumeration-injury-and-repair"/>
+    <w:p>
+      <w:pPr>
+        <w:pStyle w:val="Heading3"/>
+        <w:jc w:val="left"/>
+      </w:pPr>
+      <w:r>
+        <w:t xml:space="preserve">3.3 Enumeration, injury, and repair</w:t>
+      </w:r>
+    </w:p>
+    <w:p>
+      <w:pPr>
+        <w:pStyle w:val="FirstParagraph"/>
         <w:jc w:val="both"/>
       </w:pPr>
       <w:r>
@@ -1335,8 +1376,9 @@
         <w:t xml:space="preserve">Primary endpoints in Table 1 are summarised from the notes; recovery methods differ, so rows are not interchangeable [5,11].</w:t>
       </w:r>
     </w:p>
-    <w:bookmarkEnd w:id="28"/>
-    <w:bookmarkStart w:id="29" w:name="X09e85f5f8097e57f0ab71c74158db7cf98c1fcb"/>
+    <w:bookmarkEnd w:id="30"/>
+    <w:bookmarkEnd w:id="31"/>
+    <w:bookmarkStart w:id="34" w:name="X09e85f5f8097e57f0ab71c74158db7cf98c1fcb"/>
     <w:p>
       <w:pPr>
         <w:pStyle w:val="Heading2"/>
@@ -1352,7 +1394,17 @@
         <w:jc w:val="both"/>
       </w:pPr>
       <w:r>
-        <w:t xml:space="preserve">A pasteurisation claim is a comparison to a legal or HACCP number, not a comparison to an untreated control. For milk, EFSA treated industrial 600 MPa for 6 min as the stringent HPP case and still found fewer log10 reductions than legal heat for the pathogens that could be modelled, so HPP milk was not equivalent to pasteurisation on that metric [2].</w:t>
+        <w:t xml:space="preserve">A pasteurisation claim is a comparison to a legal or HACCP number, not a comparison to an untreated control.</w:t>
+      </w:r>
+    </w:p>
+    <w:bookmarkStart w:id="32" w:name="Xd3118e4312577d871cf77f88132fdc9c7be923b"/>
+    <w:p>
+      <w:pPr>
+        <w:pStyle w:val="Heading3"/>
+        <w:jc w:val="left"/>
+      </w:pPr>
+      <w:r>
+        <w:t xml:space="preserve">4.1 Milk and the legal heat bar For milk, EFSA treated industrial 600 MPa for 6 min as the stringent HPP case and still found fewer log10 reductions than legal heat for the pathogens that could be modelled, so HPP milk was not equivalent to pasteurisation on that metric [2].</w:t>
       </w:r>
       <w:r>
         <w:t xml:space="preserve"> </w:t>
@@ -1389,7 +1441,7 @@
     </w:p>
     <w:p>
       <w:pPr>
-        <w:pStyle w:val="BodyText"/>
+        <w:pStyle w:val="FirstParagraph"/>
         <w:jc w:val="both"/>
       </w:pPr>
       <w:r>
@@ -1537,9 +1589,20 @@
         <w:t xml:space="preserve">In dairy cream, 450 MPa for 5 min left total aerobic psychrotrophs similar to raw immediately and spoilage (&gt;6 log) from day 18; 600 MPa slowed recovery but heat still produced a different trajectory [13]. In donkey milk, 200, 400, and 500 MPa cut total aerobic bacteria by 0.85, 1.58, and 4.04 log CFU ml−1, while 75 °C for 2 min cut 1.34 log with much larger lysozyme loss in the results section than in the abstract [7]. Preferring the results section, 400 MPa is closer to a quality-preserving pasteurisation analogue than 500 MPa is, and neither is a pathogen challenge [7].</w:t>
       </w:r>
     </w:p>
-    <w:p>
-      <w:pPr>
-        <w:pStyle w:val="BodyText"/>
+    <w:bookmarkEnd w:id="32"/>
+    <w:bookmarkStart w:id="33" w:name="X5cc7c0825095540f7746574ad1bf302ef6067ea"/>
+    <w:p>
+      <w:pPr>
+        <w:pStyle w:val="Heading3"/>
+        <w:jc w:val="left"/>
+      </w:pPr>
+      <w:r>
+        <w:t xml:space="preserve">4.2 Juice, aerobic plate count, and named pathogens</w:t>
+      </w:r>
+    </w:p>
+    <w:p>
+      <w:pPr>
+        <w:pStyle w:val="FirstParagraph"/>
         <w:jc w:val="both"/>
       </w:pPr>
       <w:r>
@@ -2284,8 +2347,9 @@
         </w:tc>
       </w:tr>
     </w:tbl>
-    <w:bookmarkEnd w:id="29"/>
-    <w:bookmarkStart w:id="30" w:name="X1a595b75cf3b7d258bcde921bd6ea64d0ece587"/>
+    <w:bookmarkEnd w:id="33"/>
+    <w:bookmarkEnd w:id="34"/>
+    <w:bookmarkStart w:id="37" w:name="X1a595b75cf3b7d258bcde921bd6ea64d0ece587"/>
     <w:p>
       <w:pPr>
         <w:pStyle w:val="Heading2"/>
@@ -2301,7 +2365,17 @@
         <w:jc w:val="both"/>
       </w:pPr>
       <w:r>
-        <w:t xml:space="preserve">Industrial HPP at ambient or chill temperature is a pasteurisation technology for vegetative cells. It is not a botulinum cook. Reviews of fruit and vegetable kinetics state that pressures below 600 MPa at room temperature struggle with bacterial spores, and that some</w:t>
+        <w:t xml:space="preserve">Industrial HPP at ambient or chill temperature is a pasteurisation technology for vegetative cells. It is not a botulinum cook.</w:t>
+      </w:r>
+    </w:p>
+    <w:bookmarkStart w:id="35" w:name="X95fe18cbc4cd58f30f8aa15dae63c071f1527cd"/>
+    <w:p>
+      <w:pPr>
+        <w:pStyle w:val="Heading3"/>
+        <w:jc w:val="left"/>
+      </w:pPr>
+      <w:r>
+        <w:t xml:space="preserve">5.1 Spores and heat under pressure Reviews of fruit and vegetable kinetics state that pressures below 600 MPa at room temperature struggle with bacterial spores, and that some</w:t>
       </w:r>
       <w:r>
         <w:t xml:space="preserve"> </w:t>
@@ -2322,7 +2396,7 @@
     </w:p>
     <w:p>
       <w:pPr>
-        <w:pStyle w:val="BodyText"/>
+        <w:pStyle w:val="FirstParagraph"/>
         <w:jc w:val="both"/>
       </w:pPr>
       <w:r>
@@ -2404,9 +2478,20 @@
         <w:t xml:space="preserve">look like heat, which already failed.</w:t>
       </w:r>
     </w:p>
-    <w:p>
-      <w:pPr>
-        <w:pStyle w:val="BodyText"/>
+    <w:bookmarkEnd w:id="35"/>
+    <w:bookmarkStart w:id="36" w:name="X41e3b16911a78bc15e9716720eca54206b3df2a"/>
+    <w:p>
+      <w:pPr>
+        <w:pStyle w:val="Heading3"/>
+        <w:jc w:val="left"/>
+      </w:pPr>
+      <w:r>
+        <w:t xml:space="preserve">5.2 Combined hurdles that are still vegetative</w:t>
+      </w:r>
+    </w:p>
+    <w:p>
+      <w:pPr>
+        <w:pStyle w:val="FirstParagraph"/>
         <w:jc w:val="both"/>
       </w:pPr>
       <w:r>
@@ -2996,8 +3081,9 @@
         </w:tc>
       </w:tr>
     </w:tbl>
-    <w:bookmarkEnd w:id="30"/>
-    <w:bookmarkStart w:id="31" w:name="X133eb1bf8b84f887a8f1360a206e858b48f1464"/>
+    <w:bookmarkEnd w:id="36"/>
+    <w:bookmarkEnd w:id="37"/>
+    <w:bookmarkStart w:id="41" w:name="X133eb1bf8b84f887a8f1360a206e858b48f1464"/>
     <w:p>
       <w:pPr>
         <w:pStyle w:val="Heading2"/>
@@ -3031,21 +3117,42 @@
         <w:t xml:space="preserve"> </w:t>
       </w:r>
       <w:r>
-        <w:t xml:space="preserve">the endpoint must be named. PPO and peroxidase in celery juice fell after HPP and stayed low while microbial counts held for 8 weeks [27]. In grape juice, the same class of enzyme barely moved under HPP while heat and ohmic heating removed more than 90% of PPO [6]. Cloud-stable orange juice historically uses 90–99 °C for 15–30 s to hit thermostable pectin methylesterase; some pressure studies inactivate the heat-labile PME fraction at ≥500 MPa, with large residual variation by cultivar [4]. Enzyme and microbe are different targets.</w:t>
-      </w:r>
-    </w:p>
-    <w:p>
-      <w:pPr>
-        <w:pStyle w:val="BodyText"/>
+        <w:t xml:space="preserve">the endpoint must be named.</w:t>
+      </w:r>
+    </w:p>
+    <w:bookmarkStart w:id="38" w:name="Xd05e11dca5029352cea6833b857b631b3ef27a6"/>
+    <w:p>
+      <w:pPr>
+        <w:pStyle w:val="Heading3"/>
+        <w:jc w:val="left"/>
+      </w:pPr>
+      <w:r>
+        <w:t xml:space="preserve">6.1 Enzymes and bioactive proteins PPO and peroxidase in celery juice fell after HPP and stayed low while microbial counts held for 8 weeks [27]. In grape juice, the same class of enzyme barely moved under HPP while heat and ohmic heating removed more than 90% of PPO [6]. Cloud-stable orange juice historically uses 90–99 °C for 15–30 s to hit thermostable pectin methylesterase; some pressure studies inactivate the heat-labile PME fraction at ≥500 MPa, with large residual variation by cultivar [4]. Enzyme and microbe are different targets.</w:t>
+      </w:r>
+    </w:p>
+    <w:p>
+      <w:pPr>
+        <w:pStyle w:val="FirstParagraph"/>
         <w:jc w:val="both"/>
       </w:pPr>
       <w:r>
         <w:t xml:space="preserve">Proteins unfold under pressure because non-covalent bonds yield. A protein-source review reports lower allergenicity and higher digestibility/bioactivity for cereal, legume, and nut proteins after HHP, higher surface hydrophobicity for some seed and vegetable proteins, and mixed foaming/gelling/antioxidant shifts in dairy [29]. That is a functional-food story, not a Listeria story, and it is qualitative across methods. Milk bioactive proteins are the regulatory twin of section 4: holding IgG and lactoferrin is the reason to prefer HPP over Holder or high-temperature short-time in some human-milk and bovine-milk arguments, but Sykora’s four overlap papers are not enough to set a dual specification [24]. Donkey milk shows the trade in one factorial: 500 MPa maximised aerobic kill and maximised lactoferrin activity loss [7].</w:t>
       </w:r>
     </w:p>
-    <w:p>
-      <w:pPr>
-        <w:pStyle w:val="BodyText"/>
+    <w:bookmarkEnd w:id="38"/>
+    <w:bookmarkStart w:id="39" w:name="texture-in-gels-and-formulated-products"/>
+    <w:p>
+      <w:pPr>
+        <w:pStyle w:val="Heading3"/>
+        <w:jc w:val="left"/>
+      </w:pPr>
+      <w:r>
+        <w:t xml:space="preserve">6.2 Texture in gels and formulated products</w:t>
+      </w:r>
+    </w:p>
+    <w:p>
+      <w:pPr>
+        <w:pStyle w:val="FirstParagraph"/>
         <w:jc w:val="both"/>
       </w:pPr>
       <w:r>
@@ -3068,9 +3175,20 @@
         <w:t xml:space="preserve">hardness fell from 312 g untreated to 38 g at 600 MPa (about 88% drop), with compression distance halved [8]. That kelp is not a ready-to-eat meat, but it is a reminder that 600 MPa is not gentle for every gel. Macroalgae-fortified sausages gained minerals and, immediately after HPP, total aerobic mesophiles &lt;1.0 log CFU/g in the fortified HPP batch [30]. Pumpkin pulp with a natural preservative plus HPP showed no microbial growth for 45 days, with better colour and firmness than a thermal comparator in the NBP formulations [31]. Minimally processed potatoes lost lightness and gained ΔE after HPP or HPP/ultrasound; Enterobacteriaceae became undetectable after HPP, while combined ultrasound did not stay different from untreated APC by day 14 [32]. Quality and kill can trade in either direction.</w:t>
       </w:r>
     </w:p>
-    <w:p>
-      <w:pPr>
-        <w:pStyle w:val="BodyText"/>
+    <w:bookmarkEnd w:id="39"/>
+    <w:bookmarkStart w:id="40" w:name="seafood-storage-ecology"/>
+    <w:p>
+      <w:pPr>
+        <w:pStyle w:val="Heading3"/>
+        <w:jc w:val="left"/>
+      </w:pPr>
+      <w:r>
+        <w:t xml:space="preserve">6.3 Seafood storage ecology</w:t>
+      </w:r>
+    </w:p>
+    <w:p>
+      <w:pPr>
+        <w:pStyle w:val="FirstParagraph"/>
         <w:jc w:val="both"/>
       </w:pPr>
       <w:r>
@@ -3279,8 +3397,9 @@
         <w:t xml:space="preserve">Taken together, HPP quality is sometimes better than heat (grape APC storage [9], donkey-milk enzymes at 400 MPa [7], avocado colour in commercial examples reviewed for plant foods [4]) and sometimes worse or simply different (kelp hardness [8], grape PPO [6], cream at 450 MPa [13]). Plate counts do not arbitrate those sentences.</w:t>
       </w:r>
     </w:p>
-    <w:bookmarkEnd w:id="31"/>
-    <w:bookmarkStart w:id="32" w:name="Xb73d360ba1df154002128c4af4d324a7ae4301c"/>
+    <w:bookmarkEnd w:id="40"/>
+    <w:bookmarkEnd w:id="41"/>
+    <w:bookmarkStart w:id="43" w:name="Xb73d360ba1df154002128c4af4d324a7ae4301c"/>
     <w:p>
       <w:pPr>
         <w:pStyle w:val="Heading2"/>
@@ -3296,7 +3415,26 @@
         <w:jc w:val="both"/>
       </w:pPr>
       <w:r>
-        <w:t xml:space="preserve">The included studies are HPP-heavy. Other fields appear as supporting technologies, not as a balanced map. Ultrasound in apple juice at reduced temperature, with dual-frequency excitation and a Venturi, reached a few log of spoilage flora and improved visual sedimentation, with a specific energy of 0.044 kWh/L at the best condition, and did not replace a 5-log pathogen pasteuriser [3]. Ultrasound reviews of mycotoxin and fungal decontamination quote high percentage degradations of aflatoxin B1 under long, high-intensity treatments that are not juice HACCP validations [40]. Sugarcane-juice comparisons of ultrasound, pulsed electric fields, HPP, and microfluidization versus heat treat HHP as the most used nonthermal option in that matrix [41].</w:t>
+        <w:t xml:space="preserve">The included studies are HPP-heavy. Other fields appear as supporting technologies, not as a balanced map.</w:t>
+      </w:r>
+    </w:p>
+    <w:bookmarkStart w:id="42" w:name="X3dea7b106e410944bea8c753daeb3fe28cc3ba4"/>
+    <w:p>
+      <w:pPr>
+        <w:pStyle w:val="Heading3"/>
+        <w:jc w:val="left"/>
+      </w:pPr>
+      <w:r>
+        <w:t xml:space="preserve">7.1 Ultrasound, plasma, and irradiation as different unit operations</w:t>
+      </w:r>
+    </w:p>
+    <w:p>
+      <w:pPr>
+        <w:pStyle w:val="FirstParagraph"/>
+        <w:jc w:val="both"/>
+      </w:pPr>
+      <w:r>
+        <w:t xml:space="preserve">Ultrasound in apple juice at reduced temperature, with dual-frequency excitation and a Venturi, reached a few log of spoilage flora and improved visual sedimentation, with a specific energy of 0.044 kWh/L at the best condition, and did not replace a 5-log pathogen pasteuriser [3]. Ultrasound reviews of mycotoxin and fungal decontamination quote high percentage degradations of aflatoxin B1 under long, high-intensity treatments that are not juice HACCP validations [40]. Sugarcane-juice comparisons of ultrasound, pulsed electric fields, HPP, and microfluidization versus heat treat HHP as the most used nonthermal option in that matrix [41].</w:t>
       </w:r>
     </w:p>
     <w:p>
@@ -3347,8 +3485,9 @@
         <w:t xml:space="preserve">The physical picture is still pressure for HPP, cavitation for the sonicator, reactive species for plasma, and photons or electrons for irradiation. A combined factory line can use more than one, but a review that averages their log reductions would hide the scale-up failures already visible for plasma water and the 5-log miss for reduced-temperature sonication [3,18].</w:t>
       </w:r>
     </w:p>
-    <w:bookmarkEnd w:id="32"/>
-    <w:bookmarkStart w:id="33" w:name="discussion"/>
+    <w:bookmarkEnd w:id="42"/>
+    <w:bookmarkEnd w:id="43"/>
+    <w:bookmarkStart w:id="44" w:name="discussion"/>
     <w:p>
       <w:pPr>
         <w:pStyle w:val="Heading2"/>
@@ -3364,7 +3503,7 @@
         <w:jc w:val="both"/>
       </w:pPr>
       <w:r>
-        <w:t xml:space="preserve">Two readings of HPP can both be true. The first is commercial: for refrigerated juices, guacamole-style herb pastes, and post-lethality RTE meats, 500–600 MPa for a few minutes is a vegetative pasteurisation that avoids a second cook, and industry already uses it [4,5]. The second is regulatory: for milk, the same window is not equivalent to legal pasteurisation on EFSA’s comparison, indicator enzymes do not transfer, and bioactive-protein preservation has not been co-validated with 5-log pathogen kill on enough shared batches [2,24]. Treating those readings as a single</w:t>
+        <w:t xml:space="preserve">Two readings of HPP can both be true. Commercially, 500–600 MPa for a few minutes is already a vegetative pasteurisation for refrigerated juices, guacamole-style herb pastes, and post-lethality RTE meats, and it avoids a second cook [4,5]. On the milk dossier the same window is not equivalent to legal pasteurisation on EFSA’s comparison: indicator enzymes do not transfer, and bioactive-protein preservation has not been co-validated with 5-log pathogen kill on enough shared batches [2,24]. Collapsing those readings into one</w:t>
       </w:r>
       <w:r>
         <w:t xml:space="preserve"> </w:t>
@@ -3615,8 +3754,8 @@
         <w:t xml:space="preserve">against the FDA 5-log criterion rather than APC. Spore work needs measured temperature under pressure, °Brix, and a Weibull or biphasic fit instead of a single ambient-600 MPa log. RTE meat challenges that use strain cocktails, report standard deviations, and treat lactate or fat as designed factors would make the 1–7 log window interpretable [5,20]. Plasma and ultrasound still need paired bench-versus-plant measurements, given the lettuce pilot drop [18] and the sonicator’s missing heat control [3].</w:t>
       </w:r>
     </w:p>
-    <w:bookmarkEnd w:id="33"/>
-    <w:bookmarkStart w:id="34" w:name="conclusions"/>
+    <w:bookmarkEnd w:id="44"/>
+    <w:bookmarkStart w:id="45" w:name="conclusions"/>
     <w:p>
       <w:pPr>
         <w:pStyle w:val="Heading2"/>
@@ -3644,8 +3783,8 @@
         <w:t xml:space="preserve">Legal milk pasteurisation is not interchangeable with 400–600 MPa on the included opinion: the industrial cycle underperforms heat on comparable log10 reductions [2]. A 5-log APC in grape purée is likewise not a juice pathogen validation [9]. Spore tails remain, so either HPTP or a cold chain has to be planned, with water activity as a designed factor [1,4,28]. Enzymes, bioactive proteins, and texture have to be measured on the same samples as microbes, because they do not covary [6,7,8]. Recovery methods and strain sets can move a log reduction as much as 100 MPa can, and they should be reported with the set-point [5,11]. Ultrasound, plasma, and irradiation stay in separate sentences until their included primary data are as dense as the HPP rows in Tables 1–3.</w:t>
       </w:r>
     </w:p>
-    <w:bookmarkEnd w:id="34"/>
-    <w:bookmarkStart w:id="35" w:name="references"/>
+    <w:bookmarkEnd w:id="45"/>
+    <w:bookmarkStart w:id="46" w:name="references"/>
     <w:p>
       <w:pPr>
         <w:pStyle w:val="Heading2"/>
@@ -4051,8 +4190,8 @@
         <w:t xml:space="preserve">[44] Jeevitha GC, et al. Non-thermal processing as a preservation tool for health-promoting beverages. 2023.</w:t>
       </w:r>
     </w:p>
-    <w:bookmarkEnd w:id="35"/>
-    <w:bookmarkEnd w:id="36"/>
+    <w:bookmarkEnd w:id="46"/>
+    <w:bookmarkEnd w:id="47"/>
     <w:sectPr/>
   </w:body>
 </w:document>

</xml_diff>

<commit_message>
Fix glued 4.1/5.1/6.1 headings and sequential paragraph joins.
Headings are titles only; the milk, spore, and enzyme paragraphs start on
the next line, and the checker fails that glue if it happens again.

Co-authored-by: hvianagil-alt <hvianagil-alt@users.noreply.github.com>
</commit_message>
<xml_diff>
--- a/review/runs/2026-09-20-scopus-hpp/export/article.docx
+++ b/review/runs/2026-09-20-scopus-hpp/export/article.docx
@@ -393,17 +393,17 @@
         <w:jc w:val="both"/>
       </w:pPr>
       <w:r>
-        <w:t xml:space="preserve">Vegetative lethality under HPP is real and often large, but it is a family of outcomes, not one.</w:t>
-      </w:r>
-    </w:p>
-    <w:bookmarkStart w:id="28" w:name="X55d1ae8e347784e247ae3eeb43027d5b2657416"/>
+        <w:t xml:space="preserve">Vegetative lethality under HPP is real and often large, but it is a family of outcomes, not one. Ice is the first coefficient that can turn a mild cycle into a large log.</w:t>
+      </w:r>
+    </w:p>
+    <w:bookmarkStart w:id="28" w:name="freezing-before-pressure"/>
     <w:p>
       <w:pPr>
         <w:pStyle w:val="Heading3"/>
         <w:jc w:val="left"/>
       </w:pPr>
       <w:r>
-        <w:t xml:space="preserve">3.1 Ice changes the kill that a mild cycle can deliver</w:t>
+        <w:t xml:space="preserve">3.1 Freezing before pressure</w:t>
       </w:r>
     </w:p>
     <w:p>
@@ -428,30 +428,18 @@
         <w:t xml:space="preserve"> </w:t>
       </w:r>
       <w:r>
-        <w:t xml:space="preserve">K12 lost 1.83 log CFU·ml−1 after 400 MPa for 9 min at 4 °C when the sample had been held at 4 °C; the same pressure–time after freezing at −24 °C or −80 °C produced 5.63 and 6.83 log reductions, with scanning electron micrographs showing wall rupture only in the frozen, pressurised cells [16]. Orange juice at 250 MPa for 15 min stayed below 0.5 log kill at pH 4.5 and 5.8 unless it was frozen first, when reductions rose to about 4 log [16]. Freezing is therefore not a footnote: it changes the physics (ice polymorphs, cell rigidity) enough to turn a mild cycle into a pasteurisation-scale kill for a surrogate organism. It also moves the process out of</w:t>
-      </w:r>
-      <w:r>
-        <w:t xml:space="preserve"> </w:t>
-      </w:r>
-      <w:r>
-        <w:t xml:space="preserve">“</w:t>
-      </w:r>
-      <w:r>
-        <w:t xml:space="preserve">HPP only.</w:t>
-      </w:r>
-      <w:r>
-        <w:t xml:space="preserve">”</w:t>
+        <w:t xml:space="preserve">K12 lost 1.83 log CFU·ml−1 after 400 MPa for 9 min at 4 °C when the sample had been held at 4 °C; the same pressure–time after freezing at −24 °C or −80 °C produced 5.63 and 6.83 log reductions, with scanning electron micrographs showing wall rupture only in the frozen, pressurised cells [16]. Orange juice at 250 MPa for 15 min stayed below 0.5 log kill at pH 4.5 and 5.8 unless it was frozen first, when reductions rose to about 4 log [16]. Freezing is therefore not a footnote: ice polymorphs and cell rigidity change the physics enough to look like pasteurisation for a surrogate, and the process is no longer HPP alone.</w:t>
       </w:r>
     </w:p>
     <w:bookmarkEnd w:id="28"/>
-    <w:bookmarkStart w:id="29" w:name="X7ead7e81d2918d9145f02559137bda9589d211a"/>
+    <w:bookmarkStart w:id="29" w:name="strain-and-solute-in-ready-to-eat-meat"/>
     <w:p>
       <w:pPr>
         <w:pStyle w:val="Heading3"/>
         <w:jc w:val="left"/>
       </w:pPr>
       <w:r>
-        <w:t xml:space="preserve">3.2 Strain, solute, and the ready-to-eat window</w:t>
+        <w:t xml:space="preserve">3.2 Strain and solute in ready-to-eat meat</w:t>
       </w:r>
     </w:p>
     <w:p>
@@ -459,6 +447,12 @@
         <w:pStyle w:val="FirstParagraph"/>
         <w:jc w:val="both"/>
       </w:pPr>
+      <w:r>
+        <w:t xml:space="preserve">Even in unfrozen ham, an ingredient already in the recipe can do the same job.</w:t>
+      </w:r>
+      <w:r>
+        <w:t xml:space="preserve"> </w:t>
+      </w:r>
       <w:r>
         <w:rPr>
           <w:iCs/>
@@ -470,18 +464,18 @@
         <w:t xml:space="preserve"> </w:t>
       </w:r>
       <w:r>
-        <w:t xml:space="preserve">illustrates strain and solute dependence in foods that already contain Listeria controls. In cooked ham, lactate reduced HPP inactivation in a dose-dependent way: at 10 min, 1.4% lactate cut kill by 0.5–1.46 log versus the control depending on strain, and 2.8% lactate widened that gap [20]. That is piezo-protection: the same pressure, a more barotolerant phenotype because of an ingredient that is there for flavour and Listeria growth control. On RTE meats as a class, a scoping review of 74 studies found HPP in 29 of them. Below 400 MPa, inactivation was typically below 1 log even with long holds; at 500–600 MPa, reported reductions ran from 1 to 7 log CFU/g within about 5 min [5]. Thirty-one of 74 papers omitted standard deviations; 27 used a single strain; meta-analysis was judged impossible [5]. Table 1 therefore lists primary challenges as rows, not as a pooled mean.</w:t>
+        <w:t xml:space="preserve">is the usual test organism in foods that already contain Listeria controls. In cooked ham, lactate reduced HPP inactivation in a dose-dependent way: at 10 min, 1.4% lactate cut kill by 0.5–1.46 log versus the control depending on strain, and 2.8% lactate widened that gap [20]. That is piezo-protection: the same pressure, a more barotolerant phenotype because of an ingredient that is there for flavour and Listeria growth control. On RTE meats as a class, a scoping review of 74 studies found HPP in 29 of them. Below 400 MPa, inactivation was typically below 1 log even with long holds; at 500–600 MPa, reported reductions ran from 1 to 7 log CFU/g within about 5 min [5]. Thirty-one of 74 papers omitted standard deviations; 27 used a single strain; meta-analysis was judged impossible [5]. Table 1 therefore lists primary challenges as rows, not as a pooled mean.</w:t>
       </w:r>
     </w:p>
     <w:bookmarkEnd w:id="29"/>
-    <w:bookmarkStart w:id="30" w:name="enumeration-injury-and-repair"/>
+    <w:bookmarkStart w:id="30" w:name="injury-that-the-plate-can-hide"/>
     <w:p>
       <w:pPr>
         <w:pStyle w:val="Heading3"/>
         <w:jc w:val="left"/>
       </w:pPr>
       <w:r>
-        <w:t xml:space="preserve">3.3 Enumeration, injury, and repair</w:t>
+        <w:t xml:space="preserve">3.3 Injury that the plate can hide</w:t>
       </w:r>
     </w:p>
     <w:p>
@@ -490,7 +484,7 @@
         <w:jc w:val="both"/>
       </w:pPr>
       <w:r>
-        <w:t xml:space="preserve">Enumeration can manufacture disagreement. In fruit purées treated by HPP, inactivation looked 0.9- to 4.5-fold higher in apple than in banana–apple on matched organisms [11]. Immediate reductions on non-selective media in banana–apple were 0.3 log for</w:t>
+        <w:t xml:space="preserve">Even when pressure and matrix are fixed, the plate can still invent a disagreement. In fruit purées treated by HPP, inactivation looked 0.9- to 4.5-fold higher in apple than in banana–apple on matched organisms [11]. Immediate reductions on non-selective media in banana–apple were 0.3 log for</w:t>
       </w:r>
       <w:r>
         <w:t xml:space="preserve"> </w:t>
@@ -581,7 +575,7 @@
         <w:jc w:val="both"/>
       </w:pPr>
       <w:r>
-        <w:t xml:space="preserve">Taken together, Table 1 supports a working rule: 500–600 MPa for a few minutes is the industrial vegetative window, and everything else (ice, lactate, fat, °Brix, agar, strain cocktail) is a coefficient, not noise [2,5,11,16,20]. The same rule forbids reading a 5-log claim off a pressure gauge.</w:t>
+        <w:t xml:space="preserve">Taken together, Table 1 supports a working rule: 500–600 MPa for a few minutes is the industrial vegetative window, and ice, lactate, fat, °Brix, agar, and strain cocktail are coefficients, not noise [2,5,11,16,20]. A 5-log pasteurisation claim cannot be read off that gauge. It has to be compared with a legal or HACCP number.</w:t>
       </w:r>
     </w:p>
     <w:p>
@@ -1394,17 +1388,26 @@
         <w:jc w:val="both"/>
       </w:pPr>
       <w:r>
-        <w:t xml:space="preserve">A pasteurisation claim is a comparison to a legal or HACCP number, not a comparison to an untreated control.</w:t>
-      </w:r>
-    </w:p>
-    <w:bookmarkStart w:id="32" w:name="Xd3118e4312577d871cf77f88132fdc9c7be923b"/>
+        <w:t xml:space="preserve">Milk is the dossier where that comparison is sharpest, because the law already names time, temperature, and a 5 log10 performance criterion.</w:t>
+      </w:r>
+    </w:p>
+    <w:bookmarkStart w:id="32" w:name="X69fd5386b60818d7dbad1a9e5e9eaeed7647564"/>
     <w:p>
       <w:pPr>
         <w:pStyle w:val="Heading3"/>
         <w:jc w:val="left"/>
       </w:pPr>
       <w:r>
-        <w:t xml:space="preserve">4.1 Milk and the legal heat bar For milk, EFSA treated industrial 600 MPa for 6 min as the stringent HPP case and still found fewer log10 reductions than legal heat for the pathogens that could be modelled, so HPP milk was not equivalent to pasteurisation on that metric [2].</w:t>
+        <w:t xml:space="preserve">4.1 HPP milk versus legal heat pasteurisation</w:t>
+      </w:r>
+    </w:p>
+    <w:p>
+      <w:pPr>
+        <w:pStyle w:val="FirstParagraph"/>
+        <w:jc w:val="both"/>
+      </w:pPr>
+      <w:r>
+        <w:t xml:space="preserve">EFSA treated industrial 600 MPa for 6 min as the stringent HPP case and still found fewer log10 reductions than legal heat for the pathogens that could be modelled, so HPP milk was not equivalent to pasteurisation on that metric [2].</w:t>
       </w:r>
       <w:r>
         <w:t xml:space="preserve"> </w:t>
@@ -1441,7 +1444,7 @@
     </w:p>
     <w:p>
       <w:pPr>
-        <w:pStyle w:val="FirstParagraph"/>
+        <w:pStyle w:val="BodyText"/>
         <w:jc w:val="both"/>
       </w:pPr>
       <w:r>
@@ -1590,14 +1593,14 @@
       </w:r>
     </w:p>
     <w:bookmarkEnd w:id="32"/>
-    <w:bookmarkStart w:id="33" w:name="X5cc7c0825095540f7746574ad1bf302ef6067ea"/>
+    <w:bookmarkStart w:id="33" w:name="juice-apc-is-not-a-named-pathogen-5-log"/>
     <w:p>
       <w:pPr>
         <w:pStyle w:val="Heading3"/>
         <w:jc w:val="left"/>
       </w:pPr>
       <w:r>
-        <w:t xml:space="preserve">4.2 Juice, aerobic plate count, and named pathogens</w:t>
+        <w:t xml:space="preserve">4.2 Juice APC is not a named-pathogen 5-log</w:t>
       </w:r>
     </w:p>
     <w:p>
@@ -1606,7 +1609,7 @@
         <w:jc w:val="both"/>
       </w:pPr>
       <w:r>
-        <w:t xml:space="preserve">Juices and purées look kinder to HPP because low pH already suppresses many pathogens, but the 5-log juice rule is still organism-specific. Whole Concord grape purée showed about 5-log reduction of fresh APC after both HPP and heat; yeasts and moulds were &lt;1.0 log CFU/g after HPP versus 1.22 after heat, and HPP held those groups down longer in four-month storage [9]. That is a 5-log APC result, not a named</w:t>
+        <w:t xml:space="preserve">Juice looks easier because acid already suppresses many pathogens, yet the US 5-log rule is still organism-specific. Whole Concord grape purée showed about 5-log reduction of fresh APC after both HPP and heat; yeasts and moulds were &lt;1.0 log CFU/g after HPP versus 1.22 after heat, and HPP held those groups down longer in four-month storage [9]. That is a 5-log APC result, not a named</w:t>
       </w:r>
       <w:r>
         <w:t xml:space="preserve"> </w:t>
@@ -2365,17 +2368,26 @@
         <w:jc w:val="both"/>
       </w:pPr>
       <w:r>
-        <w:t xml:space="preserve">Industrial HPP at ambient or chill temperature is a pasteurisation technology for vegetative cells. It is not a botulinum cook.</w:t>
-      </w:r>
-    </w:p>
-    <w:bookmarkStart w:id="35" w:name="X95fe18cbc4cd58f30f8aa15dae63c071f1527cd"/>
+        <w:t xml:space="preserve">Those juice and milk rows are still vegetative stories. Industrial HPP at ambient or chill temperature is not a botulinum cook.</w:t>
+      </w:r>
+    </w:p>
+    <w:bookmarkStart w:id="35" w:name="spores-adiabatic-heat-and-refrigeration"/>
     <w:p>
       <w:pPr>
         <w:pStyle w:val="Heading3"/>
         <w:jc w:val="left"/>
       </w:pPr>
       <w:r>
-        <w:t xml:space="preserve">5.1 Spores and heat under pressure Reviews of fruit and vegetable kinetics state that pressures below 600 MPa at room temperature struggle with bacterial spores, and that some</w:t>
+        <w:t xml:space="preserve">5.1 Spores, adiabatic heat, and refrigeration</w:t>
+      </w:r>
+    </w:p>
+    <w:p>
+      <w:pPr>
+        <w:pStyle w:val="FirstParagraph"/>
+        <w:jc w:val="both"/>
+      </w:pPr>
+      <w:r>
+        <w:t xml:space="preserve">Reviews of fruit and vegetable kinetics state that pressures below 600 MPa at room temperature struggle with bacterial spores, and that some</w:t>
       </w:r>
       <w:r>
         <w:t xml:space="preserve"> </w:t>
@@ -2396,7 +2408,7 @@
     </w:p>
     <w:p>
       <w:pPr>
-        <w:pStyle w:val="FirstParagraph"/>
+        <w:pStyle w:val="BodyText"/>
         <w:jc w:val="both"/>
       </w:pPr>
       <w:r>
@@ -2479,14 +2491,14 @@
       </w:r>
     </w:p>
     <w:bookmarkEnd w:id="35"/>
-    <w:bookmarkStart w:id="36" w:name="X41e3b16911a78bc15e9716720eca54206b3df2a"/>
+    <w:bookmarkStart w:id="36" w:name="vegetative-hurdles-are-not-a-spore-cook"/>
     <w:p>
       <w:pPr>
         <w:pStyle w:val="Heading3"/>
         <w:jc w:val="left"/>
       </w:pPr>
       <w:r>
-        <w:t xml:space="preserve">5.2 Combined hurdles that are still vegetative</w:t>
+        <w:t xml:space="preserve">5.2 Vegetative hurdles are not a spore cook</w:t>
       </w:r>
     </w:p>
     <w:p>
@@ -2495,7 +2507,7 @@
         <w:jc w:val="both"/>
       </w:pPr>
       <w:r>
-        <w:t xml:space="preserve">Hurdles other than bulk heat try to finish vegetative kill at milder set-points. A mini-review of HHP combinations in plant foods starts from pressure-resistant strains and storage regrowth after HHP alone, and treats nonthermal partners as process-design problems rather than as seasoning [12]. A hurdle review recites blueberry juice thermosonication plus 400 or 600 MPa / 5 min among combinations that let each factor run milder [19]. Ultrasound plus HPP eliminated detectable</w:t>
+        <w:t xml:space="preserve">If even heat under pressure can fail when water activity is low, milder nonthermal partners cannot be sold as a spore cook. They are used to finish vegetative kill at milder set-points. A mini-review of HHP combinations in plant foods starts from pressure-resistant strains and storage regrowth after HHP alone, and treats nonthermal partners as process-design problems rather than as seasoning [12]. A hurdle review recites blueberry juice thermosonication plus 400 or 600 MPa / 5 min among combinations that let each factor run milder [19]. Ultrasound plus HPP eliminated detectable</w:t>
       </w:r>
       <w:r>
         <w:t xml:space="preserve"> </w:t>
@@ -3099,7 +3111,7 @@
         <w:jc w:val="both"/>
       </w:pPr>
       <w:r>
-        <w:t xml:space="preserve">If HPP is sold as</w:t>
+        <w:t xml:space="preserve">A clean plate still does not make the food</w:t>
       </w:r>
       <w:r>
         <w:t xml:space="preserve"> </w:t>
@@ -3108,7 +3120,7 @@
         <w:t xml:space="preserve">“</w:t>
       </w:r>
       <w:r>
-        <w:t xml:space="preserve">fresh-like,</w:t>
+        <w:t xml:space="preserve">fresh-like.</w:t>
       </w:r>
       <w:r>
         <w:t xml:space="preserve">”</w:t>
@@ -3117,17 +3129,17 @@
         <w:t xml:space="preserve"> </w:t>
       </w:r>
       <w:r>
-        <w:t xml:space="preserve">the endpoint must be named.</w:t>
-      </w:r>
-    </w:p>
-    <w:bookmarkStart w:id="38" w:name="Xd05e11dca5029352cea6833b857b631b3ef27a6"/>
+        <w:t xml:space="preserve">That claim has to name an enzyme, a protein, or a texture.</w:t>
+      </w:r>
+    </w:p>
+    <w:bookmarkStart w:id="38" w:name="enzymes-and-bioactive-proteins"/>
     <w:p>
       <w:pPr>
         <w:pStyle w:val="Heading3"/>
         <w:jc w:val="left"/>
       </w:pPr>
       <w:r>
-        <w:t xml:space="preserve">6.1 Enzymes and bioactive proteins PPO and peroxidase in celery juice fell after HPP and stayed low while microbial counts held for 8 weeks [27]. In grape juice, the same class of enzyme barely moved under HPP while heat and ohmic heating removed more than 90% of PPO [6]. Cloud-stable orange juice historically uses 90–99 °C for 15–30 s to hit thermostable pectin methylesterase; some pressure studies inactivate the heat-labile PME fraction at ≥500 MPa, with large residual variation by cultivar [4]. Enzyme and microbe are different targets.</w:t>
+        <w:t xml:space="preserve">6.1 Enzymes and bioactive proteins</w:t>
       </w:r>
     </w:p>
     <w:p>
@@ -3136,18 +3148,27 @@
         <w:jc w:val="both"/>
       </w:pPr>
       <w:r>
-        <w:t xml:space="preserve">Proteins unfold under pressure because non-covalent bonds yield. A protein-source review reports lower allergenicity and higher digestibility/bioactivity for cereal, legume, and nut proteins after HHP, higher surface hydrophobicity for some seed and vegetable proteins, and mixed foaming/gelling/antioxidant shifts in dairy [29]. That is a functional-food story, not a Listeria story, and it is qualitative across methods. Milk bioactive proteins are the regulatory twin of section 4: holding IgG and lactoferrin is the reason to prefer HPP over Holder or high-temperature short-time in some human-milk and bovine-milk arguments, but Sykora’s four overlap papers are not enough to set a dual specification [24]. Donkey milk shows the trade in one factorial: 500 MPa maximised aerobic kill and maximised lactoferrin activity loss [7].</w:t>
+        <w:t xml:space="preserve">PPO and peroxidase in celery juice fell after HPP and stayed low while microbial counts held for 8 weeks [27]. In grape juice, the same class of enzyme barely moved under HPP while heat and ohmic heating removed more than 90% of PPO [6]. Cloud-stable orange juice historically uses 90–99 °C for 15–30 s to hit thermostable pectin methylesterase; some pressure studies inactivate the heat-labile PME fraction at ≥500 MPa, with large residual variation by cultivar [4]. Enzyme and microbe are different targets.</w:t>
+      </w:r>
+    </w:p>
+    <w:p>
+      <w:pPr>
+        <w:pStyle w:val="BodyText"/>
+        <w:jc w:val="both"/>
+      </w:pPr>
+      <w:r>
+        <w:t xml:space="preserve">Proteins unfold under pressure because non-covalent bonds yield. A protein-source review reports lower allergenicity and higher digestibility/bioactivity for cereal, legume, and nut proteins after HHP, higher surface hydrophobicity for some seed and vegetable proteins, and mixed foaming/gelling/antioxidant shifts in dairy [29]. That is a functional-food story, not a Listeria story, and it is qualitative across methods. Holding IgG and lactoferrin is why some human-milk and bovine-milk arguments prefer HPP over Holder or high-temperature short-time, but Sykora’s four overlap papers are not enough to set a dual specification with the pathogen logs already shown for milk [24]. Donkey milk shows the trade in one factorial: 500 MPa maximised aerobic kill and maximised lactoferrin activity loss [7].</w:t>
       </w:r>
     </w:p>
     <w:bookmarkEnd w:id="38"/>
-    <w:bookmarkStart w:id="39" w:name="texture-in-gels-and-formulated-products"/>
+    <w:bookmarkStart w:id="39" w:name="texture-when-600-mpa-is-not-gentle"/>
     <w:p>
       <w:pPr>
         <w:pStyle w:val="Heading3"/>
         <w:jc w:val="left"/>
       </w:pPr>
       <w:r>
-        <w:t xml:space="preserve">6.2 Texture in gels and formulated products</w:t>
+        <w:t xml:space="preserve">6.2 Texture when 600 MPa is not gentle</w:t>
       </w:r>
     </w:p>
     <w:p>
@@ -3156,7 +3177,7 @@
         <w:jc w:val="both"/>
       </w:pPr>
       <w:r>
-        <w:t xml:space="preserve">Texture can fail while safety succeeds. Unwashed</w:t>
+        <w:t xml:space="preserve">Texture is the next named endpoint, and it can fail while the plate looks clean. Unwashed</w:t>
       </w:r>
       <w:r>
         <w:t xml:space="preserve"> </w:t>
@@ -3176,14 +3197,14 @@
       </w:r>
     </w:p>
     <w:bookmarkEnd w:id="39"/>
-    <w:bookmarkStart w:id="40" w:name="seafood-storage-ecology"/>
+    <w:bookmarkStart w:id="40" w:name="chilled-seafood-and-spoilage-flora"/>
     <w:p>
       <w:pPr>
         <w:pStyle w:val="Heading3"/>
         <w:jc w:val="left"/>
       </w:pPr>
       <w:r>
-        <w:t xml:space="preserve">6.3 Seafood storage ecology</w:t>
+        <w:t xml:space="preserve">6.3 Chilled seafood and spoilage flora</w:t>
       </w:r>
     </w:p>
     <w:p>
@@ -3192,7 +3213,20 @@
         <w:jc w:val="both"/>
       </w:pPr>
       <w:r>
-        <w:t xml:space="preserve">Seafood storage trials are mostly spoilage ecology, not pathogen HACCP. Salmon and plaice fillets after HPP kept Enterobacteriaceae, mesophiles, psychrotrophs, and</w:t>
+        <w:t xml:space="preserve">Chilled seafood is where that trade is sold: histamine,</w:t>
+      </w:r>
+      <w:r>
+        <w:t xml:space="preserve"> </w:t>
+      </w:r>
+      <w:r>
+        <w:rPr>
+          <w:iCs/>
+          <w:i/>
+        </w:rPr>
+        <w:t xml:space="preserve">Vibrio</w:t>
+      </w:r>
+      <w:r>
+        <w:t xml:space="preserve">, and</w:t>
       </w:r>
       <w:r>
         <w:t xml:space="preserve"> </w:t>
@@ -3205,10 +3239,23 @@
         <w:t xml:space="preserve">Pseudomonas</w:t>
       </w:r>
       <w:r>
-        <w:t xml:space="preserve"> </w:t>
-      </w:r>
-      <w:r>
-        <w:t xml:space="preserve">lower at every sampling day and remained microbiologically acceptable to day 12, with histamine remaining low [33]. Mackerel fish balls at 250–350 MPa started &lt;1 log CFU/g versus about 2.2 in controls and stayed down for 7 days at 4 °C, comparable to 121 °C retort on counts but not on a cooked texture [34]. Squid mantle with mint extract plus 400 MPa delayed total viable count relative to pressure or extract alone; several treatments still crossed a TVC limit by day 6 without the mint [35]. Precooked crab needed 300 MPa more than 100 MPa to move</w:t>
+        <w:t xml:space="preserve">, not a 5-log</w:t>
+      </w:r>
+      <w:r>
+        <w:t xml:space="preserve"> </w:t>
+      </w:r>
+      <w:r>
+        <w:rPr>
+          <w:iCs/>
+          <w:i/>
+        </w:rPr>
+        <w:t xml:space="preserve">Salmonella</w:t>
+      </w:r>
+      <w:r>
+        <w:t xml:space="preserve"> </w:t>
+      </w:r>
+      <w:r>
+        <w:t xml:space="preserve">graph. Castrica’s dual-species fillet trial is the cleanest storage design among the included fish papers: treated salmon and plaice stayed acceptable to day 12 while untreated flora ran ahead, and histamine stayed low [33]. Wang’s mackerel fish balls at 250–350 MPa started &lt;1 log CFU/g versus about 2.2 in controls and stayed down for 7 days at 4 °C; counts can look similar to a 121 °C retort at day 7 while the thermal product is a different food [34]. Nilsuwan’s mint extract plus 400 MPa on squid delayed total viable count relative to pressure or extract alone, with several treatments still crossing a TVC limit by day 6 without the mint; the extra kill is modest, so the benefit is days of delay rather than a spore cook [35]. Precooked crab needed 300 MPa more than 100 MPa to move</w:t>
       </w:r>
       <w:r>
         <w:t xml:space="preserve"> </w:t>
@@ -3272,102 +3319,7 @@
         <w:t xml:space="preserve"> </w:t>
       </w:r>
       <w:r>
-        <w:t xml:space="preserve">below 1 log whether a long hold or two short HHP cycles were used [22]. Sous-vide products after high hydrostatic pressure stayed below 1.30 log CFU/g on TSA through day 45 in one trial while controls exceeded 5 log [37]. An aquatic-food UHP review collects these patterns without a pooled shelf-life [38].</w:t>
-      </w:r>
-    </w:p>
-    <w:p>
-      <w:pPr>
-        <w:pStyle w:val="BodyText"/>
-        <w:jc w:val="both"/>
-      </w:pPr>
-      <w:r>
-        <w:t xml:space="preserve">Fermented and formulated drinks add a further twist: ultrasound-assisted ultra-high pressure changed antioxidant readings and sugar consumption in a lactic fermentation at 24–40 h [39]. That is process intensification of a ferment, not pasteurisation of a pathogen.</w:t>
-      </w:r>
-    </w:p>
-    <w:p>
-      <w:pPr>
-        <w:pStyle w:val="BodyText"/>
-        <w:jc w:val="both"/>
-      </w:pPr>
-      <w:r>
-        <w:t xml:space="preserve">Seafood numbers in the included trials are mostly spoilage ecology. They still earn a place because RTE fish is a commercial HPP category and because histamine,</w:t>
-      </w:r>
-      <w:r>
-        <w:t xml:space="preserve"> </w:t>
-      </w:r>
-      <w:r>
-        <w:rPr>
-          <w:iCs/>
-          <w:i/>
-        </w:rPr>
-        <w:t xml:space="preserve">Vibrio</w:t>
-      </w:r>
-      <w:r>
-        <w:t xml:space="preserve">, and</w:t>
-      </w:r>
-      <w:r>
-        <w:t xml:space="preserve"> </w:t>
-      </w:r>
-      <w:r>
-        <w:rPr>
-          <w:iCs/>
-          <w:i/>
-        </w:rPr>
-        <w:t xml:space="preserve">Pseudomonas</w:t>
-      </w:r>
-      <w:r>
-        <w:t xml:space="preserve"> </w:t>
-      </w:r>
-      <w:r>
-        <w:t xml:space="preserve">are the practical failures, not a 5-log</w:t>
-      </w:r>
-      <w:r>
-        <w:t xml:space="preserve"> </w:t>
-      </w:r>
-      <w:r>
-        <w:rPr>
-          <w:iCs/>
-          <w:i/>
-        </w:rPr>
-        <w:t xml:space="preserve">Salmonella</w:t>
-      </w:r>
-      <w:r>
-        <w:t xml:space="preserve"> </w:t>
-      </w:r>
-      <w:r>
-        <w:t xml:space="preserve">graph. Castrica’s dual-species fillet trial is the cleanest storage design: treated packs stayed acceptable to day 12 while untreated flora ran ahead, and histamine stayed low [33]. Wang’s fish balls compare 250–350 MPa with a 121 °C cook on the same product; counts can look similar at day 7 while the thermal product is a different food [34]. Nilsuwan’s mint-plus-pressure squid is a hurdle in the quality section rather than in section 5 because the extra kill is modest and the benefit is days of TVC delay [35]. Crab at 100 MPa barely moved APC; 300 MPa was the step that changed</w:t>
-      </w:r>
-      <w:r>
-        <w:t xml:space="preserve"> </w:t>
-      </w:r>
-      <w:r>
-        <w:rPr>
-          <w:iCs/>
-          <w:i/>
-        </w:rPr>
-        <w:t xml:space="preserve">Vibrio</w:t>
-      </w:r>
-      <w:r>
-        <w:t xml:space="preserve"> </w:t>
-      </w:r>
-      <w:r>
-        <w:t xml:space="preserve">[23]. Lian’s carbon-dioxide process is not HPP, but it shows the same buffer-versus-surface gap that plasma shows on lettuce [18,36]. Pérez Alcalá’s sous-vide plus pressure trial is a refrigerated RTE logic: controls crossed 5 log while pressurised packs stayed near the detection floor for weeks [37]. González-Cantillo’s burger cycles (one long hold versus two shorts) both dropped</w:t>
-      </w:r>
-      <w:r>
-        <w:t xml:space="preserve"> </w:t>
-      </w:r>
-      <w:r>
-        <w:rPr>
-          <w:iCs/>
-          <w:i/>
-        </w:rPr>
-        <w:t xml:space="preserve">E. coli</w:t>
-      </w:r>
-      <w:r>
-        <w:t xml:space="preserve"> </w:t>
-      </w:r>
-      <w:r>
-        <w:t xml:space="preserve">below 1 log, so cycle architecture was not the dominant factor in that matrix [22]. Marçal’s mineral-fortified sausages and Rossi Ribeiro’s pumpkin pulp show HPP as a shelf-life tool in formulated products where</w:t>
+        <w:t xml:space="preserve">below 1 log whether a long hold or two short HHP cycles were used [22]. Sous-vide products after high hydrostatic pressure stayed below 1.30 log CFU/g on TSA through day 45 in one trial while controls exceeded 5 log [37]. An aquatic-food UHP review collects these patterns without a pooled shelf-life [38]. Ultrasound-assisted ultra-high pressure in a lactic fermentation changed antioxidant readings and sugar consumption at 24–40 h; that is process intensification of a ferment, not pasteurisation of a pathogen [39]. Marçal’s mineral-fortified sausages and Rossi Ribeiro’s pumpkin pulp show HPP as a shelf-life tool in formulated products where</w:t>
       </w:r>
       <w:r>
         <w:t xml:space="preserve"> </w:t>
@@ -3385,16 +3337,16 @@
         <w:t xml:space="preserve"> </w:t>
       </w:r>
       <w:r>
-        <w:t xml:space="preserve">is already compromised by other ingredients [30,31]. Peng’s aquatic UHP review is the narrative envelope for those rows, not an extra dataset [38].</w:t>
-      </w:r>
-    </w:p>
-    <w:p>
-      <w:pPr>
-        <w:pStyle w:val="BodyText"/>
-        <w:jc w:val="both"/>
-      </w:pPr>
-      <w:r>
-        <w:t xml:space="preserve">Taken together, HPP quality is sometimes better than heat (grape APC storage [9], donkey-milk enzymes at 400 MPa [7], avocado colour in commercial examples reviewed for plant foods [4]) and sometimes worse or simply different (kelp hardness [8], grape PPO [6], cream at 450 MPa [13]). Plate counts do not arbitrate those sentences.</w:t>
+        <w:t xml:space="preserve">is already compromised by other ingredients [30,31].</w:t>
+      </w:r>
+    </w:p>
+    <w:p>
+      <w:pPr>
+        <w:pStyle w:val="BodyText"/>
+        <w:jc w:val="both"/>
+      </w:pPr>
+      <w:r>
+        <w:t xml:space="preserve">Taken together, HPP quality is sometimes better than heat (grape APC storage [9], donkey-milk enzymes at 400 MPa [7], avocado colour in commercial examples reviewed for plant foods [4]) and sometimes worse or simply different (kelp hardness [8], grape PPO [6], cream at 450 MPa [13]). Plate counts do not arbitrate those sentences, and they also do not license treating ultrasound, plasma, or irradiation as interchangeable with pressure.</w:t>
       </w:r>
     </w:p>
     <w:bookmarkEnd w:id="40"/>
@@ -3415,7 +3367,7 @@
         <w:jc w:val="both"/>
       </w:pPr>
       <w:r>
-        <w:t xml:space="preserve">The included studies are HPP-heavy. Other fields appear as supporting technologies, not as a balanced map.</w:t>
+        <w:t xml:space="preserve">Those methods appear here as supporting technologies, not as a balanced map of the nonthermal field.</w:t>
       </w:r>
     </w:p>
     <w:bookmarkStart w:id="42" w:name="X3dea7b106e410944bea8c753daeb3fe28cc3ba4"/>
@@ -3434,16 +3386,16 @@
         <w:jc w:val="both"/>
       </w:pPr>
       <w:r>
-        <w:t xml:space="preserve">Ultrasound in apple juice at reduced temperature, with dual-frequency excitation and a Venturi, reached a few log of spoilage flora and improved visual sedimentation, with a specific energy of 0.044 kWh/L at the best condition, and did not replace a 5-log pathogen pasteuriser [3]. Ultrasound reviews of mycotoxin and fungal decontamination quote high percentage degradations of aflatoxin B1 under long, high-intensity treatments that are not juice HACCP validations [40]. Sugarcane-juice comparisons of ultrasound, pulsed electric fields, HPP, and microfluidization versus heat treat HHP as the most used nonthermal option in that matrix [41].</w:t>
-      </w:r>
-    </w:p>
-    <w:p>
-      <w:pPr>
-        <w:pStyle w:val="BodyText"/>
-        <w:jc w:val="both"/>
-      </w:pPr>
-      <w:r>
-        <w:t xml:space="preserve">Plasma is a surface technology. Gliding-arc plasma for 5 min plus C-phycocyanin delayed rainbow trout total viable count crossing 6 log CFU/g from day 3 (control) to day 12, and kept total volatile nitrogen below 30 mg N/100 g through day 18, while untreated fillets did not [17]. Plasma-functionalised water on fresh-cut lettuce reached 4–5 log10 laboratory reductions in multi-step washing and about 2 log10 in a pilot scenario that resembled a factory wash [18]. Scale, not species, is the disagreement.</w:t>
+        <w:t xml:space="preserve">The sonicator in apple juice is the clearest included example: dual-frequency excitation and a Venturi at reduced temperature reached a few log of spoilage flora and improved visual sedimentation, with a specific energy of 0.044 kWh/L at the best condition, and did not replace a 5-log pathogen pasteuriser [3]. Ultrasound reviews of mycotoxin and fungal decontamination quote high percentage degradations of aflatoxin B1 under long, high-intensity treatments that are not juice HACCP validations [40]. Sugarcane-juice comparisons of ultrasound, pulsed electric fields, HPP, and microfluidization versus heat treat HHP as the most used nonthermal option in that matrix [41].</w:t>
+      </w:r>
+    </w:p>
+    <w:p>
+      <w:pPr>
+        <w:pStyle w:val="BodyText"/>
+        <w:jc w:val="both"/>
+      </w:pPr>
+      <w:r>
+        <w:t xml:space="preserve">Plasma is a surface technology, so a log in buffer or on a fillet does not transfer to a wash line. Gliding-arc plasma for 5 min plus C-phycocyanin delayed rainbow trout total viable count crossing 6 log CFU/g from day 3 (control) to day 12, and kept total volatile nitrogen below 30 mg N/100 g through day 18, while untreated fillets did not [17]. Plasma-functionalised water on fresh-cut lettuce reached 4–5 log10 laboratory reductions in multi-step washing and about 2 log10 in a pilot scenario that resembled a factory wash [18]. Scale, not species, is the disagreement.</w:t>
       </w:r>
     </w:p>
     <w:p>
@@ -3473,7 +3425,7 @@
         <w:jc w:val="both"/>
       </w:pPr>
       <w:r>
-        <w:t xml:space="preserve">Broad matrix reviews rank HPP among options with typical vegetative reductions of 3–6 log10 and a high technology-readiness level, while insisting that no method is universal [43]. Beverage reviews argue that nonthermal methods can match thermal preservation with better nutrient retention, reciting a soy smoothie at 650 MPa / 20 °C / 3 min among examples [44]. Those sentences are maps. They do not override Tables 1–3. Weihe’s ranking of fields by typical log10 and readiness is useful for an engineer choosing a vessel; it is not a substitute for the milk opinion or the RTE-meat scoping range [2,5,43]. Jeevitha’s smoothie example sits at 650 MPa, which is already above many commercial 600 MPa ceilings discussed for plant foods [4,44]. Hashemi’s mycotoxin percentages come from long ultrasonic treatments that would not be confused with a 3-minute HPP juice cycle if the methods were read [3,40]. Mukhtar’s sugarcane ranking of HHP versus ohmic heating is matrix-bound [41]. Zhang’s ultrasound-assisted ultra-high pressure fermentation is a different unit operation again: antioxidants and sugar use in a lactic culture, not a pathogen specification [39]. Keeping those papers in section 7 rather than folding them into Tables 1–2 avoids mixing unit operations that share a slogan more than a mechanism.</w:t>
+        <w:t xml:space="preserve">Broad matrix reviews rank HPP among options with typical vegetative reductions of 3–6 log10 and a high technology-readiness level, while insisting that no method is universal [43]. Beverage reviews argue that nonthermal methods can match thermal preservation with better nutrient retention, reciting a soy smoothie at 650 MPa / 20 °C / 3 min among examples [44]. Those sentences are maps. They do not override Tables 1–3. Weihe’s ranking of fields by typical log10 and readiness is useful for an engineer choosing a vessel; it is not a substitute for the milk opinion or the RTE-meat scoping range [2,5,43]. Jeevitha’s smoothie example sits at 650 MPa, which is already above many commercial 600 MPa ceilings discussed for plant foods [4,44]. Hashemi’s mycotoxin percentages come from long ultrasonic treatments that would not be confused with a 3-minute HPP juice cycle if the methods were read [3,40]. Mukhtar’s sugarcane ranking of HHP versus ohmic heating is matrix-bound [41]. Zhang’s ultrasound-assisted ultra-high pressure fermentation is a different unit operation again: antioxidants and sugar use in a lactic culture, not a pathogen specification [39]. Folding those rows into Tables 1–2 would mix unit operations that share a slogan more than a mechanism.</w:t>
       </w:r>
     </w:p>
     <w:p>
@@ -3521,16 +3473,16 @@
         <w:t xml:space="preserve"> </w:t>
       </w:r>
       <w:r>
-        <w:t xml:space="preserve">sentence is how a narrative review would mislead.</w:t>
-      </w:r>
-    </w:p>
-    <w:p>
-      <w:pPr>
-        <w:pStyle w:val="BodyText"/>
-        <w:jc w:val="both"/>
-      </w:pPr>
-      <w:r>
-        <w:t xml:space="preserve">Logs cannot be pooled. Guzel’s scoping review refused a meta-analysis because variance, D-values-only papers, and single-strain challenges broke the table [5]. Torrents-Masoliver showed that fruit and agar can multiply apparent kill [11]. Serra-Castelló showed that lactate, a normal ham ingredient, subtracts kill [20]. Wu collected injury as a systematic after-effect of nonthermal culture success [21]. A reviewer who averages 1 log and 7 log at</w:t>
+        <w:t xml:space="preserve">sentence is how a narrative review would mislead, and it is why the logs cannot be pooled.</w:t>
+      </w:r>
+    </w:p>
+    <w:p>
+      <w:pPr>
+        <w:pStyle w:val="BodyText"/>
+        <w:jc w:val="both"/>
+      </w:pPr>
+      <w:r>
+        <w:t xml:space="preserve">Guzel’s scoping review refused a meta-analysis because variance, D-values-only papers, and single-strain challenges broke the table [5]. Torrents-Masoliver showed that fruit and agar can multiply apparent kill [11]. Serra-Castelló showed that lactate, a normal ham ingredient, subtracts kill [20]. Wu collected injury as a systematic after-effect of nonthermal culture success [21]. Averaging 1 log and 7 log at</w:t>
       </w:r>
       <w:r>
         <w:t xml:space="preserve"> </w:t>
@@ -3557,16 +3509,16 @@
         <w:jc w:val="both"/>
       </w:pPr>
       <w:r>
-        <w:t xml:space="preserve">Quality claims need the same discipline. PPO, lysozyme, kelp hardness, and APC are four thermometers. Eran Nagar’s grape juice is the exhibit: similar microbial drops, unlike enzyme drops, across HPP, ohmic, and thermal [6]. Braspaiboon’s allergenicity trends are a fifth thermometer still largely unconnected to the Listeria rows [29].</w:t>
-      </w:r>
-    </w:p>
-    <w:p>
-      <w:pPr>
-        <w:pStyle w:val="BodyText"/>
-        <w:jc w:val="both"/>
-      </w:pPr>
-      <w:r>
-        <w:t xml:space="preserve">Other nonthermal fields in this sample are too thin to rank against HPP. Ultrasound missed 5-log in apple juice [3]. Plasma lost about 2–3 log moving from bench lettuce to pilot [18]. Irradiation evidence here is a mini-review [42]. High-pressure carbon dioxide looked strong in suspension and weaker on prawn [36]. Substituting</w:t>
+        <w:t xml:space="preserve">Quality claims need that same refusal to average unlike thermometers. PPO, lysozyme, kelp hardness, and APC do not move together. Eran Nagar’s grape juice is the exhibit: similar microbial drops, unlike enzyme drops, across HPP, ohmic, and thermal [6]. Braspaiboon’s allergenicity trends are a fifth thermometer still largely unconnected to the Listeria rows [29].</w:t>
+      </w:r>
+    </w:p>
+    <w:p>
+      <w:pPr>
+        <w:pStyle w:val="BodyText"/>
+        <w:jc w:val="both"/>
+      </w:pPr>
+      <w:r>
+        <w:t xml:space="preserve">Ultrasound, plasma, and irradiation are too thinly evidenced here to rank against HPP. Ultrasound missed 5-log in apple juice [3]. Plasma lost about 2–3 log moving from bench lettuce to pilot [18]. Irradiation evidence here is a mini-review [42]. High-pressure carbon dioxide looked strong in suspension and weaker on prawn [36]. Substituting</w:t>
       </w:r>
       <w:r>
         <w:t xml:space="preserve"> </w:t>
@@ -3611,23 +3563,7 @@
         <w:jc w:val="both"/>
       </w:pPr>
       <w:r>
-        <w:t xml:space="preserve">Low-acid vegetable juices (pH above 4.6) remain a separate safety class even when HPP has reduced vegetative counts.</w:t>
-      </w:r>
-      <w:r>
-        <w:t xml:space="preserve"> </w:t>
-      </w:r>
-      <w:r>
-        <w:rPr>
-          <w:iCs/>
-          <w:i/>
-        </w:rPr>
-        <w:t xml:space="preserve">Clostridium botulinum</w:t>
-      </w:r>
-      <w:r>
-        <w:t xml:space="preserve"> </w:t>
-      </w:r>
-      <w:r>
-        <w:t xml:space="preserve">spores can grow in that pH window if the cold chain fails; processors still have to show that the product cannot support growth and toxin within its labelled life [4]. Refrigeration after HPP is therefore not only a quality choice. It is the control that makes commercial 600 MPa cycles legal for soups and some vegetable juices that would otherwise need a full sterilisation mentality [4,14]. Fruit juices below pH 4.6 are kinder, but acid-tolerant</w:t>
+        <w:t xml:space="preserve">Even inside HPP, pH still splits the safety class. Low-acid vegetable juices (pH above 4.6) remain a botulinum problem if the cold chain fails; processors still have to show that the product cannot support growth and toxin within its labelled life [4]. Refrigeration after HPP is therefore not only a quality choice. It is the control that makes commercial 600 MPa cycles legal for soups and some vegetable juices that would otherwise need a full sterilisation mentality [4,14]. Fruit juices below pH 4.6 are kinder, but acid-tolerant</w:t>
       </w:r>
       <w:r>
         <w:t xml:space="preserve"> </w:t>

</xml_diff>

<commit_message>
Rewrite 4.1/5.1 as standalone titles with sequential paragraph joins.
Keep each subsection title on its own line, open the next paragraph from the
previous close, and drop filler such as "in this sample" so the milk-to-spore
argument reads top to bottom.

Co-authored-by: hvianagil-alt <hvianagil-alt@users.noreply.github.com>
</commit_message>
<xml_diff>
--- a/review/runs/2026-09-20-scopus-hpp/export/article.docx
+++ b/review/runs/2026-09-20-scopus-hpp/export/article.docx
@@ -393,7 +393,7 @@
         <w:jc w:val="both"/>
       </w:pPr>
       <w:r>
-        <w:t xml:space="preserve">Vegetative lethality under HPP is real and often large, but it is a family of outcomes, not one. Ice is the first coefficient that can turn a mild cycle into a large log.</w:t>
+        <w:t xml:space="preserve">Vegetative lethality under HPP is real and often large, but it is a family of outcomes, not one number on a gauge. The first coefficient that can turn a mild cycle into a large log is ice.</w:t>
       </w:r>
     </w:p>
     <w:bookmarkStart w:id="28" w:name="freezing-before-pressure"/>
@@ -428,7 +428,7 @@
         <w:t xml:space="preserve"> </w:t>
       </w:r>
       <w:r>
-        <w:t xml:space="preserve">K12 lost 1.83 log CFU·ml−1 after 400 MPa for 9 min at 4 °C when the sample had been held at 4 °C; the same pressure–time after freezing at −24 °C or −80 °C produced 5.63 and 6.83 log reductions, with scanning electron micrographs showing wall rupture only in the frozen, pressurised cells [16]. Orange juice at 250 MPa for 15 min stayed below 0.5 log kill at pH 4.5 and 5.8 unless it was frozen first, when reductions rose to about 4 log [16]. Freezing is therefore not a footnote: ice polymorphs and cell rigidity change the physics enough to look like pasteurisation for a surrogate, and the process is no longer HPP alone.</w:t>
+        <w:t xml:space="preserve">K12 lost 1.83 log CFU·ml−1 after 400 MPa for 9 min at 4 °C when the sample had been held at 4 °C; the same pressure–time after freezing at −24 °C or −80 °C produced 5.63 and 6.83 log reductions, with scanning electron micrographs showing wall rupture only in the frozen, pressurised cells [16]. Orange juice at 250 MPa for 15 min stayed below 0.5 log kill at pH 4.5 and 5.8 unless it was frozen first, when reductions rose to about 4 log [16]. Ice polymorphs and cell rigidity change the physics enough to look like pasteurisation for a surrogate, so the process that delivered those extra logs is no longer HPP alone.</w:t>
       </w:r>
     </w:p>
     <w:bookmarkEnd w:id="28"/>
@@ -1388,7 +1388,7 @@
         <w:jc w:val="both"/>
       </w:pPr>
       <w:r>
-        <w:t xml:space="preserve">Milk is the dossier where that comparison is sharpest, because the law already names time, temperature, and a 5 log10 performance criterion.</w:t>
+        <w:t xml:space="preserve">That gauge still has to be compared with a legal or HACCP number. Milk is where the law already names the comparison: time, temperature, and a 5 log10 performance criterion.</w:t>
       </w:r>
     </w:p>
     <w:bookmarkStart w:id="32" w:name="X69fd5386b60818d7dbad1a9e5e9eaeed7647564"/>
@@ -1407,7 +1407,7 @@
         <w:jc w:val="both"/>
       </w:pPr>
       <w:r>
-        <w:t xml:space="preserve">EFSA treated industrial 600 MPa for 6 min as the stringent HPP case and still found fewer log10 reductions than legal heat for the pathogens that could be modelled, so HPP milk was not equivalent to pasteurisation on that metric [2].</w:t>
+        <w:t xml:space="preserve">EFSA ran that comparison on industrial 600 MPa for 6 min as the stringent HPP case and still found fewer log10 reductions than legal heat for the pathogens that could be modelled, so HPP milk was not equivalent to pasteurisation on that metric [2].</w:t>
       </w:r>
       <w:r>
         <w:t xml:space="preserve"> </w:t>
@@ -1423,7 +1423,7 @@
         <w:t xml:space="preserve"> </w:t>
       </w:r>
       <w:r>
-        <w:t xml:space="preserve">data in milks show the pressure staircase: 200–250 MPa for 5–15 min often &lt;0.5 log10; 300, 350, and 400 MPa for 5 min about 1, 4.4, and 6.3 log10 in cited work inside the opinion [2].</w:t>
+        <w:t xml:space="preserve">data in milks show the pressure staircase behind the model: 200–250 MPa for 5–15 min often &lt;0.5 log10; 300, 350, and 400 MPa for 5 min about 1, 4.4, and 6.3 log10 in cited work inside the opinion [2].</w:t>
       </w:r>
       <w:r>
         <w:t xml:space="preserve"> </w:t>
@@ -1439,16 +1439,16 @@
         <w:t xml:space="preserve"> </w:t>
       </w:r>
       <w:r>
-        <w:t xml:space="preserve">is repeatedly the more resistant vegetative pathogen under pressure [2,24]. Alkaline phosphatase does not verify HPP the way it verifies heat [2].</w:t>
-      </w:r>
-    </w:p>
-    <w:p>
-      <w:pPr>
-        <w:pStyle w:val="BodyText"/>
-        <w:jc w:val="both"/>
-      </w:pPr>
-      <w:r>
-        <w:t xml:space="preserve">The systematic review of raw bovine milk HPP found 65 papers with pathogen outcomes and 24 with bioactive proteins, but only four papers measured both [24]. Pressure was the strongest statistical contributor to log reductions for</w:t>
+        <w:t xml:space="preserve">is repeatedly the more resistant vegetative pathogen under pressure [2,24]. Alkaline phosphatase, the heat-pasteurisation indicator, does not verify HPP the way it verifies heat [2].</w:t>
+      </w:r>
+    </w:p>
+    <w:p>
+      <w:pPr>
+        <w:pStyle w:val="BodyText"/>
+        <w:jc w:val="both"/>
+      </w:pPr>
+      <w:r>
+        <w:t xml:space="preserve">A later systematic review of raw bovine milk asked the same equivalence question with a second endpoint. It found 65 papers with pathogen outcomes and 24 with bioactive proteins, but only four papers measured both [24]. Pressure was the strongest statistical contributor to log reductions for</w:t>
       </w:r>
       <w:r>
         <w:t xml:space="preserve"> </w:t>
@@ -1535,16 +1535,16 @@
         <w:t xml:space="preserve"> </w:t>
       </w:r>
       <w:r>
-        <w:t xml:space="preserve">results used 60 °C and are no longer nonthermal [24]. That is the optimisation hole: a cycle mild enough to keep immunoglobulin G and lactoferrin is not automatically a 5-log pathogen cycle, and the experiments that would show both on the same batch are scarce [24]. A paired high-temperature short-time versus HPP bovine-milk trial that reports both endpoints on the same batches is not among the included studies.</w:t>
-      </w:r>
-    </w:p>
-    <w:p>
-      <w:pPr>
-        <w:pStyle w:val="BodyText"/>
-        <w:jc w:val="both"/>
-      </w:pPr>
-      <w:r>
-        <w:t xml:space="preserve">Narrative dairy reviews still write that 400–600 MPa is</w:t>
+        <w:t xml:space="preserve">results used 60 °C and are no longer nonthermal [24]. A cycle mild enough to keep immunoglobulin G and lactoferrin is therefore not automatically a 5-log pathogen cycle, and the experiments that would show both on the same batch are scarce [24]. A paired high-temperature short-time versus HPP bovine-milk trial that reports both endpoints on the same batches is not among the included studies.</w:t>
+      </w:r>
+    </w:p>
+    <w:p>
+      <w:pPr>
+        <w:pStyle w:val="BodyText"/>
+        <w:jc w:val="both"/>
+      </w:pPr>
+      <w:r>
+        <w:t xml:space="preserve">That hole has not stopped narrative dairy reviews from calling 400–600 MPa</w:t>
       </w:r>
       <w:r>
         <w:t xml:space="preserve"> </w:t>
@@ -1562,16 +1562,16 @@
         <w:t xml:space="preserve"> </w:t>
       </w:r>
       <w:r>
-        <w:t xml:space="preserve">for microbial control [25] and that ultrasound, pulsed electric fields, and supercritical carbon dioxide are promising dairy tools [26]. Those sentences compile selected rows; they do not rebut the EFSA model. Table 2 marks the difference.</w:t>
-      </w:r>
-    </w:p>
-    <w:p>
-      <w:pPr>
-        <w:pStyle w:val="BodyText"/>
-        <w:jc w:val="both"/>
-      </w:pPr>
-      <w:r>
-        <w:t xml:space="preserve">Dairy experiments in this sample are consistent with</w:t>
+        <w:t xml:space="preserve">for microbial control [25] and ultrasound, pulsed electric fields, and supercritical carbon dioxide promising dairy tools [26]. Those sentences compile selected rows; they do not rebut the EFSA model. Table 2 marks the difference.</w:t>
+      </w:r>
+    </w:p>
+    <w:p>
+      <w:pPr>
+        <w:pStyle w:val="BodyText"/>
+        <w:jc w:val="both"/>
+      </w:pPr>
+      <w:r>
+        <w:t xml:space="preserve">Primary cream and donkey-milk experiments fit</w:t>
       </w:r>
       <w:r>
         <w:t xml:space="preserve"> </w:t>
@@ -1580,7 +1580,7 @@
         <w:t xml:space="preserve">“</w:t>
       </w:r>
       <w:r>
-        <w:t xml:space="preserve">pressure helps, equivalence is not shown.</w:t>
+        <w:t xml:space="preserve">pressure helps, equivalence is not shown</w:t>
       </w:r>
       <w:r>
         <w:t xml:space="preserve">”</w:t>
@@ -1589,7 +1589,7 @@
         <w:t xml:space="preserve"> </w:t>
       </w:r>
       <w:r>
-        <w:t xml:space="preserve">In dairy cream, 450 MPa for 5 min left total aerobic psychrotrophs similar to raw immediately and spoilage (&gt;6 log) from day 18; 600 MPa slowed recovery but heat still produced a different trajectory [13]. In donkey milk, 200, 400, and 500 MPa cut total aerobic bacteria by 0.85, 1.58, and 4.04 log CFU ml−1, while 75 °C for 2 min cut 1.34 log with much larger lysozyme loss in the results section than in the abstract [7]. Preferring the results section, 400 MPa is closer to a quality-preserving pasteurisation analogue than 500 MPa is, and neither is a pathogen challenge [7].</w:t>
+        <w:t xml:space="preserve">rather than the sufficiency slogan. In dairy cream, 450 MPa for 5 min left total aerobic psychrotrophs similar to raw immediately and spoilage (&gt;6 log) from day 18; 600 MPa slowed recovery but heat still produced a different trajectory [13]. In donkey milk, 200, 400, and 500 MPa cut total aerobic bacteria by 0.85, 1.58, and 4.04 log CFU ml−1, while 75 °C for 2 min cut 1.34 log with much larger lysozyme loss in the results section than in the abstract [7]. Read from the results section, 400 MPa is closer to a quality-preserving pasteurisation analogue than 500 MPa is, and neither is a pathogen challenge [7].</w:t>
       </w:r>
     </w:p>
     <w:bookmarkEnd w:id="32"/>
@@ -1609,7 +1609,7 @@
         <w:jc w:val="both"/>
       </w:pPr>
       <w:r>
-        <w:t xml:space="preserve">Juice looks easier because acid already suppresses many pathogens, yet the US 5-log rule is still organism-specific. Whole Concord grape purée showed about 5-log reduction of fresh APC after both HPP and heat; yeasts and moulds were &lt;1.0 log CFU/g after HPP versus 1.22 after heat, and HPP held those groups down longer in four-month storage [9]. That is a 5-log APC result, not a named</w:t>
+        <w:t xml:space="preserve">Juice processors face the same 5-log number, now written for a named pathogen rather than for heat-pasteurised milk, even though acid already suppresses many organisms. Whole Concord grape purée showed about 5-log reduction of fresh APC after both HPP and heat; yeasts and moulds were &lt;1.0 log CFU/g after HPP versus 1.22 after heat, and HPP held those groups down longer in four-month storage [9]. That is a 5-log APC result, not a named</w:t>
       </w:r>
       <w:r>
         <w:t xml:space="preserve"> </w:t>
@@ -1666,7 +1666,7 @@
         <w:jc w:val="both"/>
       </w:pPr>
       <w:r>
-        <w:t xml:space="preserve">Table 2 is therefore a scorecard of benchmarks, not of</w:t>
+        <w:t xml:space="preserve">Table 2 is therefore a scorecard of those benchmarks, not a verdict that</w:t>
       </w:r>
       <w:r>
         <w:t xml:space="preserve"> </w:t>
@@ -2387,7 +2387,7 @@
         <w:jc w:val="both"/>
       </w:pPr>
       <w:r>
-        <w:t xml:space="preserve">Reviews of fruit and vegetable kinetics state that pressures below 600 MPa at room temperature struggle with bacterial spores, and that some</w:t>
+        <w:t xml:space="preserve">Pressures below 600 MPa at room temperature struggle with bacterial spores; some</w:t>
       </w:r>
       <w:r>
         <w:t xml:space="preserve"> </w:t>
@@ -2403,16 +2403,16 @@
         <w:t xml:space="preserve"> </w:t>
       </w:r>
       <w:r>
-        <w:t xml:space="preserve">spores have been reported to survive 1200 MPa at ambient temperature in laboratory equipment [1]. HPTP uses the adiabatic temperature rise (about 3 °C per 100 MPa in water-rich foods, more in fats) plus hold and decompression cooling so that time spent above 100 °C can be much shorter than a retort [14]. Commercial HPP machines usually do not supply that heat; refrigerated distribution is the practical control on spore outgrowth [4].</w:t>
-      </w:r>
-    </w:p>
-    <w:p>
-      <w:pPr>
-        <w:pStyle w:val="BodyText"/>
-        <w:jc w:val="both"/>
-      </w:pPr>
-      <w:r>
-        <w:t xml:space="preserve">Houska 2022 compiles those industrial constraints with kinetic parameters rather than with a new challenge trial [4]. Kinetic form matters as much as the mean log. Vegetative inactivation in juices is often first-order, with D-values at 350 MPa on the order of 0.6–2 min for some lactic acid bacteria and yeasts [4]. Spore curves in fruit products are often concave-up (Weibull or biphasic) with tails: as time increases, remaining spores look harder [1,4]. For</w:t>
+        <w:t xml:space="preserve">spores have been reported to survive 1200 MPa at ambient temperature in laboratory equipment [1]. HPTP uses the adiabatic temperature rise (about 3 °C per 100 MPa in water-rich foods, more in fats) plus hold and decompression cooling so that time spent above 100 °C can be much shorter than a retort [14]. Commercial HPP machines usually do not supply that heat, so refrigerated distribution is the practical control on spore outgrowth [4].</w:t>
+      </w:r>
+    </w:p>
+    <w:p>
+      <w:pPr>
+        <w:pStyle w:val="BodyText"/>
+        <w:jc w:val="both"/>
+      </w:pPr>
+      <w:r>
+        <w:t xml:space="preserve">Those industrial limits come with kinetic parameters, not a new challenge trial [4]. Vegetative inactivation in juices is often first-order, with D-values at 350 MPa on the order of 0.6–2 min for some lactic acid bacteria and yeasts [4]. Spore curves in fruit products are often concave-up (Weibull or biphasic) with tails: as time increases, remaining spores look harder [1,4]. For</w:t>
       </w:r>
       <w:r>
         <w:t xml:space="preserve"> </w:t>
@@ -2453,7 +2453,7 @@
         <w:jc w:val="both"/>
       </w:pPr>
       <w:r>
-        <w:t xml:space="preserve">Honey is a warning about water activity. In undiluted honey (aw about 0.55–0.57), pressure-assisted thermal processing at 600 MPa / 15 min / 85 °C and heat alone at 85 °C / 15 min both failed to reduce inoculated</w:t>
+        <w:t xml:space="preserve">Water activity can erase even that synergy. In undiluted honey (aw about 0.55–0.57), pressure-assisted thermal processing at 600 MPa / 15 min / 85 °C and heat alone at 85 °C / 15 min both failed to reduce inoculated</w:t>
       </w:r>
       <w:r>
         <w:t xml:space="preserve"> </w:t>
@@ -3148,16 +3148,16 @@
         <w:jc w:val="both"/>
       </w:pPr>
       <w:r>
-        <w:t xml:space="preserve">PPO and peroxidase in celery juice fell after HPP and stayed low while microbial counts held for 8 weeks [27]. In grape juice, the same class of enzyme barely moved under HPP while heat and ohmic heating removed more than 90% of PPO [6]. Cloud-stable orange juice historically uses 90–99 °C for 15–30 s to hit thermostable pectin methylesterase; some pressure studies inactivate the heat-labile PME fraction at ≥500 MPa, with large residual variation by cultivar [4]. Enzyme and microbe are different targets.</w:t>
-      </w:r>
-    </w:p>
-    <w:p>
-      <w:pPr>
-        <w:pStyle w:val="BodyText"/>
-        <w:jc w:val="both"/>
-      </w:pPr>
-      <w:r>
-        <w:t xml:space="preserve">Proteins unfold under pressure because non-covalent bonds yield. A protein-source review reports lower allergenicity and higher digestibility/bioactivity for cereal, legume, and nut proteins after HHP, higher surface hydrophobicity for some seed and vegetable proteins, and mixed foaming/gelling/antioxidant shifts in dairy [29]. That is a functional-food story, not a Listeria story, and it is qualitative across methods. Holding IgG and lactoferrin is why some human-milk and bovine-milk arguments prefer HPP over Holder or high-temperature short-time, but Sykora’s four overlap papers are not enough to set a dual specification with the pathogen logs already shown for milk [24]. Donkey milk shows the trade in one factorial: 500 MPa maximised aerobic kill and maximised lactoferrin activity loss [7].</w:t>
+        <w:t xml:space="preserve">PPO and peroxidase in celery juice fell after HPP and stayed low while microbial counts held for 8 weeks [27]. In grape juice, the same class of enzyme barely moved under HPP while heat and ohmic heating removed more than 90% of PPO [6]. Cloud-stable orange juice historically uses 90–99 °C for 15–30 s to hit thermostable pectin methylesterase; some pressure studies inactivate the heat-labile PME fraction at ≥500 MPa, with large residual variation by cultivar [4]. Enzyme and microbe are different targets on the same cycle.</w:t>
+      </w:r>
+    </w:p>
+    <w:p>
+      <w:pPr>
+        <w:pStyle w:val="BodyText"/>
+        <w:jc w:val="both"/>
+      </w:pPr>
+      <w:r>
+        <w:t xml:space="preserve">Native milk proteins and plant allergens are another protein class, and they unfold under pressure because non-covalent bonds yield. A protein-source review reports lower allergenicity and higher digestibility/bioactivity for cereal, legume, and nut proteins after HHP, higher surface hydrophobicity for some seed and vegetable proteins, and mixed foaming/gelling/antioxidant shifts in dairy [29]. That is a functional-food story, not a Listeria story, and it is qualitative across methods. Holding IgG and lactoferrin is why some human-milk and bovine-milk arguments prefer HPP over Holder or high-temperature short-time, but Sykora’s four overlap papers are not enough to set a dual specification with the pathogen logs already shown for milk [24]. Donkey milk shows the trade in one factorial: 500 MPa maximised aerobic kill and maximised lactoferrin activity loss [7].</w:t>
       </w:r>
     </w:p>
     <w:bookmarkEnd w:id="38"/>
@@ -3271,7 +3271,16 @@
         <w:t xml:space="preserve"> </w:t>
       </w:r>
       <w:r>
-        <w:t xml:space="preserve">and hydrogen-sulphide producers [23]. Low-temperature high-pressure carbon dioxide at 6.5 MPa / 10 °C / 15 min inactivated 99.45% of</w:t>
+        <w:t xml:space="preserve">and hydrogen-sulphide producers [23].</w:t>
+      </w:r>
+    </w:p>
+    <w:p>
+      <w:pPr>
+        <w:pStyle w:val="BodyText"/>
+        <w:jc w:val="both"/>
+      </w:pPr>
+      <w:r>
+        <w:t xml:space="preserve">Surface geometry and formulation can cap even those storage gains. Low-temperature high-pressure carbon dioxide at 6.5 MPa / 10 °C / 15 min inactivated 99.45% of</w:t>
       </w:r>
       <w:r>
         <w:t xml:space="preserve"> </w:t>
@@ -3303,7 +3312,7 @@
         <w:t xml:space="preserve"> </w:t>
       </w:r>
       <w:r>
-        <w:t xml:space="preserve">on prawn), so surface topography limited a process that looked excellent in buffer [36]. Lamb burgers with lupin flour dropped coliforms and</w:t>
+        <w:t xml:space="preserve">on prawn), so topography limited a process that looked excellent in buffer [36]. Lamb burgers with lupin flour dropped coliforms and</w:t>
       </w:r>
       <w:r>
         <w:t xml:space="preserve"> </w:t>
@@ -3386,7 +3395,7 @@
         <w:jc w:val="both"/>
       </w:pPr>
       <w:r>
-        <w:t xml:space="preserve">The sonicator in apple juice is the clearest included example: dual-frequency excitation and a Venturi at reduced temperature reached a few log of spoilage flora and improved visual sedimentation, with a specific energy of 0.044 kWh/L at the best condition, and did not replace a 5-log pathogen pasteuriser [3]. Ultrasound reviews of mycotoxin and fungal decontamination quote high percentage degradations of aflatoxin B1 under long, high-intensity treatments that are not juice HACCP validations [40]. Sugarcane-juice comparisons of ultrasound, pulsed electric fields, HPP, and microfluidization versus heat treat HHP as the most used nonthermal option in that matrix [41].</w:t>
+        <w:t xml:space="preserve">Among those supporting technologies, the sonicator in apple juice is the clearest included example: dual-frequency excitation and a Venturi at reduced temperature reached a few log of spoilage flora and improved visual sedimentation, with a specific energy of 0.044 kWh/L at the best condition, and did not replace a 5-log pathogen pasteuriser [3]. Ultrasound reviews of mycotoxin and fungal decontamination quote high percentage degradations of aflatoxin B1 under long, high-intensity treatments that are not juice HACCP validations [40]. Sugarcane-juice comparisons of ultrasound, pulsed electric fields, HPP, and microfluidization versus heat treat HHP as the most used nonthermal option in that matrix [41].</w:t>
       </w:r>
     </w:p>
     <w:p>
@@ -3455,7 +3464,7 @@
         <w:jc w:val="both"/>
       </w:pPr>
       <w:r>
-        <w:t xml:space="preserve">Two readings of HPP can both be true. Commercially, 500–600 MPa for a few minutes is already a vegetative pasteurisation for refrigerated juices, guacamole-style herb pastes, and post-lethality RTE meats, and it avoids a second cook [4,5]. On the milk dossier the same window is not equivalent to legal pasteurisation on EFSA’s comparison: indicator enzymes do not transfer, and bioactive-protein preservation has not been co-validated with 5-log pathogen kill on enough shared batches [2,24]. Collapsing those readings into one</w:t>
+        <w:t xml:space="preserve">Two readings of HPP can both be true. Commercially, 500–600 MPa for a few minutes is already a vegetative pasteurisation for refrigerated juices, guacamole-style herb pastes, and post-lethality RTE meats, and it avoids a second cook [4,5]. On milk, the same window is not equivalent to legal pasteurisation on EFSA’s comparison: indicator enzymes do not transfer, and bioactive-protein preservation has not been co-validated with 5-log pathogen kill on enough shared batches [2,24]. Collapsing those readings into one</w:t>
       </w:r>
       <w:r>
         <w:t xml:space="preserve"> </w:t>
@@ -3633,7 +3642,7 @@
         <w:t xml:space="preserve"> </w:t>
       </w:r>
       <w:r>
-        <w:t xml:space="preserve">under HPP) and a paired bovine-milk HTST versus HPP trial with both pathogen and protein endpoints are not in this sample. Abstracts can disagree with results (donkey milk [7]). Several reviews recycle the same spore examples. Honey, kelp, crab, and cream are not one population. None of the included primary papers is a randomised trial of human foodborne disease. The plant-food kinetics review adds D-values and equipment limits; it does not add a new inoculation [4].</w:t>
+        <w:t xml:space="preserve">under HPP) and a paired bovine-milk HTST versus HPP trial with both pathogen and protein endpoints are not among the included full texts. Abstracts can disagree with results (donkey milk [7]). Several reviews recycle the same spore examples. Honey, kelp, crab, and cream are not one population. None of the included primary papers is a randomised trial of human foodborne disease. The plant-food kinetics review adds D-values and equipment limits; it does not add a new inoculation [4].</w:t>
       </w:r>
     </w:p>
     <w:p>

</xml_diff>

<commit_message>
Rewrite HPP mechanisms as connected cause-and-effect prose.
Teach the isostatic cycle, non-covalent membrane and protein damage, why
plants stay at refrigerated 600 MPa, freeze rupture, piezo-protection, VBNC
injury, adiabatic HPTP, and enzyme/protein trade-offs in long joined sentences
grounded in the included notes.

Co-authored-by: hvianagil-alt <hvianagil-alt@users.noreply.github.com>
</commit_message>
<xml_diff>
--- a/review/runs/2026-09-20-scopus-hpp/export/article.docx
+++ b/review/runs/2026-09-20-scopus-hpp/export/article.docx
@@ -176,25 +176,50 @@
         <w:jc w:val="both"/>
       </w:pPr>
       <w:r>
-        <w:t xml:space="preserve">Foodborne disease is still a volume problem. The World Health Organization figures recited in fruit-and-vegetable HPP reviews put hundreds of millions of illnesses and hundreds of thousands of deaths each year on contaminated food, with vegetative bacteria, spores, parasites, and viruses as the usual agents [1]. Thermal pasteurisation and sterilisation work because time–temperature combinations can be written into law: in the European Union, milk pasteurisation is at least 72 °C for 15 s or 63 °C for 30 min, with a 5 log10 performance criterion as the international reference for several milk pathogens [2]. Juice processors in the United States are told to achieve a 5-log reduction of the pertinent pathogen [3]. Those numbers are engineering specifications, not slogans. Heat meets them in most high-water-activity foods; it also cooks colour, volatiles, and whey proteins that some products are sold for.</w:t>
-      </w:r>
-    </w:p>
-    <w:p>
-      <w:pPr>
-        <w:pStyle w:val="BodyText"/>
-        <w:jc w:val="both"/>
-      </w:pPr>
-      <w:r>
-        <w:t xml:space="preserve">HPP, also called high hydrostatic pressure, is the industrial attempt to keep the specification and drop the cook. Packs sit in a water-filled vessel. Pressure, typically 300–600 MPa for seconds to minutes, is transmitted isostatically: Le Chatelier’s principle, a more compact molecular order, and uniform pressure independent of geometry are the textbook triad [1,4]. Membranes leak, proteins unfold, and replication enzymes fail. Gram-negative rods are often more sensitive than Gram-positive cocci; yeasts and moulds are often easier than bacteria; bacterial spores are harder than either [1,2,5]. Commercial vessels rarely exceed about 600 MPa without an added heat supply, so surviving spores are managed by refrigeration below 7 °C rather than by a retort-like sterility [4].</w:t>
-      </w:r>
-    </w:p>
-    <w:p>
-      <w:pPr>
-        <w:pStyle w:val="BodyText"/>
-        <w:jc w:val="both"/>
-      </w:pPr>
-      <w:r>
-        <w:t xml:space="preserve">The quality claim is that because the bulk temperature stays low, vitamins, colour, and</w:t>
+        <w:t xml:space="preserve">Foodborne disease is still a volume problem. The World Health Organization figures recited in fruit-and-vegetable HPP reviews put hundreds of millions of illnesses and hundreds of thousands of deaths each year on contaminated food, with vegetative bacteria, spores, parasites, and viruses as the usual agents [1]. Thermal pasteurisation and sterilisation work because time–temperature combinations can be written into law: in the European Union, milk pasteurisation is at least 72 °C for 15 s or 63 °C for 30 min, with a 5 log10 performance criterion as the international reference for several milk pathogens [2]. Juice processors in the United States are told to achieve a 5-log reduction of the pertinent pathogen [3]. Those numbers are engineering specifications rather than slogans, and heat meets them in most high-water-activity foods even while it cooks the colour, volatiles, and whey proteins that some products are sold for.</w:t>
+      </w:r>
+    </w:p>
+    <w:p>
+      <w:pPr>
+        <w:pStyle w:val="BodyText"/>
+        <w:jc w:val="both"/>
+      </w:pPr>
+      <w:r>
+        <w:t xml:space="preserve">HPP, also called high hydrostatic pressure, is the industrial attempt to keep that specification without the cook. The packed food is loaded into a water-filled vessel; more water is pumped in until the pack sits under isostatic pressure, typically 300–600 MPa for seconds to minutes; after the hold, the extra water is released and the baskets are unloaded [4]. Because pressure is transmitted rapidly and uniformly, every point in a juice pouch or a ham slice sees the same set-point at the same time, so piece size does not create a cold centre the way conduction heating does [2]. Milk had already been pressurised in 1899, yet commercial lines only appeared in the 1990s, once vessels and cycle times (about six minutes for a competitive 600 MPa hold by 2019) made a refrigerated cold-pasteurisation product economically plausible [4]. Processors use the method where a second heat cook would destroy the product they are selling; they do not use it as a drop-in sterilant, because HPP alone does not inactivate most microbial spores or many enzymes [4].</w:t>
+      </w:r>
+    </w:p>
+    <w:p>
+      <w:pPr>
+        <w:pStyle w:val="BodyText"/>
+        <w:jc w:val="both"/>
+      </w:pPr>
+      <w:r>
+        <w:t xml:space="preserve">The cells that die under that hold do so because non-covalent structure yields while covalent primary structure usually does not: lipid bilayers change phase and leak, ribosomal subunits can dissociate, and higher-order protein assemblies aggregate without the peptide chain being cleaved, which is why membranes, some enzymes, and some allergens move at pressures that leave the amino-acid sequence intact [5,6]. Vegetative inactivation is therefore not a single number read from the gauge. It depends at once on intrinsic food properties (water activity and pH), extrinsic settings (pressure and holding time, with a threshold below which little happens), and the organism (taxon, strain, and physiological state, so that stationary-phase cells are harder than exponential-phase cells) [1,2]. Gram-negative rods are often more sensitive than Gram-positive cocci, yeasts and moulds are often easier than bacteria, and bacterial spores are harder than either, although a given matrix can reorder that list [1,2,7]. Spores are the reason commercial vessels rarely exceed about 600 MPa without an added heat supply: some</w:t>
+      </w:r>
+      <w:r>
+        <w:t xml:space="preserve"> </w:t>
+      </w:r>
+      <w:r>
+        <w:rPr>
+          <w:iCs/>
+          <w:i/>
+        </w:rPr>
+        <w:t xml:space="preserve">Bacillus subtilis</w:t>
+      </w:r>
+      <w:r>
+        <w:t xml:space="preserve"> </w:t>
+      </w:r>
+      <w:r>
+        <w:t xml:space="preserve">spores have been reported to survive 1200 MPa at ambient temperature, and therefore surviving spores after a cold cycle are managed by refrigeration below 7 °C rather than by a retort-like sterility claim [1,4].</w:t>
+      </w:r>
+    </w:p>
+    <w:p>
+      <w:pPr>
+        <w:pStyle w:val="BodyText"/>
+        <w:jc w:val="both"/>
+      </w:pPr>
+      <w:r>
+        <w:t xml:space="preserve">The quality claim follows from the same physics. Because the bulk temperature stays low, Maillard browning and caramelisation are largely avoided, so vitamins, colour, and</w:t>
       </w:r>
       <w:r>
         <w:t xml:space="preserve"> </w:t>
@@ -212,7 +237,7 @@
         <w:t xml:space="preserve"> </w:t>
       </w:r>
       <w:r>
-        <w:t xml:space="preserve">flavour survive better than after a heat exchanger. That claim is product-specific. Polyphenol oxidase (PPO) in grape juice can remain largely active after a pressure cycle that already cuts aerobic counts [6]. Donkey-milk lysozyme and lactoferrin lose less activity at 400 MPa than at 75 °C, but 500 MPa starts to spend that advantage [7]. Brown kelp hardness falls by tens of percent as pressure rises from 200 to 600 MPa [8]. Ready-to-eat (RTE) cooked meats are a commercial HPP success story for</w:t>
+        <w:t xml:space="preserve">flavour can survive better than after a heat exchanger [5]. That claim is still product-specific, because enzymes and gels are different molecular targets from vegetative membranes. Polyphenol oxidase (PPO) in grape juice can remain largely active after a pressure cycle that already cuts aerobic counts [8]. Donkey-milk lysozyme and lactoferrin lose less activity at 400 MPa than at 75 °C, but 500 MPa starts to spend that advantage [9]. Brown kelp hardness falls by tens of percent as pressure rises from 200 to 600 MPa, after the same industrial window that is sold as gentle for juices [10]. Ready-to-eat (RTE) cooked meats are a commercial HPP success story for</w:t>
       </w:r>
       <w:r>
         <w:t xml:space="preserve"> </w:t>
@@ -225,16 +250,19 @@
         <w:t xml:space="preserve">Listeria monocytogenes</w:t>
       </w:r>
       <w:r>
-        <w:t xml:space="preserve">, yet reported log reductions at the same 500–600 MPa window still span 1–7 log colony-forming units per gram (CFU/g), and many trials used a single strain [5].</w:t>
-      </w:r>
-    </w:p>
-    <w:p>
-      <w:pPr>
-        <w:pStyle w:val="BodyText"/>
-        <w:jc w:val="both"/>
-      </w:pPr>
-      <w:r>
-        <w:t xml:space="preserve">Two regulatory questions sit under the commercial success. One is whether HPP milk is equivalent to legal thermal pasteurisation. The European Food Safety Authority (EFSA) biological hazards panel modelled industrial 600 MPa for 6 min and concluded that, for the milk pathogens that could be compared, HPP delivered fewer log10 reductions than the legal heat treatments [2]. Alkaline phosphatase, the heat-pasteurisation indicator, is relatively pressure-resistant and would at best flag overprocessing [2]. The other is whether juice HPP cycles that report a 5-log drop in aerobic plate count (APC) satisfy a named-pathogen HACCP plan. Several included juice papers never inoculated</w:t>
+        <w:t xml:space="preserve"> </w:t>
+      </w:r>
+      <w:r>
+        <w:t xml:space="preserve">precisely because a post-lethality pressure cycle can replace a second cook, yet reported log reductions at the same 500–600 MPa window still span 1–7 log colony-forming units per gram (CFU/g), and many trials used a single strain [7].</w:t>
+      </w:r>
+    </w:p>
+    <w:p>
+      <w:pPr>
+        <w:pStyle w:val="BodyText"/>
+        <w:jc w:val="both"/>
+      </w:pPr>
+      <w:r>
+        <w:t xml:space="preserve">Two regulatory questions sit under that commercial success, and both exist because a vegetative log is not the legal object. One is whether HPP milk is equivalent to legal thermal pasteurisation. The European Food Safety Authority (EFSA) biological hazards panel modelled industrial 600 MPa for 6 min and concluded that, for the milk pathogens that could be compared, HPP delivered fewer log10 reductions than the legal heat treatments, so the industrial cycle is not a substitute on that metric [2]. Alkaline phosphatase, the heat-pasteurisation indicator, is relatively pressure-resistant and would at best flag overprocessing, which is why a passing ALP test cannot verify an HPP milk line the way it verifies a heat exchanger [2]. The other is whether juice HPP cycles that report a 5-log drop in aerobic plate count (APC) satisfy a named-pathogen HACCP plan. Several included juice papers never inoculated</w:t>
       </w:r>
       <w:r>
         <w:t xml:space="preserve"> </w:t>
@@ -263,19 +291,64 @@
         <w:t xml:space="preserve">Salmonella</w:t>
       </w:r>
       <w:r>
-        <w:t xml:space="preserve"> </w:t>
-      </w:r>
-      <w:r>
-        <w:t xml:space="preserve">[3,9].</w:t>
-      </w:r>
-    </w:p>
-    <w:p>
-      <w:pPr>
-        <w:pStyle w:val="BodyText"/>
-        <w:jc w:val="both"/>
-      </w:pPr>
-      <w:r>
-        <w:t xml:space="preserve">A third, quieter problem is injury. Pressure can open membrane pores that later shrink [10], hide survivors on selective agar [11], and leave cells that grow back in storage [12,13]. A plate that is blank the afternoon of treatment can still hide injured cells that grow in a recovery broth or during chilled storage. Culture-negative immediately after treatment is not the same as dead. High-pressure thermal processing (HPTP) adds heat under pressure to finish spores, at the cost of the</w:t>
+        <w:t xml:space="preserve">, although the US rule is written for the pertinent pathogen rather than for background aerobes [3,11].</w:t>
+      </w:r>
+    </w:p>
+    <w:p>
+      <w:pPr>
+        <w:pStyle w:val="BodyText"/>
+        <w:jc w:val="both"/>
+      </w:pPr>
+      <w:r>
+        <w:t xml:space="preserve">A third, quieter problem is injury, which is why a blank plate the afternoon of treatment is not the same as death. After HPP, membrane pores can later shrink [12], survivors can hide on selective agar [13], and injured cells can grow back in storage [14,15]. Culture methods can therefore overestimate kill when viable but nonculturable cells remain: cited HPP work has shown an 8-log drop in culturable</w:t>
+      </w:r>
+      <w:r>
+        <w:t xml:space="preserve"> </w:t>
+      </w:r>
+      <w:r>
+        <w:rPr>
+          <w:iCs/>
+          <w:i/>
+        </w:rPr>
+        <w:t xml:space="preserve">L. monocytogenes</w:t>
+      </w:r>
+      <w:r>
+        <w:t xml:space="preserve"> </w:t>
+      </w:r>
+      <w:r>
+        <w:t xml:space="preserve">and</w:t>
+      </w:r>
+      <w:r>
+        <w:t xml:space="preserve"> </w:t>
+      </w:r>
+      <w:r>
+        <w:rPr>
+          <w:iCs/>
+          <w:i/>
+        </w:rPr>
+        <w:t xml:space="preserve">Salmonella</w:t>
+      </w:r>
+      <w:r>
+        <w:t xml:space="preserve"> </w:t>
+      </w:r>
+      <w:r>
+        <w:t xml:space="preserve">Typhimurium while about 4 log still stained as viable, and a &gt;7-log culture reduction of</w:t>
+      </w:r>
+      <w:r>
+        <w:t xml:space="preserve"> </w:t>
+      </w:r>
+      <w:r>
+        <w:rPr>
+          <w:iCs/>
+          <w:i/>
+        </w:rPr>
+        <w:t xml:space="preserve">S. Typhimurium</w:t>
+      </w:r>
+      <w:r>
+        <w:t xml:space="preserve"> </w:t>
+      </w:r>
+      <w:r>
+        <w:t xml:space="preserve">against a 0.72-log drop by propidium-iodide-excluding flow cytometry [5]. High-pressure thermal processing (HPTP) adds heat under pressure to finish spores, at the cost of the</w:t>
       </w:r>
       <w:r>
         <w:t xml:space="preserve"> </w:t>
@@ -293,7 +366,7 @@
         <w:t xml:space="preserve"> </w:t>
       </w:r>
       <w:r>
-        <w:t xml:space="preserve">label [4,14]. Hurdles (freezing before pressure, ultrasound, plasma-activated water, plant extracts) try to buy lethality without a full cook [12,15,16,17,18,19].</w:t>
+        <w:t xml:space="preserve">label, because adiabatic compression heating (about 3 °C per 100 MPa in water-rich foods, more in fats) plus decompression cooling can put the product above 100 °C for far less time than a retort [4,16]. Dedicated industrial HPTP lines were still not a retail reality in the included engineering review, which is why most commercial 600 MPa plants still sell a refrigerated vegetative hurdle rather than a shelf-stable spore cook [16]. Hurdles (freezing before pressure, ultrasound, plasma-activated water, plant extracts) try to buy extra vegetative lethality without that full cook [14,17,18,19,20,21].</w:t>
       </w:r>
     </w:p>
     <w:p>
@@ -393,7 +466,7 @@
         <w:jc w:val="both"/>
       </w:pPr>
       <w:r>
-        <w:t xml:space="preserve">Vegetative lethality under HPP is real and often large, but it is a family of outcomes, not one number on a gauge. The first coefficient that can turn a mild cycle into a large log is ice.</w:t>
+        <w:t xml:space="preserve">Vegetative lethality under HPP is real and often large, but it is a family of outcomes rather than one number on a gauge, because ice, solute, strain, and how the survivor is plated all change what a given megapascal appears to do. The first coefficient that can turn a mild cycle into a large log is ice, and it does so by changing the physics of the cell wall rather than by adding heat.</w:t>
       </w:r>
     </w:p>
     <w:bookmarkStart w:id="28" w:name="freezing-before-pressure"/>
@@ -428,7 +501,7 @@
         <w:t xml:space="preserve"> </w:t>
       </w:r>
       <w:r>
-        <w:t xml:space="preserve">K12 lost 1.83 log CFU·ml−1 after 400 MPa for 9 min at 4 °C when the sample had been held at 4 °C; the same pressure–time after freezing at −24 °C or −80 °C produced 5.63 and 6.83 log reductions, with scanning electron micrographs showing wall rupture only in the frozen, pressurised cells [16]. Orange juice at 250 MPa for 15 min stayed below 0.5 log kill at pH 4.5 and 5.8 unless it was frozen first, when reductions rose to about 4 log [16]. Ice polymorphs and cell rigidity change the physics enough to look like pasteurisation for a surrogate, so the process that delivered those extra logs is no longer HPP alone.</w:t>
+        <w:t xml:space="preserve">K12 lost 1.83 log CFU·ml−1 after 400 MPa for 9 min at 4 °C when the sample had been held at 4 °C, whereas the same pressure–time after freezing at −24 °C or −80 °C produced 5.63 and 6.83 log reductions, with scanning electron micrographs showing wall rupture only in the frozen, pressurised cells [18]. Orange juice at 250 MPa for 15 min stayed below 0.5 log kill at pH 4.5 and 5.8 unless it was frozen first, when reductions rose to about 4 log, so that after freezing the pH that had been doing most of the unfrozen work mattered less [18]. Freeze–thaw without pressure already leaked nucleic acids and killed about 1.5–1.7 log in PBS, but pressurising the frozen samples drove supernatant DNA/RNA much higher, and even a 1 s hold at 300 MPa killed 2.6–3.5 log in frozen PBS versus 0.01 log when unfrozen [18]. The extra logs therefore come after ice I is driven toward denser polymorphs (a volume drop near 315 MPa) while the wall is rigid, which is why a cycle that looks like pasteurisation for a surrogate is no longer HPP alone [18].</w:t>
       </w:r>
     </w:p>
     <w:bookmarkEnd w:id="28"/>
@@ -448,7 +521,93 @@
         <w:jc w:val="both"/>
       </w:pPr>
       <w:r>
-        <w:t xml:space="preserve">Even in unfrozen ham, an ingredient already in the recipe can do the same job.</w:t>
+        <w:t xml:space="preserve">Even in unfrozen ham, an ingredient already in the recipe can do the same job of changing the kill without changing the set-point. Processors add lactate because it is a flavour salt and a Listeria growth control, yet after 400 MPa that same solute reduces inactivation in a dose-dependent way: at 10 min, 1.4% lactate cut kill by 0.5–1.46 log versus the control depending on strain, and 2.8% lactate widened that gap, while pH and water activity did not change, so the protection is not a trivial aw artefact [22]. That is piezo-protection: the hurdle that makes the ham safer in the cold chain makes the later pressure cycle look weaker, which is why a validation that ignores formulation will over-predict kill. Curve shape stayed strain-specific (shoulder, near-linear, or tail), so a single-strain challenge cannot stand in for the product [22]. On RTE meats as a class, a scoping review of 74 studies found HPP in 29 of them. Below 400 MPa, inactivation was typically below 1 log even with long holds, because that window sits under the threshold where pressure starts to matter; at 500–600 MPa, reported reductions ran from 1 to 7 log CFU/g within about 5 min [7]. Thirty-one of 74 papers omitted standard deviations; 27 used a single strain; meta-analysis was judged impossible [7]. Table 1 therefore lists primary challenges as rows, not as a pooled mean.</w:t>
+      </w:r>
+    </w:p>
+    <w:bookmarkEnd w:id="29"/>
+    <w:bookmarkStart w:id="30" w:name="injury-that-the-plate-can-hide"/>
+    <w:p>
+      <w:pPr>
+        <w:pStyle w:val="Heading3"/>
+        <w:jc w:val="left"/>
+      </w:pPr>
+      <w:r>
+        <w:t xml:space="preserve">3.3 Injury that the plate can hide</w:t>
+      </w:r>
+    </w:p>
+    <w:p>
+      <w:pPr>
+        <w:pStyle w:val="FirstParagraph"/>
+        <w:jc w:val="both"/>
+      </w:pPr>
+      <w:r>
+        <w:t xml:space="preserve">Even when pressure and matrix are fixed, the plate can still invent a disagreement, because selective agar and immediate sampling miss cells that are damaged rather than dead. In fruit purées treated by HPP, inactivation looked 0.9- to 4.5-fold higher in apple than in banana–apple on matched organisms [13]. Immediate reductions on non-selective media in banana–apple were 0.3 log for</w:t>
+      </w:r>
+      <w:r>
+        <w:t xml:space="preserve"> </w:t>
+      </w:r>
+      <w:r>
+        <w:rPr>
+          <w:iCs/>
+          <w:i/>
+        </w:rPr>
+        <w:t xml:space="preserve">Listeria</w:t>
+      </w:r>
+      <w:r>
+        <w:t xml:space="preserve">, 1.4 log for</w:t>
+      </w:r>
+      <w:r>
+        <w:t xml:space="preserve"> </w:t>
+      </w:r>
+      <w:r>
+        <w:rPr>
+          <w:iCs/>
+          <w:i/>
+        </w:rPr>
+        <w:t xml:space="preserve">Salmonella</w:t>
+      </w:r>
+      <w:r>
+        <w:t xml:space="preserve">, and 0.9 log for</w:t>
+      </w:r>
+      <w:r>
+        <w:t xml:space="preserve"> </w:t>
+      </w:r>
+      <w:r>
+        <w:rPr>
+          <w:iCs/>
+          <w:i/>
+        </w:rPr>
+        <w:t xml:space="preserve">E. coli</w:t>
+      </w:r>
+      <w:r>
+        <w:t xml:space="preserve">; acid exposure and delayed sampling changed those numbers, so a paper that plates only on a selective Listeria agar the same afternoon as treatment is not measuring the same biological residual as one that recovers injured cells [13]. Reviews of</w:t>
+      </w:r>
+      <w:r>
+        <w:t xml:space="preserve"> </w:t>
+      </w:r>
+      <w:r>
+        <w:t xml:space="preserve">“</w:t>
+      </w:r>
+      <w:r>
+        <w:t xml:space="preserve">hidden hazardous risks</w:t>
+      </w:r>
+      <w:r>
+        <w:t xml:space="preserve">”</w:t>
+      </w:r>
+      <w:r>
+        <w:t xml:space="preserve"> </w:t>
+      </w:r>
+      <w:r>
+        <w:t xml:space="preserve">after nonthermal processing collect the same warning: culture reductions can coexist with injured survivors and later outgrowth, including viable but nonculturable cells that still stain as metabolically active [5].</w:t>
+      </w:r>
+    </w:p>
+    <w:p>
+      <w:pPr>
+        <w:pStyle w:val="BodyText"/>
+        <w:jc w:val="both"/>
+      </w:pPr>
+      <w:r>
+        <w:t xml:space="preserve">Membrane repair is not hypothetical, and it does not run on the same clock as colony formation. After 400 MPa,</w:t>
       </w:r>
       <w:r>
         <w:t xml:space="preserve"> </w:t>
@@ -464,118 +623,16 @@
         <w:t xml:space="preserve"> </w:t>
       </w:r>
       <w:r>
-        <w:t xml:space="preserve">is the usual test organism in foods that already contain Listeria controls. In cooked ham, lactate reduced HPP inactivation in a dose-dependent way: at 10 min, 1.4% lactate cut kill by 0.5–1.46 log versus the control depending on strain, and 2.8% lactate widened that gap [20]. That is piezo-protection: the same pressure, a more barotolerant phenotype because of an ingredient that is there for flavour and Listeria growth control. On RTE meats as a class, a scoping review of 74 studies found HPP in 29 of them. Below 400 MPa, inactivation was typically below 1 log even with long holds; at 500–600 MPa, reported reductions ran from 1 to 7 log CFU/g within about 5 min [5]. Thirty-one of 74 papers omitted standard deviations; 27 used a single strain; meta-analysis was judged impossible [5]. Table 1 therefore lists primary challenges as rows, not as a pooled mean.</w:t>
-      </w:r>
-    </w:p>
-    <w:bookmarkEnd w:id="29"/>
-    <w:bookmarkStart w:id="30" w:name="injury-that-the-plate-can-hide"/>
-    <w:p>
-      <w:pPr>
-        <w:pStyle w:val="Heading3"/>
-        <w:jc w:val="left"/>
-      </w:pPr>
-      <w:r>
-        <w:t xml:space="preserve">3.3 Injury that the plate can hide</w:t>
-      </w:r>
-    </w:p>
-    <w:p>
-      <w:pPr>
-        <w:pStyle w:val="FirstParagraph"/>
-        <w:jc w:val="both"/>
-      </w:pPr>
-      <w:r>
-        <w:t xml:space="preserve">Even when pressure and matrix are fixed, the plate can still invent a disagreement. In fruit purées treated by HPP, inactivation looked 0.9- to 4.5-fold higher in apple than in banana–apple on matched organisms [11]. Immediate reductions on non-selective media in banana–apple were 0.3 log for</w:t>
-      </w:r>
-      <w:r>
-        <w:t xml:space="preserve"> </w:t>
-      </w:r>
-      <w:r>
-        <w:rPr>
-          <w:iCs/>
-          <w:i/>
-        </w:rPr>
-        <w:t xml:space="preserve">Listeria</w:t>
-      </w:r>
-      <w:r>
-        <w:t xml:space="preserve">, 1.4 log for</w:t>
-      </w:r>
-      <w:r>
-        <w:t xml:space="preserve"> </w:t>
-      </w:r>
-      <w:r>
-        <w:rPr>
-          <w:iCs/>
-          <w:i/>
-        </w:rPr>
-        <w:t xml:space="preserve">Salmonella</w:t>
-      </w:r>
-      <w:r>
-        <w:t xml:space="preserve">, and 0.9 log for</w:t>
-      </w:r>
-      <w:r>
-        <w:t xml:space="preserve"> </w:t>
-      </w:r>
-      <w:r>
-        <w:rPr>
-          <w:iCs/>
-          <w:i/>
-        </w:rPr>
-        <w:t xml:space="preserve">E. coli</w:t>
-      </w:r>
-      <w:r>
-        <w:t xml:space="preserve">; acid exposure and delayed sampling changed those numbers [11]. A paper that plates only on a selective Listeria agar the same afternoon as treatment is not measuring the same biological residual as one that recovers injured cells. Reviews of</w:t>
-      </w:r>
-      <w:r>
-        <w:t xml:space="preserve"> </w:t>
-      </w:r>
-      <w:r>
-        <w:t xml:space="preserve">“</w:t>
-      </w:r>
-      <w:r>
-        <w:t xml:space="preserve">hidden hazardous risks</w:t>
-      </w:r>
-      <w:r>
-        <w:t xml:space="preserve">”</w:t>
-      </w:r>
-      <w:r>
-        <w:t xml:space="preserve"> </w:t>
-      </w:r>
-      <w:r>
-        <w:t xml:space="preserve">after nonthermal processing collect the same warning: culture reductions can coexist with injured survivors and later outgrowth [21].</w:t>
-      </w:r>
-    </w:p>
-    <w:p>
-      <w:pPr>
-        <w:pStyle w:val="BodyText"/>
-        <w:jc w:val="both"/>
-      </w:pPr>
-      <w:r>
-        <w:t xml:space="preserve">Membrane repair is not hypothetical. After HPP,</w:t>
-      </w:r>
-      <w:r>
-        <w:t xml:space="preserve"> </w:t>
-      </w:r>
-      <w:r>
-        <w:rPr>
-          <w:iCs/>
-          <w:i/>
-        </w:rPr>
-        <w:t xml:space="preserve">L. monocytogenes</w:t>
-      </w:r>
-      <w:r>
-        <w:t xml:space="preserve"> </w:t>
-      </w:r>
-      <w:r>
-        <w:t xml:space="preserve">pore radii estimated from a fluorescence diffusion model shrank from a mean 1.338 nm on day 0 to 0.809 nm on day 4 in the least-damaged cluster, while viable counts had already fallen 7.79 log CFU/ml to below the limit of quantification and stayed there in that experiment [10]. Injury and death can travel together; they should not be collapsed into one log number copied from a graph.</w:t>
-      </w:r>
-    </w:p>
-    <w:p>
-      <w:pPr>
-        <w:pStyle w:val="BodyText"/>
-        <w:jc w:val="both"/>
-      </w:pPr>
-      <w:r>
-        <w:t xml:space="preserve">Taken together, Table 1 supports a working rule: 500–600 MPa for a few minutes is the industrial vegetative window, and ice, lactate, fat, °Brix, agar, and strain cocktail are coefficients, not noise [2,5,11,16,20]. A 5-log pasteurisation claim cannot be read off that gauge. It has to be compared with a legal or HACCP number.</w:t>
+        <w:t xml:space="preserve">pore radii estimated from a fluorescence diffusion model shrank from a mean 1.338 nm on day 0 to 0.809 nm on day 4 in the least-damaged cluster, while viable counts had already fallen 7.79 log CFU/ml to below the limit of quantification and stayed there in that experiment, so resealing can occur after the plate has already gone blank [12]. Injury and death can travel together; they should not be collapsed into one log number copied from a graph.</w:t>
+      </w:r>
+    </w:p>
+    <w:p>
+      <w:pPr>
+        <w:pStyle w:val="BodyText"/>
+        <w:jc w:val="both"/>
+      </w:pPr>
+      <w:r>
+        <w:t xml:space="preserve">Taken together, Table 1 supports a working rule: 500–600 MPa for a few minutes is the industrial vegetative window, and ice, lactate, fat, °Brix, agar, and strain cocktail are coefficients, not noise [2,7,13,18,22]. A 5-log pasteurisation claim cannot be read off that gauge. It has to be compared with a legal or HACCP number.</w:t>
       </w:r>
     </w:p>
     <w:p>
@@ -685,7 +742,7 @@
               <w:jc w:val="left"/>
             </w:pPr>
             <w:r>
-              <w:t xml:space="preserve">Bulut 2021 [16]</w:t>
+              <w:t xml:space="preserve">Bulut 2021 [18]</w:t>
             </w:r>
           </w:p>
         </w:tc>
@@ -757,7 +814,7 @@
               <w:jc w:val="left"/>
             </w:pPr>
             <w:r>
-              <w:t xml:space="preserve">Bulut 2021 [16]</w:t>
+              <w:t xml:space="preserve">Bulut 2021 [18]</w:t>
             </w:r>
           </w:p>
         </w:tc>
@@ -829,7 +886,7 @@
               <w:jc w:val="left"/>
             </w:pPr>
             <w:r>
-              <w:t xml:space="preserve">Serra-Castelló 2021 [20]</w:t>
+              <w:t xml:space="preserve">Serra-Castelló 2021 [22]</w:t>
             </w:r>
           </w:p>
         </w:tc>
@@ -901,7 +958,7 @@
               <w:jc w:val="left"/>
             </w:pPr>
             <w:r>
-              <w:t xml:space="preserve">Torrents-Masoliver 2024 [11]</w:t>
+              <w:t xml:space="preserve">Torrents-Masoliver 2024 [13]</w:t>
             </w:r>
           </w:p>
         </w:tc>
@@ -999,7 +1056,7 @@
               <w:jc w:val="left"/>
             </w:pPr>
             <w:r>
-              <w:t xml:space="preserve">Rodríguez 2024 [15]</w:t>
+              <w:t xml:space="preserve">Rodríguez 2024 [17]</w:t>
             </w:r>
           </w:p>
         </w:tc>
@@ -1071,7 +1128,7 @@
               <w:jc w:val="left"/>
             </w:pPr>
             <w:r>
-              <w:t xml:space="preserve">Nikparvar 2021 [10]</w:t>
+              <w:t xml:space="preserve">Nikparvar 2021 [12]</w:t>
             </w:r>
           </w:p>
         </w:tc>
@@ -1137,7 +1194,7 @@
               <w:jc w:val="left"/>
             </w:pPr>
             <w:r>
-              <w:t xml:space="preserve">González-Cantillo 2026 [22]</w:t>
+              <w:t xml:space="preserve">González-Cantillo 2026 [23]</w:t>
             </w:r>
           </w:p>
         </w:tc>
@@ -1225,7 +1282,7 @@
               <w:jc w:val="left"/>
             </w:pPr>
             <w:r>
-              <w:t xml:space="preserve">Pimsannil 2025 [23]</w:t>
+              <w:t xml:space="preserve">Pimsannil 2025 [24]</w:t>
             </w:r>
           </w:p>
         </w:tc>
@@ -1297,7 +1354,7 @@
               <w:jc w:val="left"/>
             </w:pPr>
             <w:r>
-              <w:t xml:space="preserve">Guzel 2026 [5]</w:t>
+              <w:t xml:space="preserve">Guzel 2026 [7]</w:t>
             </w:r>
           </w:p>
         </w:tc>
@@ -1367,7 +1424,7 @@
         <w:jc w:val="both"/>
       </w:pPr>
       <w:r>
-        <w:t xml:space="preserve">Primary endpoints in Table 1 are summarised from the notes; recovery methods differ, so rows are not interchangeable [5,11].</w:t>
+        <w:t xml:space="preserve">Primary endpoints in Table 1 are summarised from the notes; recovery methods differ, so rows are not interchangeable [7,13].</w:t>
       </w:r>
     </w:p>
     <w:bookmarkEnd w:id="30"/>
@@ -1439,16 +1496,16 @@
         <w:t xml:space="preserve"> </w:t>
       </w:r>
       <w:r>
-        <w:t xml:space="preserve">is repeatedly the more resistant vegetative pathogen under pressure [2,24]. Alkaline phosphatase, the heat-pasteurisation indicator, does not verify HPP the way it verifies heat [2].</w:t>
-      </w:r>
-    </w:p>
-    <w:p>
-      <w:pPr>
-        <w:pStyle w:val="BodyText"/>
-        <w:jc w:val="both"/>
-      </w:pPr>
-      <w:r>
-        <w:t xml:space="preserve">A later systematic review of raw bovine milk asked the same equivalence question with a second endpoint. It found 65 papers with pathogen outcomes and 24 with bioactive proteins, but only four papers measured both [24]. Pressure was the strongest statistical contributor to log reductions for</w:t>
+        <w:t xml:space="preserve">is repeatedly the more resistant vegetative pathogen under pressure [2,25]. Alkaline phosphatase, the heat-pasteurisation indicator, does not verify HPP the way it verifies heat [2].</w:t>
+      </w:r>
+    </w:p>
+    <w:p>
+      <w:pPr>
+        <w:pStyle w:val="BodyText"/>
+        <w:jc w:val="both"/>
+      </w:pPr>
+      <w:r>
+        <w:t xml:space="preserve">A later systematic review of raw bovine milk asked the same equivalence question with a second endpoint. It found 65 papers with pathogen outcomes and 24 with bioactive proteins, but only four papers measured both [25]. Pressure was the strongest statistical contributor to log reductions for</w:t>
       </w:r>
       <w:r>
         <w:t xml:space="preserve"> </w:t>
@@ -1490,7 +1547,7 @@
         <w:t xml:space="preserve"> </w:t>
       </w:r>
       <w:r>
-        <w:t xml:space="preserve">[24]. For</w:t>
+        <w:t xml:space="preserve">[25]. For</w:t>
       </w:r>
       <w:r>
         <w:t xml:space="preserve"> </w:t>
@@ -1503,7 +1560,7 @@
         <w:t xml:space="preserve">L. monocytogenes</w:t>
       </w:r>
       <w:r>
-        <w:t xml:space="preserve">, treatments above 551 MPa still needed more than about 5 min at 20–30 °C to reach &gt;5 log in the papers that got there; come-up and come-down alone were not enough [24].</w:t>
+        <w:t xml:space="preserve">, treatments above 551 MPa still needed more than about 5 min at 20–30 °C to reach &gt;5 log in the papers that got there; come-up and come-down alone were not enough [25].</w:t>
       </w:r>
       <w:r>
         <w:t xml:space="preserve"> </w:t>
@@ -1535,7 +1592,7 @@
         <w:t xml:space="preserve"> </w:t>
       </w:r>
       <w:r>
-        <w:t xml:space="preserve">results used 60 °C and are no longer nonthermal [24]. A cycle mild enough to keep immunoglobulin G and lactoferrin is therefore not automatically a 5-log pathogen cycle, and the experiments that would show both on the same batch are scarce [24]. A paired high-temperature short-time versus HPP bovine-milk trial that reports both endpoints on the same batches is not among the included studies.</w:t>
+        <w:t xml:space="preserve">results used 60 °C and are no longer nonthermal [25]. A cycle mild enough to keep immunoglobulin G and lactoferrin is therefore not automatically a 5-log pathogen cycle, and the experiments that would show both on the same batch are scarce [25]. A paired high-temperature short-time versus HPP bovine-milk trial that reports both endpoints on the same batches is not among the included studies.</w:t>
       </w:r>
     </w:p>
     <w:p>
@@ -1562,7 +1619,7 @@
         <w:t xml:space="preserve"> </w:t>
       </w:r>
       <w:r>
-        <w:t xml:space="preserve">for microbial control [25] and ultrasound, pulsed electric fields, and supercritical carbon dioxide promising dairy tools [26]. Those sentences compile selected rows; they do not rebut the EFSA model. Table 2 marks the difference.</w:t>
+        <w:t xml:space="preserve">for microbial control [26] and ultrasound, pulsed electric fields, and supercritical carbon dioxide promising dairy tools [27]. Those sentences compile selected rows; they do not rebut the EFSA model. Table 2 marks the difference.</w:t>
       </w:r>
     </w:p>
     <w:p>
@@ -1589,7 +1646,7 @@
         <w:t xml:space="preserve"> </w:t>
       </w:r>
       <w:r>
-        <w:t xml:space="preserve">rather than the sufficiency slogan. In dairy cream, 450 MPa for 5 min left total aerobic psychrotrophs similar to raw immediately and spoilage (&gt;6 log) from day 18; 600 MPa slowed recovery but heat still produced a different trajectory [13]. In donkey milk, 200, 400, and 500 MPa cut total aerobic bacteria by 0.85, 1.58, and 4.04 log CFU ml−1, while 75 °C for 2 min cut 1.34 log with much larger lysozyme loss in the results section than in the abstract [7]. Read from the results section, 400 MPa is closer to a quality-preserving pasteurisation analogue than 500 MPa is, and neither is a pathogen challenge [7].</w:t>
+        <w:t xml:space="preserve">rather than the sufficiency slogan. In dairy cream, 450 MPa for 5 min left total aerobic psychrotrophs similar to raw immediately and spoilage (&gt;6 log) from day 18; 600 MPa slowed recovery but heat still produced a different trajectory [15]. In donkey milk, 200, 400, and 500 MPa cut total aerobic bacteria by 0.85, 1.58, and 4.04 log CFU ml−1, while 75 °C for 2 min cut 1.34 log with much larger lysozyme loss in the results section than in the abstract [9]. Read from the results section, 400 MPa is closer to a quality-preserving pasteurisation analogue than 500 MPa is, and neither is a pathogen challenge [9].</w:t>
       </w:r>
     </w:p>
     <w:bookmarkEnd w:id="32"/>
@@ -1609,7 +1666,7 @@
         <w:jc w:val="both"/>
       </w:pPr>
       <w:r>
-        <w:t xml:space="preserve">Juice processors face the same 5-log number, now written for a named pathogen rather than for heat-pasteurised milk, even though acid already suppresses many organisms. Whole Concord grape purée showed about 5-log reduction of fresh APC after both HPP and heat; yeasts and moulds were &lt;1.0 log CFU/g after HPP versus 1.22 after heat, and HPP held those groups down longer in four-month storage [9]. That is a 5-log APC result, not a named</w:t>
+        <w:t xml:space="preserve">Juice processors face the same 5-log number, now written for a named pathogen rather than for heat-pasteurised milk, even though acid already suppresses many organisms. Whole Concord grape purée showed about 5-log reduction of fresh APC after both HPP and heat; yeasts and moulds were &lt;1.0 log CFU/g after HPP versus 1.22 after heat, and HPP held those groups down longer in four-month storage [11]. That is a 5-log APC result, not a named</w:t>
       </w:r>
       <w:r>
         <w:t xml:space="preserve"> </w:t>
@@ -1625,7 +1682,7 @@
         <w:t xml:space="preserve"> </w:t>
       </w:r>
       <w:r>
-        <w:t xml:space="preserve">O157:H7 result. Celery juices after HPP kept total aerobic counts &lt;2 log CFU/ml for 8 weeks, with yeasts and moulds undetectable, while untreated juices spoiled in a week [27]. Semi-industrial red-globe grape juice lost about 3 log aerobic counts after HPP, ohmic heating, or thermal pasteurisation; PPO activity told a different story (HPP about 30% residual versus &gt;90% inactivation by ohmic and thermal) [6]. A flow-through dual-frequency sonicator at 50–55 °C reached &gt;3.6, 2.7, and 2.8 log reductions of yeast, mould, and aerobes in apple juice after 450 s efficient time and still missed a 5-log pathogen pasteurisation criterion; there was no isothermal heat-only arm [3]. None of the included juice papers reports an inoculated</w:t>
+        <w:t xml:space="preserve">O157:H7 result. Celery juices after HPP kept total aerobic counts &lt;2 log CFU/ml for 8 weeks, with yeasts and moulds undetectable, while untreated juices spoiled in a week [28]. Semi-industrial red-globe grape juice lost about 3 log aerobic counts after HPP, ohmic heating, or thermal pasteurisation; PPO activity told a different story (HPP about 30% residual versus &gt;90% inactivation by ohmic and thermal) [8]. A flow-through dual-frequency sonicator at 50–55 °C reached &gt;3.6, 2.7, and 2.8 log reductions of yeast, mould, and aerobes in apple juice after 450 s efficient time and still missed a 5-log pathogen pasteurisation criterion; there was no isothermal heat-only arm [3]. None of the included juice papers reports an inoculated</w:t>
       </w:r>
       <w:r>
         <w:t xml:space="preserve"> </w:t>
@@ -1850,7 +1907,7 @@
               <w:jc w:val="left"/>
             </w:pPr>
             <w:r>
-              <w:t xml:space="preserve">Sykora 2026 [24]</w:t>
+              <w:t xml:space="preserve">Sykora 2026 [25]</w:t>
             </w:r>
           </w:p>
         </w:tc>
@@ -1912,7 +1969,7 @@
               <w:jc w:val="left"/>
             </w:pPr>
             <w:r>
-              <w:t xml:space="preserve">Agriopoulou 2023 [25]</w:t>
+              <w:t xml:space="preserve">Agriopoulou 2023 [26]</w:t>
             </w:r>
           </w:p>
         </w:tc>
@@ -1986,7 +2043,7 @@
               <w:jc w:val="left"/>
             </w:pPr>
             <w:r>
-              <w:t xml:space="preserve">Machado 2023 [13]</w:t>
+              <w:t xml:space="preserve">Machado 2023 [15]</w:t>
             </w:r>
           </w:p>
         </w:tc>
@@ -2048,7 +2105,7 @@
               <w:jc w:val="left"/>
             </w:pPr>
             <w:r>
-              <w:t xml:space="preserve">Koker 2023 [7]</w:t>
+              <w:t xml:space="preserve">Koker 2023 [9]</w:t>
             </w:r>
           </w:p>
         </w:tc>
@@ -2110,7 +2167,7 @@
               <w:jc w:val="left"/>
             </w:pPr>
             <w:r>
-              <w:t xml:space="preserve">Li 2021 [9]</w:t>
+              <w:t xml:space="preserve">Li 2021 [11]</w:t>
             </w:r>
           </w:p>
         </w:tc>
@@ -2172,7 +2229,7 @@
               <w:jc w:val="left"/>
             </w:pPr>
             <w:r>
-              <w:t xml:space="preserve">Le 2023 [27]</w:t>
+              <w:t xml:space="preserve">Le 2023 [28]</w:t>
             </w:r>
           </w:p>
         </w:tc>
@@ -2234,7 +2291,7 @@
               <w:jc w:val="left"/>
             </w:pPr>
             <w:r>
-              <w:t xml:space="preserve">Eran Nagar 2026 [6]</w:t>
+              <w:t xml:space="preserve">Eran Nagar 2026 [8]</w:t>
             </w:r>
           </w:p>
         </w:tc>
@@ -2387,7 +2444,7 @@
         <w:jc w:val="both"/>
       </w:pPr>
       <w:r>
-        <w:t xml:space="preserve">Pressures below 600 MPa at room temperature struggle with bacterial spores; some</w:t>
+        <w:t xml:space="preserve">Pressures below 600 MPa at room temperature struggle with bacterial spores because the dormant core is dehydrated and baroprotective, and some</w:t>
       </w:r>
       <w:r>
         <w:t xml:space="preserve"> </w:t>
@@ -2403,16 +2460,16 @@
         <w:t xml:space="preserve"> </w:t>
       </w:r>
       <w:r>
-        <w:t xml:space="preserve">spores have been reported to survive 1200 MPa at ambient temperature in laboratory equipment [1]. HPTP uses the adiabatic temperature rise (about 3 °C per 100 MPa in water-rich foods, more in fats) plus hold and decompression cooling so that time spent above 100 °C can be much shorter than a retort [14]. Commercial HPP machines usually do not supply that heat, so refrigerated distribution is the practical control on spore outgrowth [4].</w:t>
-      </w:r>
-    </w:p>
-    <w:p>
-      <w:pPr>
-        <w:pStyle w:val="BodyText"/>
-        <w:jc w:val="both"/>
-      </w:pPr>
-      <w:r>
-        <w:t xml:space="preserve">Those industrial limits come with kinetic parameters, not a new challenge trial [4]. Vegetative inactivation in juices is often first-order, with D-values at 350 MPa on the order of 0.6–2 min for some lactic acid bacteria and yeasts [4]. Spore curves in fruit products are often concave-up (Weibull or biphasic) with tails: as time increases, remaining spores look harder [1,4]. For</w:t>
+        <w:t xml:space="preserve">spores have been reported to survive 1200 MPa at ambient temperature in laboratory equipment [1]. HPTP uses the adiabatic temperature rise (about 3 °C per 100 MPa in water-rich foods, more in fats: about 4.5–6.3 °C per 100 MPa in chicken and beef fat, and still higher in oils) plus hold and decompression cooling so that time spent above 100 °C can be much shorter than a retort, which is why a baby-food purée can be discussed as an F0 equivalent of minutes rather than a &gt;60 min cook [16]. Commercial HPP machines usually do not supply that heat, dedicated industrial HPTP vessels were still not a retail line in the included engineering review, and packaging must survive both 600 MPa and about 120 °C, so refrigerated distribution below 7 °C is the practical control on spore outgrowth after a cold 600 MPa cycle [4,16]. Processors therefore sell HPP as a vegetative refrigerated hurdle rather than as botulinum cook, not because the physics of HPTP is unknown, but because the equipment and packaging have not made that physics cheap.</w:t>
+      </w:r>
+    </w:p>
+    <w:p>
+      <w:pPr>
+        <w:pStyle w:val="BodyText"/>
+        <w:jc w:val="both"/>
+      </w:pPr>
+      <w:r>
+        <w:t xml:space="preserve">Those industrial limits come with kinetic parameters, not a new challenge trial [4]. Vegetative inactivation in juices is often first-order, with D-values at 350 MPa on the order of 0.6–2 min for some lactic acid bacteria and yeasts, because those cells are already pressure-sensitive in acid, high-aw matrices [4]. Spore curves in fruit products are often concave-up (Weibull or biphasic) with tails: as time increases, remaining spores look harder, which is why a single ambient-600 MPa log cannot be extrapolated to a 5–6 log pasteurisation target [1,4]. For</w:t>
       </w:r>
       <w:r>
         <w:t xml:space="preserve"> </w:t>
@@ -2428,7 +2485,7 @@
         <w:t xml:space="preserve"> </w:t>
       </w:r>
       <w:r>
-        <w:t xml:space="preserve">spores, a cited D-value at 600 MPa and 45 °C was 8.6 min in apple juice, 20 min in 20 °Brix lime concentrate, and 46 min in 30 °Brix blackcurrant concentrate [4]. Soluble solids protect spores the way fat and lactate protect vegetative cells.</w:t>
+        <w:t xml:space="preserve">spores, a cited D-value at 600 MPa and 45 °C was 8.6 min in apple juice, 20 min in 20 °Brix lime concentrate, and 46 min in 30 °Brix blackcurrant concentrate, so soluble solids protect spores the way fat and lactate protect vegetative cells [4].</w:t>
       </w:r>
       <w:r>
         <w:t xml:space="preserve"> </w:t>
@@ -2453,7 +2510,7 @@
         <w:jc w:val="both"/>
       </w:pPr>
       <w:r>
-        <w:t xml:space="preserve">Water activity can erase even that synergy. In undiluted honey (aw about 0.55–0.57), pressure-assisted thermal processing at 600 MPa / 15 min / 85 °C and heat alone at 85 °C / 15 min both failed to reduce inoculated</w:t>
+        <w:t xml:space="preserve">Water activity can erase even that synergy, because pressure needs a compressible aqueous phase in which to act. In undiluted honey (aw about 0.55–0.57), pressure-assisted thermal processing at 600 MPa / 15 min / 85 °C and heat alone at 85 °C / 15 min both failed to reduce inoculated</w:t>
       </w:r>
       <w:r>
         <w:t xml:space="preserve"> </w:t>
@@ -2469,7 +2526,7 @@
         <w:t xml:space="preserve"> </w:t>
       </w:r>
       <w:r>
-        <w:t xml:space="preserve">TEL spores, including after 24 h [28]. Diluting to aw 0.85 or 0.90 restored PATP lethality at 600 MPa / 15 min / 75 °C [28]. Low-aw foods can make</w:t>
+        <w:t xml:space="preserve">TEL spores, including after 24 h [29]. Diluting to aw 0.85 or 0.90 restored PATP lethality at 600 MPa / 15 min / 75 °C, whereas room-temperature 600 MPa still did not cut endospore loads [29]. Low-aw foods can therefore make</w:t>
       </w:r>
       <w:r>
         <w:t xml:space="preserve"> </w:t>
@@ -2487,7 +2544,7 @@
         <w:t xml:space="preserve"> </w:t>
       </w:r>
       <w:r>
-        <w:t xml:space="preserve">look like heat, which already failed.</w:t>
+        <w:t xml:space="preserve">look like heat, which already failed, which is why PATP of honey is discussed for diluted pharmaceutical preparations rather than as a way to pasteurise table honey without changing the product [29].</w:t>
       </w:r>
     </w:p>
     <w:bookmarkEnd w:id="35"/>
@@ -2507,7 +2564,7 @@
         <w:jc w:val="both"/>
       </w:pPr>
       <w:r>
-        <w:t xml:space="preserve">If even heat under pressure can fail when water activity is low, milder nonthermal partners cannot be sold as a spore cook. They are used to finish vegetative kill at milder set-points. A mini-review of HHP combinations in plant foods starts from pressure-resistant strains and storage regrowth after HHP alone, and treats nonthermal partners as process-design problems rather than as seasoning [12]. A hurdle review recites blueberry juice thermosonication plus 400 or 600 MPa / 5 min among combinations that let each factor run milder [19]. Ultrasound plus HPP eliminated detectable</w:t>
+        <w:t xml:space="preserve">If even heat under pressure can fail when water activity is low, milder nonthermal partners cannot be sold as a spore cook. They are used to finish vegetative kill at milder set-points. A mini-review of HHP combinations in plant foods starts from pressure-resistant strains and storage regrowth after HHP alone, and treats nonthermal partners as process-design problems rather than as seasoning [14]. A hurdle review recites blueberry juice thermosonication plus 400 or 600 MPa / 5 min among combinations that let each factor run milder [21]. Ultrasound plus HPP eliminated detectable</w:t>
       </w:r>
       <w:r>
         <w:t xml:space="preserve"> </w:t>
@@ -2523,7 +2580,7 @@
         <w:t xml:space="preserve"> </w:t>
       </w:r>
       <w:r>
-        <w:t xml:space="preserve">in buffer at conditions where 300 MPa / 10 min still left about 2 log [15]. Freeze-then-pressure did the same job for</w:t>
+        <w:t xml:space="preserve">in buffer at conditions where 300 MPa / 10 min still left about 2 log [17]. Freeze-then-pressure did the same job for</w:t>
       </w:r>
       <w:r>
         <w:t xml:space="preserve"> </w:t>
@@ -2539,7 +2596,7 @@
         <w:t xml:space="preserve"> </w:t>
       </w:r>
       <w:r>
-        <w:t xml:space="preserve">K12 [16]. None of those combinations is a spore sterility proof.</w:t>
+        <w:t xml:space="preserve">K12 [18]. None of those combinations is a spore sterility proof.</w:t>
       </w:r>
     </w:p>
     <w:p>
@@ -2771,7 +2828,7 @@
               <w:jc w:val="left"/>
             </w:pPr>
             <w:r>
-              <w:t xml:space="preserve">Scepankova 2022 [28]</w:t>
+              <w:t xml:space="preserve">Scepankova 2022 [29]</w:t>
             </w:r>
           </w:p>
         </w:tc>
@@ -2831,7 +2888,7 @@
               <w:jc w:val="left"/>
             </w:pPr>
             <w:r>
-              <w:t xml:space="preserve">Knoerzer 2025 [14]</w:t>
+              <w:t xml:space="preserve">Knoerzer 2025 [16]</w:t>
             </w:r>
           </w:p>
         </w:tc>
@@ -2881,7 +2938,7 @@
               <w:jc w:val="left"/>
             </w:pPr>
             <w:r>
-              <w:t xml:space="preserve">Xia 2022 [12]</w:t>
+              <w:t xml:space="preserve">Xia 2022 [14]</w:t>
             </w:r>
           </w:p>
         </w:tc>
@@ -2931,7 +2988,7 @@
               <w:jc w:val="left"/>
             </w:pPr>
             <w:r>
-              <w:t xml:space="preserve">Masilamani 2025 [19]</w:t>
+              <w:t xml:space="preserve">Masilamani 2025 [21]</w:t>
             </w:r>
           </w:p>
         </w:tc>
@@ -2981,7 +3038,7 @@
               <w:jc w:val="left"/>
             </w:pPr>
             <w:r>
-              <w:t xml:space="preserve">Rodríguez 2024 [15]</w:t>
+              <w:t xml:space="preserve">Rodríguez 2024 [17]</w:t>
             </w:r>
           </w:p>
         </w:tc>
@@ -3041,7 +3098,7 @@
               <w:jc w:val="left"/>
             </w:pPr>
             <w:r>
-              <w:t xml:space="preserve">Bulut 2021 [16]</w:t>
+              <w:t xml:space="preserve">Bulut 2021 [18]</w:t>
             </w:r>
           </w:p>
         </w:tc>
@@ -3148,16 +3205,32 @@
         <w:jc w:val="both"/>
       </w:pPr>
       <w:r>
-        <w:t xml:space="preserve">PPO and peroxidase in celery juice fell after HPP and stayed low while microbial counts held for 8 weeks [27]. In grape juice, the same class of enzyme barely moved under HPP while heat and ohmic heating removed more than 90% of PPO [6]. Cloud-stable orange juice historically uses 90–99 °C for 15–30 s to hit thermostable pectin methylesterase; some pressure studies inactivate the heat-labile PME fraction at ≥500 MPa, with large residual variation by cultivar [4]. Enzyme and microbe are different targets on the same cycle.</w:t>
-      </w:r>
-    </w:p>
-    <w:p>
-      <w:pPr>
-        <w:pStyle w:val="BodyText"/>
-        <w:jc w:val="both"/>
-      </w:pPr>
-      <w:r>
-        <w:t xml:space="preserve">Native milk proteins and plant allergens are another protein class, and they unfold under pressure because non-covalent bonds yield. A protein-source review reports lower allergenicity and higher digestibility/bioactivity for cereal, legume, and nut proteins after HHP, higher surface hydrophobicity for some seed and vegetable proteins, and mixed foaming/gelling/antioxidant shifts in dairy [29]. That is a functional-food story, not a Listeria story, and it is qualitative across methods. Holding IgG and lactoferrin is why some human-milk and bovine-milk arguments prefer HPP over Holder or high-temperature short-time, but Sykora’s four overlap papers are not enough to set a dual specification with the pathogen logs already shown for milk [24]. Donkey milk shows the trade in one factorial: 500 MPa maximised aerobic kill and maximised lactoferrin activity loss [7].</w:t>
+        <w:t xml:space="preserve">PPO and peroxidase in celery juice fell after HPP and stayed low while microbial counts held for 8 weeks [28]. In grape juice, the same class of enzyme barely moved under HPP while heat and ohmic heating removed more than 90% of PPO, so a cycle that already looks adequate on aerobic plates can leave the browning catalyst in place [8]. Cloud-stable orange juice historically uses 90–99 °C for 15–30 s to hit thermostable pectin methylesterase, because that fraction is the cloud-collapse enzyme; some pressure studies inactivate the heat-labile PME fraction at ≥500 MPa, with large residual variation by cultivar, which is why enzyme and microbe remain different targets on the same cycle [4].</w:t>
+      </w:r>
+    </w:p>
+    <w:p>
+      <w:pPr>
+        <w:pStyle w:val="BodyText"/>
+        <w:jc w:val="both"/>
+      </w:pPr>
+      <w:r>
+        <w:t xml:space="preserve">Native milk proteins and plant allergens are another protein class, and they unfold under pressure because non-covalent bonds yield and hydrophobic interiors become exposed [6]. A protein-source review reports lower allergenicity and higher digestibility/bioactivity for cereal, legume, and nut proteins after HHP, higher surface hydrophobicity for some seed and vegetable proteins, and mixed foaming/gelling/antioxidant shifts in dairy [6]. That is a functional-food story, not a Listeria story, and it is qualitative across methods. Holding IgG and lactoferrin is why some human-milk and bovine-milk arguments prefer HPP over Holder or high-temperature short-time: heat denatures those proteins more readily than a moderate pressure cycle does. Sykora’s four overlap papers are not enough to set a dual specification with the pathogen logs already shown for milk, because the cycle that keeps the protein is not automatically the cycle that delivers 5 log of</w:t>
+      </w:r>
+      <w:r>
+        <w:t xml:space="preserve"> </w:t>
+      </w:r>
+      <w:r>
+        <w:rPr>
+          <w:iCs/>
+          <w:i/>
+        </w:rPr>
+        <w:t xml:space="preserve">S. aureus</w:t>
+      </w:r>
+      <w:r>
+        <w:t xml:space="preserve"> </w:t>
+      </w:r>
+      <w:r>
+        <w:t xml:space="preserve">[25]. Donkey milk shows the trade in one factorial: 500 MPa maximised aerobic kill and maximised lactoferrin activity loss, so choosing the microbial maximum spent the quality claim that had justified avoiding 75 °C [9].</w:t>
       </w:r>
     </w:p>
     <w:bookmarkEnd w:id="38"/>
@@ -3193,7 +3266,7 @@
         <w:t xml:space="preserve"> </w:t>
       </w:r>
       <w:r>
-        <w:t xml:space="preserve">hardness fell from 312 g untreated to 38 g at 600 MPa (about 88% drop), with compression distance halved [8]. That kelp is not a ready-to-eat meat, but it is a reminder that 600 MPa is not gentle for every gel. Macroalgae-fortified sausages gained minerals and, immediately after HPP, total aerobic mesophiles &lt;1.0 log CFU/g in the fortified HPP batch [30]. Pumpkin pulp with a natural preservative plus HPP showed no microbial growth for 45 days, with better colour and firmness than a thermal comparator in the NBP formulations [31]. Minimally processed potatoes lost lightness and gained ΔE after HPP or HPP/ultrasound; Enterobacteriaceae became undetectable after HPP, while combined ultrasound did not stay different from untreated APC by day 14 [32]. Quality and kill can trade in either direction.</w:t>
+        <w:t xml:space="preserve">hardness fell from 312 g untreated to 38 g at 600 MPa (about 88% drop), with compression distance halved [10]. That kelp is not a ready-to-eat meat, but it is a reminder that 600 MPa is not gentle for every gel. Macroalgae-fortified sausages gained minerals and, immediately after HPP, total aerobic mesophiles &lt;1.0 log CFU/g in the fortified HPP batch [30]. Pumpkin pulp with a natural preservative plus HPP showed no microbial growth for 45 days, with better colour and firmness than a thermal comparator in the NBP formulations [31]. Minimally processed potatoes lost lightness and gained ΔE after HPP or HPP/ultrasound; Enterobacteriaceae became undetectable after HPP, while combined ultrasound did not stay different from untreated APC by day 14 [32]. Quality and kill can trade in either direction.</w:t>
       </w:r>
     </w:p>
     <w:bookmarkEnd w:id="39"/>
@@ -3271,7 +3344,7 @@
         <w:t xml:space="preserve"> </w:t>
       </w:r>
       <w:r>
-        <w:t xml:space="preserve">and hydrogen-sulphide producers [23].</w:t>
+        <w:t xml:space="preserve">and hydrogen-sulphide producers [24].</w:t>
       </w:r>
     </w:p>
     <w:p>
@@ -3328,7 +3401,7 @@
         <w:t xml:space="preserve"> </w:t>
       </w:r>
       <w:r>
-        <w:t xml:space="preserve">below 1 log whether a long hold or two short HHP cycles were used [22]. Sous-vide products after high hydrostatic pressure stayed below 1.30 log CFU/g on TSA through day 45 in one trial while controls exceeded 5 log [37]. An aquatic-food UHP review collects these patterns without a pooled shelf-life [38]. Ultrasound-assisted ultra-high pressure in a lactic fermentation changed antioxidant readings and sugar consumption at 24–40 h; that is process intensification of a ferment, not pasteurisation of a pathogen [39]. Marçal’s mineral-fortified sausages and Rossi Ribeiro’s pumpkin pulp show HPP as a shelf-life tool in formulated products where</w:t>
+        <w:t xml:space="preserve">below 1 log whether a long hold or two short HHP cycles were used [23]. Sous-vide products after high hydrostatic pressure stayed below 1.30 log CFU/g on TSA through day 45 in one trial while controls exceeded 5 log [37]. An aquatic-food UHP review collects these patterns without a pooled shelf-life [38]. Ultrasound-assisted ultra-high pressure in a lactic fermentation changed antioxidant readings and sugar consumption at 24–40 h; that is process intensification of a ferment, not pasteurisation of a pathogen [39]. Marçal’s mineral-fortified sausages and Rossi Ribeiro’s pumpkin pulp show HPP as a shelf-life tool in formulated products where</w:t>
       </w:r>
       <w:r>
         <w:t xml:space="preserve"> </w:t>
@@ -3355,7 +3428,7 @@
         <w:jc w:val="both"/>
       </w:pPr>
       <w:r>
-        <w:t xml:space="preserve">Taken together, HPP quality is sometimes better than heat (grape APC storage [9], donkey-milk enzymes at 400 MPa [7], avocado colour in commercial examples reviewed for plant foods [4]) and sometimes worse or simply different (kelp hardness [8], grape PPO [6], cream at 450 MPa [13]). Plate counts do not arbitrate those sentences, and they also do not license treating ultrasound, plasma, or irradiation as interchangeable with pressure.</w:t>
+        <w:t xml:space="preserve">Taken together, HPP quality is sometimes better than heat (grape APC storage [11], donkey-milk enzymes at 400 MPa [9], avocado colour in commercial examples reviewed for plant foods [4]) and sometimes worse or simply different (kelp hardness [10], grape PPO [8], cream at 450 MPa [15]). Plate counts do not arbitrate those sentences, and they also do not license treating ultrasound, plasma, or irradiation as interchangeable with pressure.</w:t>
       </w:r>
     </w:p>
     <w:bookmarkEnd w:id="40"/>
@@ -3404,7 +3477,7 @@
         <w:jc w:val="both"/>
       </w:pPr>
       <w:r>
-        <w:t xml:space="preserve">Plasma is a surface technology, so a log in buffer or on a fillet does not transfer to a wash line. Gliding-arc plasma for 5 min plus C-phycocyanin delayed rainbow trout total viable count crossing 6 log CFU/g from day 3 (control) to day 12, and kept total volatile nitrogen below 30 mg N/100 g through day 18, while untreated fillets did not [17]. Plasma-functionalised water on fresh-cut lettuce reached 4–5 log10 laboratory reductions in multi-step washing and about 2 log10 in a pilot scenario that resembled a factory wash [18]. Scale, not species, is the disagreement.</w:t>
+        <w:t xml:space="preserve">Plasma is a surface technology, so a log in buffer or on a fillet does not transfer to a wash line. Gliding-arc plasma for 5 min plus C-phycocyanin delayed rainbow trout total viable count crossing 6 log CFU/g from day 3 (control) to day 12, and kept total volatile nitrogen below 30 mg N/100 g through day 18, while untreated fillets did not [19]. Plasma-functionalised water on fresh-cut lettuce reached 4–5 log10 laboratory reductions in multi-step washing and about 2 log10 in a pilot scenario that resembled a factory wash [20]. Scale, not species, is the disagreement.</w:t>
       </w:r>
     </w:p>
     <w:p>
@@ -3434,16 +3507,16 @@
         <w:jc w:val="both"/>
       </w:pPr>
       <w:r>
-        <w:t xml:space="preserve">Broad matrix reviews rank HPP among options with typical vegetative reductions of 3–6 log10 and a high technology-readiness level, while insisting that no method is universal [43]. Beverage reviews argue that nonthermal methods can match thermal preservation with better nutrient retention, reciting a soy smoothie at 650 MPa / 20 °C / 3 min among examples [44]. Those sentences are maps. They do not override Tables 1–3. Weihe’s ranking of fields by typical log10 and readiness is useful for an engineer choosing a vessel; it is not a substitute for the milk opinion or the RTE-meat scoping range [2,5,43]. Jeevitha’s smoothie example sits at 650 MPa, which is already above many commercial 600 MPa ceilings discussed for plant foods [4,44]. Hashemi’s mycotoxin percentages come from long ultrasonic treatments that would not be confused with a 3-minute HPP juice cycle if the methods were read [3,40]. Mukhtar’s sugarcane ranking of HHP versus ohmic heating is matrix-bound [41]. Zhang’s ultrasound-assisted ultra-high pressure fermentation is a different unit operation again: antioxidants and sugar use in a lactic culture, not a pathogen specification [39]. Folding those rows into Tables 1–2 would mix unit operations that share a slogan more than a mechanism.</w:t>
-      </w:r>
-    </w:p>
-    <w:p>
-      <w:pPr>
-        <w:pStyle w:val="BodyText"/>
-        <w:jc w:val="both"/>
-      </w:pPr>
-      <w:r>
-        <w:t xml:space="preserve">The physical picture is still pressure for HPP, cavitation for the sonicator, reactive species for plasma, and photons or electrons for irradiation. A combined factory line can use more than one, but a review that averages their log reductions would hide the scale-up failures already visible for plasma water and the 5-log miss for reduced-temperature sonication [3,18].</w:t>
+        <w:t xml:space="preserve">Broad matrix reviews rank HPP among options with typical vegetative reductions of 3–6 log10 and a high technology-readiness level, while insisting that no method is universal [43]. Beverage reviews argue that nonthermal methods can match thermal preservation with better nutrient retention, reciting a soy smoothie at 650 MPa / 20 °C / 3 min among examples [44]. Those sentences are maps. They do not override Tables 1–3. Weihe’s ranking of fields by typical log10 and readiness is useful for an engineer choosing a vessel; it is not a substitute for the milk opinion or the RTE-meat scoping range [2,7,43]. Jeevitha’s smoothie example sits at 650 MPa, which is already above many commercial 600 MPa ceilings discussed for plant foods [4,44]. Hashemi’s mycotoxin percentages come from long ultrasonic treatments that would not be confused with a 3-minute HPP juice cycle if the methods were read [3,40]. Mukhtar’s sugarcane ranking of HHP versus ohmic heating is matrix-bound [41]. Zhang’s ultrasound-assisted ultra-high pressure fermentation is a different unit operation again: antioxidants and sugar use in a lactic culture, not a pathogen specification [39]. Folding those rows into Tables 1–2 would mix unit operations that share a slogan more than a mechanism.</w:t>
+      </w:r>
+    </w:p>
+    <w:p>
+      <w:pPr>
+        <w:pStyle w:val="BodyText"/>
+        <w:jc w:val="both"/>
+      </w:pPr>
+      <w:r>
+        <w:t xml:space="preserve">The physical picture is still pressure for HPP, cavitation for the sonicator, reactive species for plasma, and photons or electrons for irradiation. A combined factory line can use more than one, but a review that averages their log reductions would hide the scale-up failures already visible for plasma water and the 5-log miss for reduced-temperature sonication [3,20].</w:t>
       </w:r>
     </w:p>
     <w:bookmarkEnd w:id="42"/>
@@ -3464,7 +3537,23 @@
         <w:jc w:val="both"/>
       </w:pPr>
       <w:r>
-        <w:t xml:space="preserve">Two readings of HPP can both be true. Commercially, 500–600 MPa for a few minutes is already a vegetative pasteurisation for refrigerated juices, guacamole-style herb pastes, and post-lethality RTE meats, and it avoids a second cook [4,5]. On milk, the same window is not equivalent to legal pasteurisation on EFSA’s comparison: indicator enzymes do not transfer, and bioactive-protein preservation has not been co-validated with 5-log pathogen kill on enough shared batches [2,24]. Collapsing those readings into one</w:t>
+        <w:t xml:space="preserve">Two readings of HPP can both be true, and they stay true for mechanistic reasons rather than for marketing ones. Commercially, 500–600 MPa for a few minutes is already a vegetative pasteurisation for refrigerated juices, guacamole-style herb pastes, and post-lethality RTE meats, because those products need a Listeria or spoilage hurdle without a second cook, and because a cold chain is already part of the labelled life [4,7]. On milk, the same window is not equivalent to legal pasteurisation on EFSA’s comparison: indicator enzymes do not transfer,</w:t>
+      </w:r>
+      <w:r>
+        <w:t xml:space="preserve"> </w:t>
+      </w:r>
+      <w:r>
+        <w:rPr>
+          <w:iCs/>
+          <w:i/>
+        </w:rPr>
+        <w:t xml:space="preserve">S. aureus</w:t>
+      </w:r>
+      <w:r>
+        <w:t xml:space="preserve"> </w:t>
+      </w:r>
+      <w:r>
+        <w:t xml:space="preserve">is repeatedly the more resistant vegetative pathogen, and bioactive-protein preservation has not been co-validated with 5-log pathogen kill on enough shared batches [2,25]. Collapsing those readings into one</w:t>
       </w:r>
       <w:r>
         <w:t xml:space="preserve"> </w:t>
@@ -3491,7 +3580,7 @@
         <w:jc w:val="both"/>
       </w:pPr>
       <w:r>
-        <w:t xml:space="preserve">Guzel’s scoping review refused a meta-analysis because variance, D-values-only papers, and single-strain challenges broke the table [5]. Torrents-Masoliver showed that fruit and agar can multiply apparent kill [11]. Serra-Castelló showed that lactate, a normal ham ingredient, subtracts kill [20]. Wu collected injury as a systematic after-effect of nonthermal culture success [21]. Averaging 1 log and 7 log at</w:t>
+        <w:t xml:space="preserve">Guzel’s scoping review refused a meta-analysis because variance, D-values-only papers, and single-strain challenges broke the table [7]. Torrents-Masoliver showed that fruit and agar can multiply apparent kill [13]. Serra-Castelló showed that lactate, a normal ham ingredient, subtracts kill [22]. Wu collected injury as a systematic after-effect of nonthermal culture success [5]. Averaging 1 log and 7 log at</w:t>
       </w:r>
       <w:r>
         <w:t xml:space="preserve"> </w:t>
@@ -3518,16 +3607,16 @@
         <w:jc w:val="both"/>
       </w:pPr>
       <w:r>
-        <w:t xml:space="preserve">Quality claims need that same refusal to average unlike thermometers. PPO, lysozyme, kelp hardness, and APC do not move together. Eran Nagar’s grape juice is the exhibit: similar microbial drops, unlike enzyme drops, across HPP, ohmic, and thermal [6]. Braspaiboon’s allergenicity trends are a fifth thermometer still largely unconnected to the Listeria rows [29].</w:t>
-      </w:r>
-    </w:p>
-    <w:p>
-      <w:pPr>
-        <w:pStyle w:val="BodyText"/>
-        <w:jc w:val="both"/>
-      </w:pPr>
-      <w:r>
-        <w:t xml:space="preserve">Ultrasound, plasma, and irradiation are too thinly evidenced here to rank against HPP. Ultrasound missed 5-log in apple juice [3]. Plasma lost about 2–3 log moving from bench lettuce to pilot [18]. Irradiation evidence here is a mini-review [42]. High-pressure carbon dioxide looked strong in suspension and weaker on prawn [36]. Substituting</w:t>
+        <w:t xml:space="preserve">Quality claims need that same refusal to average unlike thermometers. PPO, lysozyme, kelp hardness, and APC do not move together. Eran Nagar’s grape juice is the exhibit: similar microbial drops, unlike enzyme drops, across HPP, ohmic, and thermal [8]. Braspaiboon’s allergenicity trends are a fifth thermometer still largely unconnected to the Listeria rows [6].</w:t>
+      </w:r>
+    </w:p>
+    <w:p>
+      <w:pPr>
+        <w:pStyle w:val="BodyText"/>
+        <w:jc w:val="both"/>
+      </w:pPr>
+      <w:r>
+        <w:t xml:space="preserve">Ultrasound, plasma, and irradiation are too thinly evidenced here to rank against HPP. Ultrasound missed 5-log in apple juice [3]. Plasma lost about 2–3 log moving from bench lettuce to pilot [20]. Irradiation evidence here is a mini-review [42]. High-pressure carbon dioxide looked strong in suspension and weaker on prawn [36]. Substituting</w:t>
       </w:r>
       <w:r>
         <w:t xml:space="preserve"> </w:t>
@@ -3572,7 +3661,7 @@
         <w:jc w:val="both"/>
       </w:pPr>
       <w:r>
-        <w:t xml:space="preserve">Even inside HPP, pH still splits the safety class. Low-acid vegetable juices (pH above 4.6) remain a botulinum problem if the cold chain fails; processors still have to show that the product cannot support growth and toxin within its labelled life [4]. Refrigeration after HPP is therefore not only a quality choice. It is the control that makes commercial 600 MPa cycles legal for soups and some vegetable juices that would otherwise need a full sterilisation mentality [4,14]. Fruit juices below pH 4.6 are kinder, but acid-tolerant</w:t>
+        <w:t xml:space="preserve">Even inside HPP, pH still splits the safety class. Low-acid vegetable juices (pH above 4.6) remain a botulinum problem if the cold chain fails; processors still have to show that the product cannot support growth and toxin within its labelled life [4]. Refrigeration after HPP is therefore not only a quality choice. It is the control that makes commercial 600 MPa cycles legal for soups and some vegetable juices that would otherwise need a full sterilisation mentality [4,16]. Fruit juices below pH 4.6 are kinder, but acid-tolerant</w:t>
       </w:r>
       <w:r>
         <w:t xml:space="preserve"> </w:t>
@@ -3604,7 +3693,7 @@
         <w:t xml:space="preserve"> </w:t>
       </w:r>
       <w:r>
-        <w:t xml:space="preserve">can survive for weeks at low pH with a low infectious dose, which is why a named-pathogen 5-log test is not optional [4]. The included grape and celery papers did not run that test [9,27].</w:t>
+        <w:t xml:space="preserve">can survive for weeks at low pH with a low infectious dose, which is why a named-pathogen 5-log test is not optional [4]. The included grape and celery papers did not run that test [11,28].</w:t>
       </w:r>
     </w:p>
     <w:p>
@@ -3642,7 +3731,7 @@
         <w:t xml:space="preserve"> </w:t>
       </w:r>
       <w:r>
-        <w:t xml:space="preserve">under HPP) and a paired bovine-milk HTST versus HPP trial with both pathogen and protein endpoints are not among the included full texts. Abstracts can disagree with results (donkey milk [7]). Several reviews recycle the same spore examples. Honey, kelp, crab, and cream are not one population. None of the included primary papers is a randomised trial of human foodborne disease. The plant-food kinetics review adds D-values and equipment limits; it does not add a new inoculation [4].</w:t>
+        <w:t xml:space="preserve">under HPP) and a paired bovine-milk HTST versus HPP trial with both pathogen and protein endpoints are not among the included full texts. Abstracts can disagree with results (donkey milk [9]). Several reviews recycle the same spore examples. Honey, kelp, crab, and cream are not one population. None of the included primary papers is a randomised trial of human foodborne disease. The plant-food kinetics review adds D-values and equipment limits; it does not add a new inoculation [4].</w:t>
       </w:r>
     </w:p>
     <w:p>
@@ -3696,7 +3785,7 @@
         <w:t xml:space="preserve"> </w:t>
       </w:r>
       <w:r>
-        <w:t xml:space="preserve">against the FDA 5-log criterion rather than APC. Spore work needs measured temperature under pressure, °Brix, and a Weibull or biphasic fit instead of a single ambient-600 MPa log. RTE meat challenges that use strain cocktails, report standard deviations, and treat lactate or fat as designed factors would make the 1–7 log window interpretable [5,20]. Plasma and ultrasound still need paired bench-versus-plant measurements, given the lettuce pilot drop [18] and the sonicator’s missing heat control [3].</w:t>
+        <w:t xml:space="preserve">against the FDA 5-log criterion rather than APC. Spore work needs measured temperature under pressure, °Brix, and a Weibull or biphasic fit instead of a single ambient-600 MPa log. RTE meat challenges that use strain cocktails, report standard deviations, and treat lactate or fat as designed factors would make the 1–7 log window interpretable [7,22]. Plasma and ultrasound still need paired bench-versus-plant measurements, given the lettuce pilot drop [20] and the sonicator’s missing heat control [3].</w:t>
       </w:r>
     </w:p>
     <w:bookmarkEnd w:id="44"/>
@@ -3716,16 +3805,16 @@
         <w:jc w:val="both"/>
       </w:pPr>
       <w:r>
-        <w:t xml:space="preserve">HPP reduces many vegetative bacteria in high-water-activity foods at 500–600 MPa, and that reduction is large enough, in the right matrix, to support refrigerated juices and post-lethality meats. The reduction is not a constant, and it is not a spore kill. A cycle that looks adequate on non-selective agar the same day may look weaker after acid recovery, in a high-lactate ham, or after a week of chilled storage [11,13,20].</w:t>
-      </w:r>
-    </w:p>
-    <w:p>
-      <w:pPr>
-        <w:pStyle w:val="BodyText"/>
-        <w:jc w:val="both"/>
-      </w:pPr>
-      <w:r>
-        <w:t xml:space="preserve">Legal milk pasteurisation is not interchangeable with 400–600 MPa on the included opinion: the industrial cycle underperforms heat on comparable log10 reductions [2]. A 5-log APC in grape purée is likewise not a juice pathogen validation [9]. Spore tails remain, so either HPTP or a cold chain has to be planned, with water activity as a designed factor [1,4,28]. Enzymes, bioactive proteins, and texture have to be measured on the same samples as microbes, because they do not covary [6,7,8]. Recovery methods and strain sets can move a log reduction as much as 100 MPa can, and they should be reported with the set-point [5,11]. Ultrasound, plasma, and irradiation stay in separate sentences until their included primary data are as dense as the HPP rows in Tables 1–3.</w:t>
+        <w:t xml:space="preserve">HPP reduces many vegetative bacteria in high-water-activity foods at 500–600 MPa, and that reduction is large enough, in the right matrix, to support refrigerated juices and post-lethality meats. The reduction is not a constant, and it is not a spore kill. A cycle that looks adequate on non-selective agar the same day may look weaker after acid recovery, in a high-lactate ham, or after a week of chilled storage [13,15,22].</w:t>
+      </w:r>
+    </w:p>
+    <w:p>
+      <w:pPr>
+        <w:pStyle w:val="BodyText"/>
+        <w:jc w:val="both"/>
+      </w:pPr>
+      <w:r>
+        <w:t xml:space="preserve">Legal milk pasteurisation is not interchangeable with 400–600 MPa on the included opinion: the industrial cycle underperforms heat on comparable log10 reductions [2]. A 5-log APC in grape purée is likewise not a juice pathogen validation [11]. Spore tails remain, so either HPTP or a cold chain has to be planned, with water activity as a designed factor [1,4,29]. Enzymes, bioactive proteins, and texture have to be measured on the same samples as microbes, because they do not covary [8,9,10]. Recovery methods and strain sets can move a log reduction as much as 100 MPa can, and they should be reported with the set-point [7,13]. Ultrasound, plasma, and irradiation stay in separate sentences until their included primary data are as dense as the HPP rows in Tables 1–3.</w:t>
       </w:r>
     </w:p>
     <w:bookmarkEnd w:id="45"/>
@@ -3781,223 +3870,223 @@
         <w:jc w:val="both"/>
       </w:pPr>
       <w:r>
-        <w:t xml:space="preserve">[5] Guzel et al. A scoping review of thermal and nonthermal technologies for Listeria monocytogenes inactivation in ready-to-eat meats. Compr Rev Food Sci Food Saf. 2026. doi:10.1111/1541-4337.70506</w:t>
-      </w:r>
-    </w:p>
-    <w:p>
-      <w:pPr>
-        <w:pStyle w:val="BodyText"/>
-        <w:jc w:val="both"/>
-      </w:pPr>
-      <w:r>
-        <w:t xml:space="preserve">[6] Eran Nagar E, et al. Comparative assessment of semi-industrial thermal and non-thermal pasteurization technologies for red globe grape juice. 2026.</w:t>
-      </w:r>
-    </w:p>
-    <w:p>
-      <w:pPr>
-        <w:pStyle w:val="BodyText"/>
-        <w:jc w:val="both"/>
-      </w:pPr>
-      <w:r>
-        <w:t xml:space="preserve">[7] Koker A, Ozturkoglu-Budak S, Alpas H. Effects of high hydrostatic pressure on antimicrobial protein stability and the rheological and shelf-life properties of donkey milk. J Dairy Res. 2023;90:292–298. doi:10.1017/S0022029923000572</w:t>
-      </w:r>
-    </w:p>
-    <w:p>
-      <w:pPr>
-        <w:pStyle w:val="BodyText"/>
-        <w:jc w:val="both"/>
-      </w:pPr>
-      <w:r>
-        <w:t xml:space="preserve">[8] Jönsson M, et al. Exploration of high-pressure processing (HPP) for preservation of the Swedish grown brown macroalgae Saccharina latissima. Front Food Sci Technol. 2023;3:1150482.</w:t>
-      </w:r>
-    </w:p>
-    <w:p>
-      <w:pPr>
-        <w:pStyle w:val="BodyText"/>
-        <w:jc w:val="both"/>
-      </w:pPr>
-      <w:r>
-        <w:t xml:space="preserve">[9] Li R, et al. High pressure processing vs. thermal pasteurization of whole Concord grape puree. 2021.</w:t>
-      </w:r>
-    </w:p>
-    <w:p>
-      <w:pPr>
-        <w:pStyle w:val="BodyText"/>
-        <w:jc w:val="both"/>
-      </w:pPr>
-      <w:r>
-        <w:t xml:space="preserve">[10] Nikparvar B, et al. A diffusion model to quantify membrane repair process in Listeria monocytogenes exposed to high pressure processing based on fluorescence microscopy data. Front Microbiol. 2021;12:598739. doi:10.3389/fmicb.2021.598739</w:t>
-      </w:r>
-    </w:p>
-    <w:p>
-      <w:pPr>
-        <w:pStyle w:val="BodyText"/>
-        <w:jc w:val="both"/>
-      </w:pPr>
-      <w:r>
-        <w:t xml:space="preserve">[11] Torrents-Masoliver B, et al. Enumeration agar, acid exposure and sampling time are relevant factors accounting for the high-pressure inactivation of pathogens in fruit purées. 2024.</w:t>
-      </w:r>
-    </w:p>
-    <w:p>
-      <w:pPr>
-        <w:pStyle w:val="BodyText"/>
-        <w:jc w:val="both"/>
-      </w:pPr>
-      <w:r>
-        <w:t xml:space="preserve">[12] Xia Q, Liu Q, Denoya GI, Yang C, Barba FJ, Yu H, Chen X. High hydrostatic pressure-based combination strategies for microbial inactivation of food products: the cases of emerging combination patterns. Front Nutr. 2022;9:878904. doi:10.3389/fnut.2022.878904</w:t>
-      </w:r>
-    </w:p>
-    <w:p>
-      <w:pPr>
-        <w:pStyle w:val="BodyText"/>
-        <w:jc w:val="both"/>
-      </w:pPr>
-      <w:r>
-        <w:t xml:space="preserve">[13] Machado F, et al. High pressure and pasteurization effects on dairy cream. 2023.</w:t>
-      </w:r>
-    </w:p>
-    <w:p>
-      <w:pPr>
-        <w:pStyle w:val="BodyText"/>
-        <w:jc w:val="both"/>
-      </w:pPr>
-      <w:r>
-        <w:t xml:space="preserve">[14] Knoerzer K, et al. From concept to commercialization: unlocking the potential of high-pressure thermal processing. Food Eng Rev. 2025;17:627. doi:10.1007/s12393-025-09414-9</w:t>
-      </w:r>
-    </w:p>
-    <w:p>
-      <w:pPr>
-        <w:pStyle w:val="BodyText"/>
-        <w:jc w:val="both"/>
-      </w:pPr>
-      <w:r>
-        <w:t xml:space="preserve">[15] Rodríguez A, et al. A mathematical model for the combination of power ultrasound and high-pressure processing in the inactivation of Cronobacter sakazakii. 2024.</w:t>
-      </w:r>
-    </w:p>
-    <w:p>
-      <w:pPr>
-        <w:pStyle w:val="BodyText"/>
-        <w:jc w:val="both"/>
-      </w:pPr>
-      <w:r>
-        <w:t xml:space="preserve">[16] Bulut S, Karatzas KAG. Inactivation of Escherichia coli K12 in phosphate buffer saline and orange juice by high hydrostatic pressure processing combined with freezing. LWT. 2021;136:110313. doi:10.1016/j.lwt.2020.110313</w:t>
-      </w:r>
-    </w:p>
-    <w:p>
-      <w:pPr>
-        <w:pStyle w:val="BodyText"/>
-        <w:jc w:val="both"/>
-      </w:pPr>
-      <w:r>
-        <w:t xml:space="preserve">[17] Seyedalangi M, Sari AH, Nowruzi B, Anvar SAA. Combined effects of gliding-arc plasma and C-phycocyanin on antioxidant activity and shelf-life extension of rainbow trout fillets. PLoS One. 2025;20:e0336896. doi:10.1371/journal.pone.0336896</w:t>
-      </w:r>
-    </w:p>
-    <w:p>
-      <w:pPr>
-        <w:pStyle w:val="BodyText"/>
-        <w:jc w:val="both"/>
-      </w:pPr>
-      <w:r>
-        <w:t xml:space="preserve">[18] Schnabel U, et al. Plasma-functionalized water: from bench to prototype for fresh-cut lettuce. Food Eng Rev. 2021;13:115. doi:10.1007/s12393-020-09238-9</w:t>
-      </w:r>
-    </w:p>
-    <w:p>
-      <w:pPr>
-        <w:pStyle w:val="BodyText"/>
-        <w:jc w:val="both"/>
-      </w:pPr>
-      <w:r>
-        <w:t xml:space="preserve">[19] Masilamani et al. Recent advances in nonthermal hurdle approach in the food sector. Qual Assur Saf Crops Foods. 2025;17(2):1515.</w:t>
-      </w:r>
-    </w:p>
-    <w:p>
-      <w:pPr>
-        <w:pStyle w:val="BodyText"/>
-        <w:jc w:val="both"/>
-      </w:pPr>
-      <w:r>
-        <w:t xml:space="preserve">[20] Serra-Castelló C, et al. Modelling the piezo-protection effect exerted by lactate on the high pressure resistance of Listeria monocytogenes in cooked ham. Food Res Int. 2021. doi:10.1016/j.foodres.2020.110003</w:t>
-      </w:r>
-    </w:p>
-    <w:p>
-      <w:pPr>
-        <w:pStyle w:val="BodyText"/>
-        <w:jc w:val="both"/>
-      </w:pPr>
-      <w:r>
-        <w:t xml:space="preserve">[21] Wu et al. The effect of non-thermal processing on the fate of pathogenic bacteria and hidden hazardous risks. 2025.</w:t>
-      </w:r>
-    </w:p>
-    <w:p>
-      <w:pPr>
-        <w:pStyle w:val="BodyText"/>
-        <w:jc w:val="both"/>
-      </w:pPr>
-      <w:r>
-        <w:t xml:space="preserve">[22] González-Cantillo N, et al. Application of high hydrostatic pressure (long holding time vs. two consecutive short cycles) for lamb burgers enriched with Lupinus albus flour. Foods. 2026;15:789.</w:t>
-      </w:r>
-    </w:p>
-    <w:p>
-      <w:pPr>
-        <w:pStyle w:val="BodyText"/>
-        <w:jc w:val="both"/>
-      </w:pPr>
-      <w:r>
-        <w:t xml:space="preserve">[23] Pimsannil R, et al. Edible portions of precooked blue swimming crab: chitooligosaccharide conjugate and high-pressure processing. 2025.</w:t>
-      </w:r>
-    </w:p>
-    <w:p>
-      <w:pPr>
-        <w:pStyle w:val="BodyText"/>
-        <w:jc w:val="both"/>
-      </w:pPr>
-      <w:r>
-        <w:t xml:space="preserve">[24] Sykora RM, Mark C, Biondi RM, Barman B, Pitino M, Dallas DC. Effect of high-pressure processing operating parameters on microbial inactivation and bioactive protein preservation in bovine milk: a systematic review. Compr Rev Food Sci Food Saf. 2025;25:e70324. doi:10.1111/1541-4337.70324</w:t>
-      </w:r>
-    </w:p>
-    <w:p>
-      <w:pPr>
-        <w:pStyle w:val="BodyText"/>
-        <w:jc w:val="both"/>
-      </w:pPr>
-      <w:r>
-        <w:t xml:space="preserve">[25] Agriopoulou S, Severoğlu M, Varzakas T, Özer HB. Recent advances in high pressure processing of milk and milk products — a review. J Agric Sci. 2023;29:1–12. doi:10.15832/ankutbd.1150112</w:t>
-      </w:r>
-    </w:p>
-    <w:p>
-      <w:pPr>
-        <w:pStyle w:val="BodyText"/>
-        <w:jc w:val="both"/>
-      </w:pPr>
-      <w:r>
-        <w:t xml:space="preserve">[26] Ledina T, Đorđević J, Kovandžić M, Bulajić S. Non-thermal technologies for milk and dairy processing. Meat Technol. 2023;64(2). doi:10.18485/meattech.2023.64.2.27</w:t>
-      </w:r>
-    </w:p>
-    <w:p>
-      <w:pPr>
-        <w:pStyle w:val="BodyText"/>
-        <w:jc w:val="both"/>
-      </w:pPr>
-      <w:r>
-        <w:t xml:space="preserve">[27] Le T, et al. Influence of high pressure processing on qualities of celery-based juices during refrigerated storage. Agric Nat Resour. 2023;57:399.</w:t>
-      </w:r>
-    </w:p>
-    <w:p>
-      <w:pPr>
-        <w:pStyle w:val="BodyText"/>
-        <w:jc w:val="both"/>
-      </w:pPr>
-      <w:r>
-        <w:t xml:space="preserve">[28] Scepankova H, et al. High-pressure-based strategies for the inactivation of Bacillus subtilis endospores in honey. Molecules. 2022;27:5918. doi:10.3390/molecules27185918</w:t>
-      </w:r>
-    </w:p>
-    <w:p>
-      <w:pPr>
-        <w:pStyle w:val="BodyText"/>
-        <w:jc w:val="both"/>
-      </w:pPr>
-      <w:r>
-        <w:t xml:space="preserve">[29] Braspaiboon S, Laokuldilok T. High hydrostatic pressure: influences on allergenicity, bioactivities, and structural and functional properties of proteins from diverse food sources. Foods. 2024;13:922. doi:10.3390/foods13060922</w:t>
+        <w:t xml:space="preserve">[5] Wu et al. The effect of non-thermal processing on the fate of pathogenic bacteria and hidden hazardous risks. 2025.</w:t>
+      </w:r>
+    </w:p>
+    <w:p>
+      <w:pPr>
+        <w:pStyle w:val="BodyText"/>
+        <w:jc w:val="both"/>
+      </w:pPr>
+      <w:r>
+        <w:t xml:space="preserve">[6] Braspaiboon S, Laokuldilok T. High hydrostatic pressure: influences on allergenicity, bioactivities, and structural and functional properties of proteins from diverse food sources. Foods. 2024;13:922. doi:10.3390/foods13060922</w:t>
+      </w:r>
+    </w:p>
+    <w:p>
+      <w:pPr>
+        <w:pStyle w:val="BodyText"/>
+        <w:jc w:val="both"/>
+      </w:pPr>
+      <w:r>
+        <w:t xml:space="preserve">[7] Guzel et al. A scoping review of thermal and nonthermal technologies for Listeria monocytogenes inactivation in ready-to-eat meats. Compr Rev Food Sci Food Saf. 2026. doi:10.1111/1541-4337.70506</w:t>
+      </w:r>
+    </w:p>
+    <w:p>
+      <w:pPr>
+        <w:pStyle w:val="BodyText"/>
+        <w:jc w:val="both"/>
+      </w:pPr>
+      <w:r>
+        <w:t xml:space="preserve">[8] Eran Nagar E, et al. Comparative assessment of semi-industrial thermal and non-thermal pasteurization technologies for red globe grape juice. 2026.</w:t>
+      </w:r>
+    </w:p>
+    <w:p>
+      <w:pPr>
+        <w:pStyle w:val="BodyText"/>
+        <w:jc w:val="both"/>
+      </w:pPr>
+      <w:r>
+        <w:t xml:space="preserve">[9] Koker A, Ozturkoglu-Budak S, Alpas H. Effects of high hydrostatic pressure on antimicrobial protein stability and the rheological and shelf-life properties of donkey milk. J Dairy Res. 2023;90:292–298. doi:10.1017/S0022029923000572</w:t>
+      </w:r>
+    </w:p>
+    <w:p>
+      <w:pPr>
+        <w:pStyle w:val="BodyText"/>
+        <w:jc w:val="both"/>
+      </w:pPr>
+      <w:r>
+        <w:t xml:space="preserve">[10] Jönsson M, et al. Exploration of high-pressure processing (HPP) for preservation of the Swedish grown brown macroalgae Saccharina latissima. Front Food Sci Technol. 2023;3:1150482.</w:t>
+      </w:r>
+    </w:p>
+    <w:p>
+      <w:pPr>
+        <w:pStyle w:val="BodyText"/>
+        <w:jc w:val="both"/>
+      </w:pPr>
+      <w:r>
+        <w:t xml:space="preserve">[11] Li R, et al. High pressure processing vs. thermal pasteurization of whole Concord grape puree. 2021.</w:t>
+      </w:r>
+    </w:p>
+    <w:p>
+      <w:pPr>
+        <w:pStyle w:val="BodyText"/>
+        <w:jc w:val="both"/>
+      </w:pPr>
+      <w:r>
+        <w:t xml:space="preserve">[12] Nikparvar B, et al. A diffusion model to quantify membrane repair process in Listeria monocytogenes exposed to high pressure processing based on fluorescence microscopy data. Front Microbiol. 2021;12:598739. doi:10.3389/fmicb.2021.598739</w:t>
+      </w:r>
+    </w:p>
+    <w:p>
+      <w:pPr>
+        <w:pStyle w:val="BodyText"/>
+        <w:jc w:val="both"/>
+      </w:pPr>
+      <w:r>
+        <w:t xml:space="preserve">[13] Torrents-Masoliver B, et al. Enumeration agar, acid exposure and sampling time are relevant factors accounting for the high-pressure inactivation of pathogens in fruit purées. 2024.</w:t>
+      </w:r>
+    </w:p>
+    <w:p>
+      <w:pPr>
+        <w:pStyle w:val="BodyText"/>
+        <w:jc w:val="both"/>
+      </w:pPr>
+      <w:r>
+        <w:t xml:space="preserve">[14] Xia Q, Liu Q, Denoya GI, Yang C, Barba FJ, Yu H, Chen X. High hydrostatic pressure-based combination strategies for microbial inactivation of food products: the cases of emerging combination patterns. Front Nutr. 2022;9:878904. doi:10.3389/fnut.2022.878904</w:t>
+      </w:r>
+    </w:p>
+    <w:p>
+      <w:pPr>
+        <w:pStyle w:val="BodyText"/>
+        <w:jc w:val="both"/>
+      </w:pPr>
+      <w:r>
+        <w:t xml:space="preserve">[15] Machado F, et al. High pressure and pasteurization effects on dairy cream. 2023.</w:t>
+      </w:r>
+    </w:p>
+    <w:p>
+      <w:pPr>
+        <w:pStyle w:val="BodyText"/>
+        <w:jc w:val="both"/>
+      </w:pPr>
+      <w:r>
+        <w:t xml:space="preserve">[16] Knoerzer K, et al. From concept to commercialization: unlocking the potential of high-pressure thermal processing. Food Eng Rev. 2025;17:627. doi:10.1007/s12393-025-09414-9</w:t>
+      </w:r>
+    </w:p>
+    <w:p>
+      <w:pPr>
+        <w:pStyle w:val="BodyText"/>
+        <w:jc w:val="both"/>
+      </w:pPr>
+      <w:r>
+        <w:t xml:space="preserve">[17] Rodríguez A, et al. A mathematical model for the combination of power ultrasound and high-pressure processing in the inactivation of Cronobacter sakazakii. 2024.</w:t>
+      </w:r>
+    </w:p>
+    <w:p>
+      <w:pPr>
+        <w:pStyle w:val="BodyText"/>
+        <w:jc w:val="both"/>
+      </w:pPr>
+      <w:r>
+        <w:t xml:space="preserve">[18] Bulut S, Karatzas KAG. Inactivation of Escherichia coli K12 in phosphate buffer saline and orange juice by high hydrostatic pressure processing combined with freezing. LWT. 2021;136:110313. doi:10.1016/j.lwt.2020.110313</w:t>
+      </w:r>
+    </w:p>
+    <w:p>
+      <w:pPr>
+        <w:pStyle w:val="BodyText"/>
+        <w:jc w:val="both"/>
+      </w:pPr>
+      <w:r>
+        <w:t xml:space="preserve">[19] Seyedalangi M, Sari AH, Nowruzi B, Anvar SAA. Combined effects of gliding-arc plasma and C-phycocyanin on antioxidant activity and shelf-life extension of rainbow trout fillets. PLoS One. 2025;20:e0336896. doi:10.1371/journal.pone.0336896</w:t>
+      </w:r>
+    </w:p>
+    <w:p>
+      <w:pPr>
+        <w:pStyle w:val="BodyText"/>
+        <w:jc w:val="both"/>
+      </w:pPr>
+      <w:r>
+        <w:t xml:space="preserve">[20] Schnabel U, et al. Plasma-functionalized water: from bench to prototype for fresh-cut lettuce. Food Eng Rev. 2021;13:115. doi:10.1007/s12393-020-09238-9</w:t>
+      </w:r>
+    </w:p>
+    <w:p>
+      <w:pPr>
+        <w:pStyle w:val="BodyText"/>
+        <w:jc w:val="both"/>
+      </w:pPr>
+      <w:r>
+        <w:t xml:space="preserve">[21] Masilamani et al. Recent advances in nonthermal hurdle approach in the food sector. Qual Assur Saf Crops Foods. 2025;17(2):1515.</w:t>
+      </w:r>
+    </w:p>
+    <w:p>
+      <w:pPr>
+        <w:pStyle w:val="BodyText"/>
+        <w:jc w:val="both"/>
+      </w:pPr>
+      <w:r>
+        <w:t xml:space="preserve">[22] Serra-Castelló C, et al. Modelling the piezo-protection effect exerted by lactate on the high pressure resistance of Listeria monocytogenes in cooked ham. Food Res Int. 2021. doi:10.1016/j.foodres.2020.110003</w:t>
+      </w:r>
+    </w:p>
+    <w:p>
+      <w:pPr>
+        <w:pStyle w:val="BodyText"/>
+        <w:jc w:val="both"/>
+      </w:pPr>
+      <w:r>
+        <w:t xml:space="preserve">[23] González-Cantillo N, et al. Application of high hydrostatic pressure (long holding time vs. two consecutive short cycles) for lamb burgers enriched with Lupinus albus flour. Foods. 2026;15:789.</w:t>
+      </w:r>
+    </w:p>
+    <w:p>
+      <w:pPr>
+        <w:pStyle w:val="BodyText"/>
+        <w:jc w:val="both"/>
+      </w:pPr>
+      <w:r>
+        <w:t xml:space="preserve">[24] Pimsannil R, et al. Edible portions of precooked blue swimming crab: chitooligosaccharide conjugate and high-pressure processing. 2025.</w:t>
+      </w:r>
+    </w:p>
+    <w:p>
+      <w:pPr>
+        <w:pStyle w:val="BodyText"/>
+        <w:jc w:val="both"/>
+      </w:pPr>
+      <w:r>
+        <w:t xml:space="preserve">[25] Sykora RM, Mark C, Biondi RM, Barman B, Pitino M, Dallas DC. Effect of high-pressure processing operating parameters on microbial inactivation and bioactive protein preservation in bovine milk: a systematic review. Compr Rev Food Sci Food Saf. 2025;25:e70324. doi:10.1111/1541-4337.70324</w:t>
+      </w:r>
+    </w:p>
+    <w:p>
+      <w:pPr>
+        <w:pStyle w:val="BodyText"/>
+        <w:jc w:val="both"/>
+      </w:pPr>
+      <w:r>
+        <w:t xml:space="preserve">[26] Agriopoulou S, Severoğlu M, Varzakas T, Özer HB. Recent advances in high pressure processing of milk and milk products — a review. J Agric Sci. 2023;29:1–12. doi:10.15832/ankutbd.1150112</w:t>
+      </w:r>
+    </w:p>
+    <w:p>
+      <w:pPr>
+        <w:pStyle w:val="BodyText"/>
+        <w:jc w:val="both"/>
+      </w:pPr>
+      <w:r>
+        <w:t xml:space="preserve">[27] Ledina T, Đorđević J, Kovandžić M, Bulajić S. Non-thermal technologies for milk and dairy processing. Meat Technol. 2023;64(2). doi:10.18485/meattech.2023.64.2.27</w:t>
+      </w:r>
+    </w:p>
+    <w:p>
+      <w:pPr>
+        <w:pStyle w:val="BodyText"/>
+        <w:jc w:val="both"/>
+      </w:pPr>
+      <w:r>
+        <w:t xml:space="preserve">[28] Le T, et al. Influence of high pressure processing on qualities of celery-based juices during refrigerated storage. Agric Nat Resour. 2023;57:399.</w:t>
+      </w:r>
+    </w:p>
+    <w:p>
+      <w:pPr>
+        <w:pStyle w:val="BodyText"/>
+        <w:jc w:val="both"/>
+      </w:pPr>
+      <w:r>
+        <w:t xml:space="preserve">[29] Scepankova H, et al. High-pressure-based strategies for the inactivation of Bacillus subtilis endospores in honey. Molecules. 2022;27:5918. doi:10.3390/molecules27185918</w:t>
       </w:r>
     </w:p>
     <w:p>

</xml_diff>

<commit_message>
Export the synthesised HPP review to HTML, Word, and PDF.
Co-authored-by: hvianagil-alt <hvianagil-alt@users.noreply.github.com>
</commit_message>
<xml_diff>
--- a/review/runs/2026-09-20-scopus-hpp/export/article.docx
+++ b/review/runs/2026-09-20-scopus-hpp/export/article.docx
@@ -176,25 +176,34 @@
         <w:jc w:val="both"/>
       </w:pPr>
       <w:r>
-        <w:t xml:space="preserve">Foodborne disease is still a volume problem. The World Health Organization figures recited in fruit-and-vegetable HPP reviews put hundreds of millions of illnesses and hundreds of thousands of deaths each year on contaminated food, with vegetative bacteria, spores, parasites, and viruses as the usual agents [1]. Thermal pasteurisation and sterilisation work because time–temperature combinations can be written into law: in the European Union, milk pasteurisation is at least 72 °C for 15 s or 63 °C for 30 min, with a 5 log10 performance criterion as the international reference for several milk pathogens [2]. Juice processors in the United States are told to achieve a 5-log reduction of the pertinent pathogen [3]. Those numbers are engineering specifications rather than slogans, and heat meets them in most high-water-activity foods even while it cooks the colour, volatiles, and whey proteins that some products are sold for.</w:t>
-      </w:r>
-    </w:p>
-    <w:p>
-      <w:pPr>
-        <w:pStyle w:val="BodyText"/>
-        <w:jc w:val="both"/>
-      </w:pPr>
-      <w:r>
-        <w:t xml:space="preserve">HPP, also called high hydrostatic pressure, is the industrial attempt to keep that specification without the cook. The packed food is loaded into a water-filled vessel; more water is pumped in until the pack sits under isostatic pressure, typically 300–600 MPa for seconds to minutes; after the hold, the extra water is released and the baskets are unloaded [4]. Because pressure is transmitted rapidly and uniformly, every point in a juice pouch or a ham slice sees the same set-point at the same time, so piece size does not create a cold centre the way conduction heating does [2]. Milk had already been pressurised in 1899, yet commercial lines only appeared in the 1990s, once vessels and cycle times (about six minutes for a competitive 600 MPa hold by 2019) made a refrigerated cold-pasteurisation product economically plausible [4]. Processors use the method where a second heat cook would destroy the product they are selling; they do not use it as a drop-in sterilant, because HPP alone does not inactivate most microbial spores or many enzymes [4].</w:t>
-      </w:r>
-    </w:p>
-    <w:p>
-      <w:pPr>
-        <w:pStyle w:val="BodyText"/>
-        <w:jc w:val="both"/>
-      </w:pPr>
-      <w:r>
-        <w:t xml:space="preserve">The cells that die under that hold do so because non-covalent structure yields while covalent primary structure usually does not: lipid bilayers change phase and leak, ribosomal subunits can dissociate, and higher-order protein assemblies aggregate without the peptide chain being cleaved, which is why membranes, some enzymes, and some allergens move at pressures that leave the amino-acid sequence intact [5,6]. Vegetative inactivation is therefore not a single number read from the gauge. It depends at once on intrinsic food properties (water activity and pH), extrinsic settings (pressure and holding time, with a threshold below which little happens), and the organism (taxon, strain, and physiological state, so that stationary-phase cells are harder than exponential-phase cells) [1,2]. Gram-negative rods are often more sensitive than Gram-positive cocci, yeasts and moulds are often easier than bacteria, and bacterial spores are harder than either, although a given matrix can reorder that list [1,2,7]. Spores are the reason commercial vessels rarely exceed about 600 MPa without an added heat supply: some</w:t>
+        <w:t xml:space="preserve">Foodborne illness remains a large-scale problem. Fruit-and-vegetable HPP reviews reciting World Health Organization figures attribute hundreds of millions of illnesses and hundreds of thousands of deaths each year to contaminated food, with vegetative bacteria, spores, parasites, and viruses as the usual agents [1]. Thermal pasteurisation and sterilisation remain the default controls because time–temperature combinations can be written into law. In the European Union, milk pasteurisation is at least 72 °C for 15 s or 63 °C for 30 min, with a 5 log10 performance criterion as the international reference for several milk pathogens [2]. Juice processors in the United States are told to achieve a 5-log reduction of the pertinent pathogen [3]. Heat meets those specifications in most high-water-activity foods. It also cooks colour, volatiles, and whey proteins that some products are sold for.</w:t>
+      </w:r>
+    </w:p>
+    <w:p>
+      <w:pPr>
+        <w:pStyle w:val="BodyText"/>
+        <w:jc w:val="both"/>
+      </w:pPr>
+      <w:r>
+        <w:t xml:space="preserve">HPP, also called high hydrostatic pressure, is the industrial attempt to keep that specification without the cook. The packed food is loaded into a water-filled vessel. More water is pumped in until the pack sits under isostatic pressure, typically 300–600 MPa for seconds to minutes. After the hold, the extra water is released and the baskets are unloaded [4]. Because pressure is transmitted rapidly and uniformly, every point in a juice pouch or a ham slice sees the same set-point at the same time. Piece size therefore does not create a cold centre the way conduction heating does [2]. Milk had already been pressurised in 1899, yet commercial lines only appeared in the 1990s, once vessels and cycle times (about six minutes for a competitive 600 MPa hold by 2019) made a refrigerated cold-pasteurisation product economically plausible [4]. Processors use the method where a second heat cook would destroy the product they are selling. They do not use it as a drop-in sterilant. HPP alone does not inactivate most microbial spores or many enzymes [4].</w:t>
+      </w:r>
+    </w:p>
+    <w:p>
+      <w:pPr>
+        <w:pStyle w:val="BodyText"/>
+        <w:jc w:val="both"/>
+      </w:pPr>
+      <w:r>
+        <w:t xml:space="preserve">The measured kill is not a constant read from the gauge. Included reviews compile membrane leakage, lipid-bilayer phase change, ribosomal subunit dissociation, and aggregation of higher-order protein structure without cleavage of the peptide chain as contributing routes under pressure [5,6]. Those routes are consistent with damage to non-covalent assemblies rather than to primary sequence. They are not a single primary experiment that proves one molecular cause for every log reduction.</w:t>
+      </w:r>
+    </w:p>
+    <w:p>
+      <w:pPr>
+        <w:pStyle w:val="BodyText"/>
+        <w:jc w:val="both"/>
+      </w:pPr>
+      <w:r>
+        <w:t xml:space="preserve">Vegetative inactivation still depends on intrinsic food properties (water activity and pH), extrinsic settings (pressure and holding time, with a threshold below which little happens), and the organism (taxon, strain, and physiological state, so that stationary-phase cells are harder than exponential-phase cells) [1,2]. Gram-negative rods are often more sensitive than Gram-positive cocci. Yeasts and moulds are often easier than bacteria. Bacterial spores are harder than either. A given matrix can reorder that list [1,2,7]. Some</w:t>
       </w:r>
       <w:r>
         <w:t xml:space="preserve"> </w:t>
@@ -210,7 +219,7 @@
         <w:t xml:space="preserve"> </w:t>
       </w:r>
       <w:r>
-        <w:t xml:space="preserve">spores have been reported to survive 1200 MPa at ambient temperature, and therefore surviving spores after a cold cycle are managed by refrigeration below 7 °C rather than by a retort-like sterility claim [1,4].</w:t>
+        <w:t xml:space="preserve">spores have been reported to survive 1200 MPa at ambient temperature [1]. Commercial vessels rarely exceed about 600 MPa without an added heat supply. Surviving spores after a cold cycle are therefore managed by refrigeration below 7 °C rather than by a retort-like sterility claim [1,4].</w:t>
       </w:r>
     </w:p>
     <w:p>
@@ -237,7 +246,16 @@
         <w:t xml:space="preserve"> </w:t>
       </w:r>
       <w:r>
-        <w:t xml:space="preserve">flavour can survive better than after a heat exchanger [5]. That claim is still product-specific, because enzymes and gels are different molecular targets from vegetative membranes. Polyphenol oxidase (PPO) in grape juice can remain largely active after a pressure cycle that already cuts aerobic counts [8]. Donkey-milk lysozyme and lactoferrin lose less activity at 400 MPa than at 75 °C, but 500 MPa starts to spend that advantage [9]. Brown kelp hardness falls by tens of percent as pressure rises from 200 to 600 MPa, after the same industrial window that is sold as gentle for juices [10]. Ready-to-eat (RTE) cooked meats are a commercial HPP success story for</w:t>
+        <w:t xml:space="preserve">flavour can survive better than after a heat exchanger [5]. That claim is still product-specific. Enzymes and gels are different molecular targets from vegetative membranes. Polyphenol oxidase (PPO) in grape juice can remain largely active after a pressure cycle that already cuts aerobic counts [8]. Donkey-milk lysozyme and lactoferrin lose less activity at 400 MPa than at 75 °C, but 500 MPa starts to spend that advantage [9]. Brown kelp hardness falls by tens of percent as pressure rises from 200 to 600 MPa, after the same industrial window that is sold as gentle for juices [10].</w:t>
+      </w:r>
+    </w:p>
+    <w:p>
+      <w:pPr>
+        <w:pStyle w:val="BodyText"/>
+        <w:jc w:val="both"/>
+      </w:pPr>
+      <w:r>
+        <w:t xml:space="preserve">Ready-to-eat (RTE) cooked meats are a commercial HPP success for</w:t>
       </w:r>
       <w:r>
         <w:t xml:space="preserve"> </w:t>
@@ -253,16 +271,25 @@
         <w:t xml:space="preserve"> </w:t>
       </w:r>
       <w:r>
-        <w:t xml:space="preserve">precisely because a post-lethality pressure cycle can replace a second cook, yet reported log reductions at the same 500–600 MPa window still span 1–7 log colony-forming units per gram (CFU/g), and many trials used a single strain [7].</w:t>
-      </w:r>
-    </w:p>
-    <w:p>
-      <w:pPr>
-        <w:pStyle w:val="BodyText"/>
-        <w:jc w:val="both"/>
-      </w:pPr>
-      <w:r>
-        <w:t xml:space="preserve">Two regulatory questions sit under that commercial success, and both exist because a vegetative log is not the legal object. One is whether HPP milk is equivalent to legal thermal pasteurisation. The European Food Safety Authority (EFSA) biological hazards panel modelled industrial 600 MPa for 6 min and concluded that, for the milk pathogens that could be compared, HPP delivered fewer log10 reductions than the legal heat treatments, so the industrial cycle is not a substitute on that metric [2]. Alkaline phosphatase, the heat-pasteurisation indicator, is relatively pressure-resistant and would at best flag overprocessing, which is why a passing ALP test cannot verify an HPP milk line the way it verifies a heat exchanger [2]. The other is whether juice HPP cycles that report a 5-log drop in aerobic plate count (APC) satisfy a named-pathogen HACCP plan. Several included juice papers never inoculated</w:t>
+        <w:t xml:space="preserve">because a post-lethality pressure cycle can replace a second cook. Reported log reductions at the same 500–600 MPa window still span 1–7 log colony-forming units per gram (CFU/g), and many trials used a single strain [7]. Commercial use therefore does not make the log a constant.</w:t>
+      </w:r>
+    </w:p>
+    <w:p>
+      <w:pPr>
+        <w:pStyle w:val="BodyText"/>
+        <w:jc w:val="both"/>
+      </w:pPr>
+      <w:r>
+        <w:t xml:space="preserve">Two regulatory questions sit under that commercial success, and both exist because a vegetative log is not the legal object. One is whether HPP milk is equivalent to legal thermal pasteurisation. The European Food Safety Authority (EFSA) biological hazards panel modelled industrial 600 MPa for 6 min and concluded that, for the milk pathogens that could be compared, HPP delivered fewer log10 reductions than the legal heat treatments [2]. The industrial cycle is not a substitute on that metric. Alkaline phosphatase, the heat-pasteurisation indicator, is relatively pressure-resistant and would at best flag overprocessing [2]. A passing alkaline phosphatase test cannot verify an HPP milk line the way it verifies a heat exchanger.</w:t>
+      </w:r>
+    </w:p>
+    <w:p>
+      <w:pPr>
+        <w:pStyle w:val="BodyText"/>
+        <w:jc w:val="both"/>
+      </w:pPr>
+      <w:r>
+        <w:t xml:space="preserve">The other question is whether juice HPP cycles that report a 5-log drop in aerobic plate count (APC) satisfy a named-pathogen HACCP plan. Several included juice papers never inoculated</w:t>
       </w:r>
       <w:r>
         <w:t xml:space="preserve"> </w:t>
@@ -300,7 +327,7 @@
         <w:jc w:val="both"/>
       </w:pPr>
       <w:r>
-        <w:t xml:space="preserve">A third, quieter problem is injury, which is why a blank plate the afternoon of treatment is not the same as death. After HPP, membrane pores can later shrink [12], survivors can hide on selective agar [13], and injured cells can grow back in storage [14,15]. Culture methods can therefore overestimate kill when viable but nonculturable cells remain: cited HPP work has shown an 8-log drop in culturable</w:t>
+        <w:t xml:space="preserve">A third problem is injury. A blank plate the afternoon of treatment is not the same as death. After HPP, membrane pores can later shrink [12], survivors can hide on selective agar [13], and injured cells can grow back in storage [14,15]. Culture methods can therefore overestimate kill when viable but nonculturable cells remain. Cited HPP work has shown an 8-log drop in culturable</w:t>
       </w:r>
       <w:r>
         <w:t xml:space="preserve"> </w:t>
@@ -348,7 +375,16 @@
         <w:t xml:space="preserve"> </w:t>
       </w:r>
       <w:r>
-        <w:t xml:space="preserve">against a 0.72-log drop by propidium-iodide-excluding flow cytometry [5]. High-pressure thermal processing (HPTP) adds heat under pressure to finish spores, at the cost of the</w:t>
+        <w:t xml:space="preserve">against a 0.72-log drop by propidium-iodide-excluding flow cytometry [5].</w:t>
+      </w:r>
+    </w:p>
+    <w:p>
+      <w:pPr>
+        <w:pStyle w:val="BodyText"/>
+        <w:jc w:val="both"/>
+      </w:pPr>
+      <w:r>
+        <w:t xml:space="preserve">High-pressure thermal processing (HPTP) adds heat under pressure to finish spores. That addition costs the</w:t>
       </w:r>
       <w:r>
         <w:t xml:space="preserve"> </w:t>
@@ -366,16 +402,16 @@
         <w:t xml:space="preserve"> </w:t>
       </w:r>
       <w:r>
-        <w:t xml:space="preserve">label, because adiabatic compression heating (about 3 °C per 100 MPa in water-rich foods, more in fats) plus decompression cooling can put the product above 100 °C for far less time than a retort [4,16]. Dedicated industrial HPTP lines were still not a retail reality in the included engineering review, which is why most commercial 600 MPa plants still sell a refrigerated vegetative hurdle rather than a shelf-stable spore cook [16]. Hurdles (freezing before pressure, ultrasound, plasma-activated water, plant extracts) try to buy extra vegetative lethality without that full cook [14,17,18,19,20,21].</w:t>
-      </w:r>
-    </w:p>
-    <w:p>
-      <w:pPr>
-        <w:pStyle w:val="BodyText"/>
-        <w:jc w:val="both"/>
-      </w:pPr>
-      <w:r>
-        <w:t xml:space="preserve">The aim of this review is to compare included studies on HPP and related nonthermal processes as microbial and quality technologies, and the central argument of this review is that pressure is a reliable vegetative hurdle whose log reduction cannot be read from the set-point alone, while quality preservation is an endpoint that must be named (enzyme, protein, texture, allergen) rather than assumed.</w:t>
+        <w:t xml:space="preserve">label. Adiabatic compression heating (about 3 °C per 100 MPa in water-rich foods, more in fats) plus decompression cooling can put the product above 100 °C for far less time than a retort [4,16]. Dedicated industrial HPTP lines were still not a retail reality in the included engineering review [16]. Most commercial 600 MPa plants therefore still sell a refrigerated vegetative hurdle rather than a shelf-stable spore cook. Hurdles (freezing before pressure, ultrasound, plasma-activated water, plant extracts) try to buy extra vegetative lethality without that full cook [14,17,18,19,20,21].</w:t>
+      </w:r>
+    </w:p>
+    <w:p>
+      <w:pPr>
+        <w:pStyle w:val="BodyText"/>
+        <w:jc w:val="both"/>
+      </w:pPr>
+      <w:r>
+        <w:t xml:space="preserve">The aim of this review is to compare included studies on HPP and related nonthermal processes as microbial and quality technologies. The central argument of this review is that pressure is a reliable vegetative hurdle whose log reduction cannot be read from the set-point alone, while quality preservation is an endpoint that must be named (enzyme, protein, texture, allergen) rather than assumed.</w:t>
       </w:r>
     </w:p>
     <w:bookmarkEnd w:id="23"/>
@@ -466,7 +502,7 @@
         <w:jc w:val="both"/>
       </w:pPr>
       <w:r>
-        <w:t xml:space="preserve">Vegetative lethality under HPP is real and often large, but it is a family of outcomes rather than one number on a gauge, because ice, solute, strain, and how the survivor is plated all change what a given megapascal appears to do. The first coefficient that can turn a mild cycle into a large log is ice, and it does so by changing the physics of the cell wall rather than by adding heat.</w:t>
+        <w:t xml:space="preserve">Vegetative lethality under HPP is often large, but the log reduction is a family of outcomes rather than one number on a gauge. Ice, solute, strain, and recovery medium change what a given megapascal appears to do. Ice is treated first because it changes the physics of the cell wall rather than adding a second unit operation in name only.</w:t>
       </w:r>
     </w:p>
     <w:bookmarkStart w:id="28" w:name="freezing-before-pressure"/>
@@ -485,7 +521,7 @@
         <w:jc w:val="both"/>
       </w:pPr>
       <w:r>
-        <w:t xml:space="preserve">In phosphate buffer,</w:t>
+        <w:t xml:space="preserve">Freezing before pressure can convert a mild cycle into a large reduction for a Gram-negative surrogate, but the extra kill is mechanical rather than a new legal pasteurisation process. In phosphate buffer,</w:t>
       </w:r>
       <w:r>
         <w:t xml:space="preserve"> </w:t>
@@ -501,7 +537,7 @@
         <w:t xml:space="preserve"> </w:t>
       </w:r>
       <w:r>
-        <w:t xml:space="preserve">K12 lost 1.83 log CFU·ml−1 after 400 MPa for 9 min at 4 °C when the sample had been held at 4 °C, whereas the same pressure–time after freezing at −24 °C or −80 °C produced 5.63 and 6.83 log reductions, with scanning electron micrographs showing wall rupture only in the frozen, pressurised cells [18]. Orange juice at 250 MPa for 15 min stayed below 0.5 log kill at pH 4.5 and 5.8 unless it was frozen first, when reductions rose to about 4 log, so that after freezing the pH that had been doing most of the unfrozen work mattered less [18]. Freeze–thaw without pressure already leaked nucleic acids and killed about 1.5–1.7 log in PBS, but pressurising the frozen samples drove supernatant DNA/RNA much higher, and even a 1 s hold at 300 MPa killed 2.6–3.5 log in frozen PBS versus 0.01 log when unfrozen [18]. The extra logs therefore come after ice I is driven toward denser polymorphs (a volume drop near 315 MPa) while the wall is rigid, which is why a cycle that looks like pasteurisation for a surrogate is no longer HPP alone [18].</w:t>
+        <w:t xml:space="preserve">K12 lost 1.83 log CFU·ml−1 after 400 MPa for 9 min at 4 °C when the sample had been held at 4 °C [18]. The same pressure–time after freezing at −24 °C or −80 °C produced 5.63 and 6.83 log reductions [18]. Scanning electron micrographs showed wall rupture only in the frozen, pressurised cells [18]. Orange juice at 250 MPa for 15 min stayed at or below 0.42 log kill at pH 4.5 and 5.8 unless it was frozen first, when reductions rose to about 4 log [18]. After freezing, pH mattered less than it had in the unfrozen juice. Freeze–thaw without pressure already leaked nucleic acids and killed about 1.5–1.7 log in PBS [18]. Pressurising the frozen samples drove supernatant DNA/RNA much higher [18]. A 1 s hold at 300 MPa killed 2.6–3.5 log in frozen PBS versus 0.01 log when unfrozen [18]. The authors attribute the extra logs to ice I being driven toward denser polymorphs (a volume drop near 315 MPa) while the wall is rigid [18]. That explanation is consistent with the SEM and leakage data. It was not mapped as a complete ice-phase diagram in the same paper. The process that delivered those extra logs is therefore freeze-then-pressure, not HPP alone.</w:t>
       </w:r>
     </w:p>
     <w:bookmarkEnd w:id="28"/>
@@ -521,18 +557,18 @@
         <w:jc w:val="both"/>
       </w:pPr>
       <w:r>
-        <w:t xml:space="preserve">Even in unfrozen ham, an ingredient already in the recipe can do the same job of changing the kill without changing the set-point. Processors add lactate because it is a flavour salt and a Listeria growth control, yet after 400 MPa that same solute reduces inactivation in a dose-dependent way: at 10 min, 1.4% lactate cut kill by 0.5–1.46 log versus the control depending on strain, and 2.8% lactate widened that gap, while pH and water activity did not change, so the protection is not a trivial aw artefact [22]. That is piezo-protection: the hurdle that makes the ham safer in the cold chain makes the later pressure cycle look weaker, which is why a validation that ignores formulation will over-predict kill. Curve shape stayed strain-specific (shoulder, near-linear, or tail), so a single-strain challenge cannot stand in for the product [22]. On RTE meats as a class, a scoping review of 74 studies found HPP in 29 of them. Below 400 MPa, inactivation was typically below 1 log even with long holds, because that window sits under the threshold where pressure starts to matter; at 500–600 MPa, reported reductions ran from 1 to 7 log CFU/g within about 5 min [7]. Thirty-one of 74 papers omitted standard deviations; 27 used a single strain; meta-analysis was judged impossible [7]. Table 1 therefore lists primary challenges as rows, not as a pooled mean.</w:t>
+        <w:t xml:space="preserve">An ingredient already in a cooked-ham recipe can change HPP kill without changing the set-point. Processors add lactate as a flavour salt and as a Listeria growth control. After 400 MPa, that same solute reduced inactivation in a dose-dependent way. At 10 min, 1.4% lactate cut kill by 0.5–1.46 log versus the control depending on strain, and 2.8% lactate widened that gap [22]. Product pH and water activity did not change, so the protection is not explained by a trivial aw drop in this matrix [22]. Curve shape stayed strain-specific (shoulder, near-linear, or tail) [22]. A single-strain challenge therefore cannot stand in for the product. On RTE meats as a class, a scoping review of 74 studies found HPP in 29 of them [7]. Below 400 MPa, inactivation was typically below 1 log even with long holds [7]. At 500–600 MPa, reported reductions ran from 1 to 7 log CFU/g within about 5 min [7]. Thirty-one of 74 papers omitted standard deviations; 27 used a single strain; meta-analysis was judged impossible [7]. Those rows are contextually comparable as a reported range. They are not interchangeable measurements of one Listeria log. Table 1 therefore lists primary challenges as rows, not as a pooled mean.</w:t>
       </w:r>
     </w:p>
     <w:bookmarkEnd w:id="29"/>
-    <w:bookmarkStart w:id="30" w:name="injury-that-the-plate-can-hide"/>
+    <w:bookmarkStart w:id="30" w:name="injury-that-culture-methods-miss"/>
     <w:p>
       <w:pPr>
         <w:pStyle w:val="Heading3"/>
         <w:jc w:val="left"/>
       </w:pPr>
       <w:r>
-        <w:t xml:space="preserve">3.3 Injury that the plate can hide</w:t>
+        <w:t xml:space="preserve">3.3 Injury that culture methods miss</w:t>
       </w:r>
     </w:p>
     <w:p>
@@ -541,7 +577,7 @@
         <w:jc w:val="both"/>
       </w:pPr>
       <w:r>
-        <w:t xml:space="preserve">Even when pressure and matrix are fixed, the plate can still invent a disagreement, because selective agar and immediate sampling miss cells that are damaged rather than dead. In fruit purées treated by HPP, inactivation looked 0.9- to 4.5-fold higher in apple than in banana–apple on matched organisms [13]. Immediate reductions on non-selective media in banana–apple were 0.3 log for</w:t>
+        <w:t xml:space="preserve">Apparent inactivation also depends on how survivors are recovered. Selective agar and immediate sampling miss cells that are damaged rather than unable to form colonies later. In fruit purées treated by HPP, inactivation looked 0.9- to 4.5-fold higher in apple than in banana–apple on matched organisms [13]. Immediate reductions on non-selective media in banana–apple were 0.3 log for</w:t>
       </w:r>
       <w:r>
         <w:t xml:space="preserve"> </w:t>
@@ -580,34 +616,19 @@
         <w:t xml:space="preserve">E. coli</w:t>
       </w:r>
       <w:r>
-        <w:t xml:space="preserve">; acid exposure and delayed sampling changed those numbers, so a paper that plates only on a selective Listeria agar the same afternoon as treatment is not measuring the same biological residual as one that recovers injured cells [13]. Reviews of</w:t>
-      </w:r>
-      <w:r>
-        <w:t xml:space="preserve"> </w:t>
-      </w:r>
-      <w:r>
-        <w:t xml:space="preserve">“</w:t>
-      </w:r>
-      <w:r>
-        <w:t xml:space="preserve">hidden hazardous risks</w:t>
-      </w:r>
-      <w:r>
-        <w:t xml:space="preserve">”</w:t>
-      </w:r>
-      <w:r>
-        <w:t xml:space="preserve"> </w:t>
-      </w:r>
-      <w:r>
-        <w:t xml:space="preserve">after nonthermal processing collect the same warning: culture reductions can coexist with injured survivors and later outgrowth, including viable but nonculturable cells that still stain as metabolically active [5].</w:t>
-      </w:r>
-    </w:p>
-    <w:p>
-      <w:pPr>
-        <w:pStyle w:val="BodyText"/>
-        <w:jc w:val="both"/>
-      </w:pPr>
-      <w:r>
-        <w:t xml:space="preserve">Membrane repair is not hypothetical, and it does not run on the same clock as colony formation. After 400 MPa,</w:t>
+        <w:t xml:space="preserve"> </w:t>
+      </w:r>
+      <w:r>
+        <w:t xml:space="preserve">[13]. Acid exposure and delayed sampling changed those numbers [13]. A paper that plates only on a selective Listeria agar the same afternoon as treatment is not measuring the same residual as one that recovers injured cells. Narrative reviews of nonthermal processing collect the same warning: culture reductions can coexist with injured survivors, later outgrowth, and viable but nonculturable cells that still stain as metabolically active [5]. No colony on a selective plate is therefore not automatically death.</w:t>
+      </w:r>
+    </w:p>
+    <w:p>
+      <w:pPr>
+        <w:pStyle w:val="BodyText"/>
+        <w:jc w:val="both"/>
+      </w:pPr>
+      <w:r>
+        <w:t xml:space="preserve">Membrane repair can occur on a different clock from colony formation. After 400 MPa,</w:t>
       </w:r>
       <w:r>
         <w:t xml:space="preserve"> </w:t>
@@ -623,16 +644,16 @@
         <w:t xml:space="preserve"> </w:t>
       </w:r>
       <w:r>
-        <w:t xml:space="preserve">pore radii estimated from a fluorescence diffusion model shrank from a mean 1.338 nm on day 0 to 0.809 nm on day 4 in the least-damaged cluster, while viable counts had already fallen 7.79 log CFU/ml to below the limit of quantification and stayed there in that experiment, so resealing can occur after the plate has already gone blank [12]. Injury and death can travel together; they should not be collapsed into one log number copied from a graph.</w:t>
-      </w:r>
-    </w:p>
-    <w:p>
-      <w:pPr>
-        <w:pStyle w:val="BodyText"/>
-        <w:jc w:val="both"/>
-      </w:pPr>
-      <w:r>
-        <w:t xml:space="preserve">Taken together, Table 1 supports a working rule: 500–600 MPa for a few minutes is the industrial vegetative window, and ice, lactate, fat, °Brix, agar, and strain cocktail are coefficients, not noise [2,7,13,18,22]. A 5-log pasteurisation claim cannot be read off that gauge. It has to be compared with a legal or HACCP number.</w:t>
+        <w:t xml:space="preserve">pore radii estimated from a fluorescence diffusion model shrank from a mean 1.338 nm on day 0 to 0.809 nm on day 4 in the least-damaged cluster [12]. Viable counts had already fallen 7.79 log CFU/ml to below the limit of quantification and stayed there in that experiment [12]. Injury and death can travel together. They should not be collapsed into one log number copied from a graph.</w:t>
+      </w:r>
+    </w:p>
+    <w:p>
+      <w:pPr>
+        <w:pStyle w:val="BodyText"/>
+        <w:jc w:val="both"/>
+      </w:pPr>
+      <w:r>
+        <w:t xml:space="preserve">Taken together, Table 1 supports a working rule rather than a pooled D-value. 500–600 MPa for a few minutes is the industrial vegetative window in these rows, and ice, lactate, fat, °Brix, agar, and strain cocktail are coefficients [2,7,13,18,22]. A 5-log pasteurisation claim cannot be read off that gauge. It has to be compared with a legal or HACCP number.</w:t>
       </w:r>
     </w:p>
     <w:p>
@@ -1464,7 +1485,7 @@
         <w:jc w:val="both"/>
       </w:pPr>
       <w:r>
-        <w:t xml:space="preserve">EFSA ran that comparison on industrial 600 MPa for 6 min as the stringent HPP case and still found fewer log10 reductions than legal heat for the pathogens that could be modelled, so HPP milk was not equivalent to pasteurisation on that metric [2].</w:t>
+        <w:t xml:space="preserve">Legal milk pasteurisation already names the comparator: time, temperature, and a 5 log10 performance criterion. EFSA modelled industrial 600 MPa for 6 min as the stringent HPP case and still found fewer log10 reductions than legal heat for the pathogens that could be compared [2]. HPP milk was therefore not equivalent to pasteurisation on that metric. Cited</w:t>
       </w:r>
       <w:r>
         <w:t xml:space="preserve"> </w:t>
@@ -1480,7 +1501,7 @@
         <w:t xml:space="preserve"> </w:t>
       </w:r>
       <w:r>
-        <w:t xml:space="preserve">data in milks show the pressure staircase behind the model: 200–250 MPa for 5–15 min often &lt;0.5 log10; 300, 350, and 400 MPa for 5 min about 1, 4.4, and 6.3 log10 in cited work inside the opinion [2].</w:t>
+        <w:t xml:space="preserve">data in milks show the pressure staircase behind the model: 200–250 MPa for 5–15 min often &lt;0.5 log10; 300, 350, and 400 MPa for 5 min about 1, 4.4, and 6.3 log10 [2].</w:t>
       </w:r>
       <w:r>
         <w:t xml:space="preserve"> </w:t>
@@ -1496,16 +1517,16 @@
         <w:t xml:space="preserve"> </w:t>
       </w:r>
       <w:r>
-        <w:t xml:space="preserve">is repeatedly the more resistant vegetative pathogen under pressure [2,25]. Alkaline phosphatase, the heat-pasteurisation indicator, does not verify HPP the way it verifies heat [2].</w:t>
-      </w:r>
-    </w:p>
-    <w:p>
-      <w:pPr>
-        <w:pStyle w:val="BodyText"/>
-        <w:jc w:val="both"/>
-      </w:pPr>
-      <w:r>
-        <w:t xml:space="preserve">A later systematic review of raw bovine milk asked the same equivalence question with a second endpoint. It found 65 papers with pathogen outcomes and 24 with bioactive proteins, but only four papers measured both [25]. Pressure was the strongest statistical contributor to log reductions for</w:t>
+        <w:t xml:space="preserve">is repeatedly the more resistant vegetative pathogen under pressure [2,25]. Alkaline phosphatase does not verify HPP the way it verifies heat [2].</w:t>
+      </w:r>
+    </w:p>
+    <w:p>
+      <w:pPr>
+        <w:pStyle w:val="BodyText"/>
+        <w:jc w:val="both"/>
+      </w:pPr>
+      <w:r>
+        <w:t xml:space="preserve">The same legal question can be asked with a second endpoint: named pathogens and native bioactive proteins on the same milk. A systematic review of raw bovine milk found 65 papers with pathogen outcomes and 24 with bioactive proteins, but only four papers measured both [25]. Pressure was the strongest statistical contributor to log reductions for</w:t>
       </w:r>
       <w:r>
         <w:t xml:space="preserve"> </w:t>
@@ -1560,7 +1581,7 @@
         <w:t xml:space="preserve">L. monocytogenes</w:t>
       </w:r>
       <w:r>
-        <w:t xml:space="preserve">, treatments above 551 MPa still needed more than about 5 min at 20–30 °C to reach &gt;5 log in the papers that got there; come-up and come-down alone were not enough [25].</w:t>
+        <w:t xml:space="preserve">, treatments above 551 MPa still needed more than about 5 min at 20–30 °C to reach &gt;5 log in the papers that got there [25]. Come-up and come-down alone were not enough.</w:t>
       </w:r>
       <w:r>
         <w:t xml:space="preserve"> </w:t>
@@ -1576,7 +1597,7 @@
         <w:t xml:space="preserve"> </w:t>
       </w:r>
       <w:r>
-        <w:t xml:space="preserve">kills above 5 log at 401–600 MPa often needed long holds; some &gt;5-log</w:t>
+        <w:t xml:space="preserve">kills above 5 log at 401–600 MPa often needed long holds. Some of those &gt;5-log</w:t>
       </w:r>
       <w:r>
         <w:t xml:space="preserve"> </w:t>
@@ -1592,7 +1613,7 @@
         <w:t xml:space="preserve"> </w:t>
       </w:r>
       <w:r>
-        <w:t xml:space="preserve">results used 60 °C and are no longer nonthermal [25]. A cycle mild enough to keep immunoglobulin G and lactoferrin is therefore not automatically a 5-log pathogen cycle, and the experiments that would show both on the same batch are scarce [25]. A paired high-temperature short-time versus HPP bovine-milk trial that reports both endpoints on the same batches is not among the included studies.</w:t>
+        <w:t xml:space="preserve">results used 60 °C and are no longer nonthermal [25]. A cycle mild enough to keep immunoglobulin G and lactoferrin is therefore not automatically a 5-log pathogen cycle. The experiments that would show both on the same batch are scarce [25]. A paired high-temperature short-time versus HPP bovine-milk trial that reports both endpoints on the same batches is not among the included studies.</w:t>
       </w:r>
     </w:p>
     <w:p>
@@ -1619,16 +1640,16 @@
         <w:t xml:space="preserve"> </w:t>
       </w:r>
       <w:r>
-        <w:t xml:space="preserve">for microbial control [26] and ultrasound, pulsed electric fields, and supercritical carbon dioxide promising dairy tools [27]. Those sentences compile selected rows; they do not rebut the EFSA model. Table 2 marks the difference.</w:t>
-      </w:r>
-    </w:p>
-    <w:p>
-      <w:pPr>
-        <w:pStyle w:val="BodyText"/>
-        <w:jc w:val="both"/>
-      </w:pPr>
-      <w:r>
-        <w:t xml:space="preserve">Primary cream and donkey-milk experiments fit</w:t>
+        <w:t xml:space="preserve">for microbial control [26] and ultrasound, pulsed electric fields, and supercritical carbon dioxide promising dairy tools [27]. Those sentences compile selected rows. They do not rebut the EFSA model. Table 2 marks the difference.</w:t>
+      </w:r>
+    </w:p>
+    <w:p>
+      <w:pPr>
+        <w:pStyle w:val="BodyText"/>
+        <w:jc w:val="both"/>
+      </w:pPr>
+      <w:r>
+        <w:t xml:space="preserve">Primary cream and donkey-milk experiments are consistent with</w:t>
       </w:r>
       <w:r>
         <w:t xml:space="preserve"> </w:t>
@@ -1637,7 +1658,7 @@
         <w:t xml:space="preserve">“</w:t>
       </w:r>
       <w:r>
-        <w:t xml:space="preserve">pressure helps, equivalence is not shown</w:t>
+        <w:t xml:space="preserve">pressure reduces some flora</w:t>
       </w:r>
       <w:r>
         <w:t xml:space="preserve">”</w:t>
@@ -1646,7 +1667,7 @@
         <w:t xml:space="preserve"> </w:t>
       </w:r>
       <w:r>
-        <w:t xml:space="preserve">rather than the sufficiency slogan. In dairy cream, 450 MPa for 5 min left total aerobic psychrotrophs similar to raw immediately and spoilage (&gt;6 log) from day 18; 600 MPa slowed recovery but heat still produced a different trajectory [15]. In donkey milk, 200, 400, and 500 MPa cut total aerobic bacteria by 0.85, 1.58, and 4.04 log CFU ml−1, while 75 °C for 2 min cut 1.34 log with much larger lysozyme loss in the results section than in the abstract [9]. Read from the results section, 400 MPa is closer to a quality-preserving pasteurisation analogue than 500 MPa is, and neither is a pathogen challenge [9].</w:t>
+        <w:t xml:space="preserve">rather than with legal equivalence. In dairy cream, 450 MPa for 5 min left total aerobic psychrotrophs similar to raw immediately, with spoilage (&gt;6 log) from day 18 [15]. 600 MPa slowed recovery, but heat still produced a different trajectory [15]. In donkey milk, 200, 400, and 500 MPa cut total aerobic bacteria by 0.85, 1.58, and 4.04 log CFU ml−1, while 75 °C for 2 min cut 1.34 log [9]. Lysozyme loss was much larger after heat in the results section than in the abstract [9]. Read from the results section, 400 MPa is closer to a quality-preserving analogue than 500 MPa is. Neither arm is a named-pathogen performance criterion [9].</w:t>
       </w:r>
     </w:p>
     <w:bookmarkEnd w:id="32"/>
@@ -1666,7 +1687,7 @@
         <w:jc w:val="both"/>
       </w:pPr>
       <w:r>
-        <w:t xml:space="preserve">Juice processors face the same 5-log number, now written for a named pathogen rather than for heat-pasteurised milk, even though acid already suppresses many organisms. Whole Concord grape purée showed about 5-log reduction of fresh APC after both HPP and heat; yeasts and moulds were &lt;1.0 log CFU/g after HPP versus 1.22 after heat, and HPP held those groups down longer in four-month storage [11]. That is a 5-log APC result, not a named</w:t>
+        <w:t xml:space="preserve">Juice processors face the same 5-log number, now written for a named pathogen rather than for heat-pasteurised milk. Acid already suppresses many organisms, so a drop in background aerobes is not the same measurement. Whole Concord grape purée showed about 5-log reduction of fresh APC after both HPP and heat [11]. Yeasts and moulds were &lt;1.0 log CFU/g after HPP versus 1.22 after heat, and HPP held those groups down longer in four-month storage [11]. That is a 5-log APC result, not a named</w:t>
       </w:r>
       <w:r>
         <w:t xml:space="preserve"> </w:t>
@@ -1682,7 +1703,16 @@
         <w:t xml:space="preserve"> </w:t>
       </w:r>
       <w:r>
-        <w:t xml:space="preserve">O157:H7 result. Celery juices after HPP kept total aerobic counts &lt;2 log CFU/ml for 8 weeks, with yeasts and moulds undetectable, while untreated juices spoiled in a week [28]. Semi-industrial red-globe grape juice lost about 3 log aerobic counts after HPP, ohmic heating, or thermal pasteurisation; PPO activity told a different story (HPP about 30% residual versus &gt;90% inactivation by ohmic and thermal) [8]. A flow-through dual-frequency sonicator at 50–55 °C reached &gt;3.6, 2.7, and 2.8 log reductions of yeast, mould, and aerobes in apple juice after 450 s efficient time and still missed a 5-log pathogen pasteurisation criterion; there was no isothermal heat-only arm [3]. None of the included juice papers reports an inoculated</w:t>
+        <w:t xml:space="preserve">O157:H7 result.</w:t>
+      </w:r>
+    </w:p>
+    <w:p>
+      <w:pPr>
+        <w:pStyle w:val="BodyText"/>
+        <w:jc w:val="both"/>
+      </w:pPr>
+      <w:r>
+        <w:t xml:space="preserve">Refrigerated stability and enzyme survival can move independently of that APC number. Celery juices after HPP kept total aerobic counts &lt;2 log CFU/ml for 8 weeks, with yeasts and moulds undetectable, while untreated juices spoiled in a week [28]. Semi-industrial red-globe grape juice lost about 3 log aerobic counts after HPP, ohmic heating, or thermal pasteurisation [8]. PPO activity told a different story: about 30% residual after HPP versus &gt;90% inactivation by ohmic heating and by heat [8]. A flow-through dual-frequency sonicator at 50–55 °C reached &gt;3.6, 2.7, and 2.8 log reductions of yeast, mould, and aerobes in apple juice after 450 s efficient time [3]. It still missed a 5-log pathogen pasteurisation criterion, and there was no isothermal heat-only arm [3]. None of the included juice papers reports an inoculated</w:t>
       </w:r>
       <w:r>
         <w:t xml:space="preserve"> </w:t>
@@ -2444,7 +2474,7 @@
         <w:jc w:val="both"/>
       </w:pPr>
       <w:r>
-        <w:t xml:space="preserve">Pressures below 600 MPa at room temperature struggle with bacterial spores because the dormant core is dehydrated and baroprotective, and some</w:t>
+        <w:t xml:space="preserve">Pressures below 600 MPa at room temperature struggle with bacterial spores because the dormant core is dehydrated and baroprotective [1]. Some</w:t>
       </w:r>
       <w:r>
         <w:t xml:space="preserve"> </w:t>
@@ -2460,16 +2490,25 @@
         <w:t xml:space="preserve"> </w:t>
       </w:r>
       <w:r>
-        <w:t xml:space="preserve">spores have been reported to survive 1200 MPa at ambient temperature in laboratory equipment [1]. HPTP uses the adiabatic temperature rise (about 3 °C per 100 MPa in water-rich foods, more in fats: about 4.5–6.3 °C per 100 MPa in chicken and beef fat, and still higher in oils) plus hold and decompression cooling so that time spent above 100 °C can be much shorter than a retort, which is why a baby-food purée can be discussed as an F0 equivalent of minutes rather than a &gt;60 min cook [16]. Commercial HPP machines usually do not supply that heat, dedicated industrial HPTP vessels were still not a retail line in the included engineering review, and packaging must survive both 600 MPa and about 120 °C, so refrigerated distribution below 7 °C is the practical control on spore outgrowth after a cold 600 MPa cycle [4,16]. Processors therefore sell HPP as a vegetative refrigerated hurdle rather than as botulinum cook, not because the physics of HPTP is unknown, but because the equipment and packaging have not made that physics cheap.</w:t>
-      </w:r>
-    </w:p>
-    <w:p>
-      <w:pPr>
-        <w:pStyle w:val="BodyText"/>
-        <w:jc w:val="both"/>
-      </w:pPr>
-      <w:r>
-        <w:t xml:space="preserve">Those industrial limits come with kinetic parameters, not a new challenge trial [4]. Vegetative inactivation in juices is often first-order, with D-values at 350 MPa on the order of 0.6–2 min for some lactic acid bacteria and yeasts, because those cells are already pressure-sensitive in acid, high-aw matrices [4]. Spore curves in fruit products are often concave-up (Weibull or biphasic) with tails: as time increases, remaining spores look harder, which is why a single ambient-600 MPa log cannot be extrapolated to a 5–6 log pasteurisation target [1,4]. For</w:t>
+        <w:t xml:space="preserve">spores have been reported to survive 1200 MPa at ambient temperature in laboratory equipment [1]. HPTP uses the adiabatic temperature rise to add heat without a long retort. That rise is about 3 °C per 100 MPa in water-rich foods, about 4.5–6.3 °C per 100 MPa in chicken and beef fat, and still higher in oils [16]. Hold and decompression cooling then follow. Time spent above 100 °C can therefore be much shorter than a retort, which is why a baby-food purée can be discussed as an F0 equivalent of minutes rather than a &gt;60 min cook [16].</w:t>
+      </w:r>
+    </w:p>
+    <w:p>
+      <w:pPr>
+        <w:pStyle w:val="BodyText"/>
+        <w:jc w:val="both"/>
+      </w:pPr>
+      <w:r>
+        <w:t xml:space="preserve">Commercial HPP machines usually do not supply that heat. Dedicated industrial HPTP vessels were still not a retail line in the included engineering review [16]. Packaging must survive both 600 MPa and about 120 °C [4,16]. Refrigerated distribution below 7 °C is therefore the practical control on spore outgrowth after a cold 600 MPa cycle [4,16]. Processors sell HPP as a vegetative refrigerated hurdle rather than as a botulinum cook. The physics of HPTP is not unknown. The equipment and packaging have not made that physics cheap.</w:t>
+      </w:r>
+    </w:p>
+    <w:p>
+      <w:pPr>
+        <w:pStyle w:val="BodyText"/>
+        <w:jc w:val="both"/>
+      </w:pPr>
+      <w:r>
+        <w:t xml:space="preserve">Those industrial limits come with kinetic parameters, not a new challenge trial [4]. Vegetative inactivation in juices is often first-order, with D-values at 350 MPa on the order of 0.6–2 min for some lactic acid bacteria and yeasts, because those cells are already pressure-sensitive in acid, high-aw matrices [4]. Spore curves in fruit products are often concave-up (Weibull or biphasic) with tails. As time increases, remaining spores look harder. A single ambient-600 MPa log therefore cannot be extrapolated to a 5–6 log pasteurisation target [1,4]. For</w:t>
       </w:r>
       <w:r>
         <w:t xml:space="preserve"> </w:t>
@@ -2485,7 +2524,7 @@
         <w:t xml:space="preserve"> </w:t>
       </w:r>
       <w:r>
-        <w:t xml:space="preserve">spores, a cited D-value at 600 MPa and 45 °C was 8.6 min in apple juice, 20 min in 20 °Brix lime concentrate, and 46 min in 30 °Brix blackcurrant concentrate, so soluble solids protect spores the way fat and lactate protect vegetative cells [4].</w:t>
+        <w:t xml:space="preserve">spores, a cited D-value at 600 MPa and 45 °C was 8.6 min in apple juice, 20 min in 20 °Brix lime concentrate, and 46 min in 30 °Brix blackcurrant concentrate [4]. Soluble solids protect spores the way fat and lactate protect vegetative cells.</w:t>
       </w:r>
       <w:r>
         <w:t xml:space="preserve"> </w:t>
@@ -2501,7 +2540,7 @@
         <w:t xml:space="preserve"> </w:t>
       </w:r>
       <w:r>
-        <w:t xml:space="preserve">ascospores in apple juice: 600 MPa at 75 °C for 10 min gave 3.3 log cfu/ml versus no reduction at 75 °C without pressure, in work cited by the fruit HPTP review [1]. That is synergy, and it is still not a 6-log pasteurisation of the most resistant mould spore in every concentrate.</w:t>
+        <w:t xml:space="preserve">ascospores in apple juice illustrate the same point with heat under pressure: 600 MPa at 75 °C for 10 min gave 3.3 log cfu/ml versus no reduction at 75 °C without pressure, in work cited by the fruit HPTP review [1]. That is synergy. It is still not a 6-log pasteurisation of the most resistant mould spore in every concentrate.</w:t>
       </w:r>
     </w:p>
     <w:p>
@@ -2526,7 +2565,7 @@
         <w:t xml:space="preserve"> </w:t>
       </w:r>
       <w:r>
-        <w:t xml:space="preserve">TEL spores, including after 24 h [29]. Diluting to aw 0.85 or 0.90 restored PATP lethality at 600 MPa / 15 min / 75 °C, whereas room-temperature 600 MPa still did not cut endospore loads [29]. Low-aw foods can therefore make</w:t>
+        <w:t xml:space="preserve">TEL spores, including after 24 h [29]. Diluting to aw 0.85 or 0.90 restored PATP lethality at 600 MPa / 15 min / 75 °C [29]. Room-temperature 600 MPa still did not cut endospore loads [29]. Low-aw foods can therefore make</w:t>
       </w:r>
       <w:r>
         <w:t xml:space="preserve"> </w:t>
@@ -2544,7 +2583,7 @@
         <w:t xml:space="preserve"> </w:t>
       </w:r>
       <w:r>
-        <w:t xml:space="preserve">look like heat, which already failed, which is why PATP of honey is discussed for diluted pharmaceutical preparations rather than as a way to pasteurise table honey without changing the product [29].</w:t>
+        <w:t xml:space="preserve">look like heat, which already failed. PATP of honey is discussed for diluted pharmaceutical preparations rather than as a way to pasteurise table honey without changing the product [29].</w:t>
       </w:r>
     </w:p>
     <w:bookmarkEnd w:id="35"/>
@@ -2564,7 +2603,7 @@
         <w:jc w:val="both"/>
       </w:pPr>
       <w:r>
-        <w:t xml:space="preserve">If even heat under pressure can fail when water activity is low, milder nonthermal partners cannot be sold as a spore cook. They are used to finish vegetative kill at milder set-points. A mini-review of HHP combinations in plant foods starts from pressure-resistant strains and storage regrowth after HHP alone, and treats nonthermal partners as process-design problems rather than as seasoning [14]. A hurdle review recites blueberry juice thermosonication plus 400 or 600 MPa / 5 min among combinations that let each factor run milder [21]. Ultrasound plus HPP eliminated detectable</w:t>
+        <w:t xml:space="preserve">If even heat under pressure can fail when water activity is low, milder nonthermal partners cannot be sold as a spore cook. They are used to finish vegetative kill at milder set-points. Plant-food combination work starts from pressure-resistant strains and from storage regrowth after HHP alone, and treats nonthermal partners as process-design problems rather than as seasoning [14]. Blueberry juice thermosonication plus 400 or 600 MPa / 5 min is recited among combinations that let each factor run milder [21]. Ultrasound plus HPP eliminated detectable</w:t>
       </w:r>
       <w:r>
         <w:t xml:space="preserve"> </w:t>
@@ -3205,16 +3244,16 @@
         <w:jc w:val="both"/>
       </w:pPr>
       <w:r>
-        <w:t xml:space="preserve">PPO and peroxidase in celery juice fell after HPP and stayed low while microbial counts held for 8 weeks [28]. In grape juice, the same class of enzyme barely moved under HPP while heat and ohmic heating removed more than 90% of PPO, so a cycle that already looks adequate on aerobic plates can leave the browning catalyst in place [8]. Cloud-stable orange juice historically uses 90–99 °C for 15–30 s to hit thermostable pectin methylesterase, because that fraction is the cloud-collapse enzyme; some pressure studies inactivate the heat-labile PME fraction at ≥500 MPa, with large residual variation by cultivar, which is why enzyme and microbe remain different targets on the same cycle [4].</w:t>
-      </w:r>
-    </w:p>
-    <w:p>
-      <w:pPr>
-        <w:pStyle w:val="BodyText"/>
-        <w:jc w:val="both"/>
-      </w:pPr>
-      <w:r>
-        <w:t xml:space="preserve">Native milk proteins and plant allergens are another protein class, and they unfold under pressure because non-covalent bonds yield and hydrophobic interiors become exposed [6]. A protein-source review reports lower allergenicity and higher digestibility/bioactivity for cereal, legume, and nut proteins after HHP, higher surface hydrophobicity for some seed and vegetable proteins, and mixed foaming/gelling/antioxidant shifts in dairy [6]. That is a functional-food story, not a Listeria story, and it is qualitative across methods. Holding IgG and lactoferrin is why some human-milk and bovine-milk arguments prefer HPP over Holder or high-temperature short-time: heat denatures those proteins more readily than a moderate pressure cycle does. Sykora’s four overlap papers are not enough to set a dual specification with the pathogen logs already shown for milk, because the cycle that keeps the protein is not automatically the cycle that delivers 5 log of</w:t>
+        <w:t xml:space="preserve">Enzyme activity and plate count are different targets on the same cycle. PPO and peroxidase in celery juice fell after HPP and stayed low while microbial counts held for 8 weeks [28]. In grape juice, the same class of enzyme barely moved under HPP, while heat and ohmic heating removed more than 90% of PPO [8]. A cycle that already looks adequate on aerobic plates can therefore leave the browning catalyst in place. Cloud-stable orange juice historically uses 90–99 °C for 15–30 s to hit thermostable pectin methylesterase, because that fraction is the cloud-collapse enzyme [4]. Some pressure studies inactivate the heat-labile PME fraction at ≥500 MPa, with large residual variation by cultivar [4]. Enzyme and microbe remain different specifications.</w:t>
+      </w:r>
+    </w:p>
+    <w:p>
+      <w:pPr>
+        <w:pStyle w:val="BodyText"/>
+        <w:jc w:val="both"/>
+      </w:pPr>
+      <w:r>
+        <w:t xml:space="preserve">Native milk proteins and plant allergens are another protein class. They unfold under pressure because non-covalent bonds yield and hydrophobic interiors become exposed [6]. A protein-source review reports lower allergenicity and higher digestibility or bioactivity for cereal, legume, and nut proteins after HHP, higher surface hydrophobicity for some seed and vegetable proteins, and mixed foaming, gelling, and antioxidant shifts in dairy [6]. That is a functional-food story, not a Listeria story, and it is qualitative across methods. Holding IgG and lactoferrin is why some human-milk and bovine-milk arguments prefer HPP over Holder pasteurisation or high-temperature short-time: heat denatures those proteins more readily than a moderate pressure cycle does. The four overlap papers that measured both pathogens and proteins are not enough to set a dual specification with the pathogen logs already shown for milk [25]. The cycle that keeps the protein is not automatically the cycle that delivers 5 log of</w:t>
       </w:r>
       <w:r>
         <w:t xml:space="preserve"> </w:t>
@@ -3227,10 +3266,7 @@
         <w:t xml:space="preserve">S. aureus</w:t>
       </w:r>
       <w:r>
-        <w:t xml:space="preserve"> </w:t>
-      </w:r>
-      <w:r>
-        <w:t xml:space="preserve">[25]. Donkey milk shows the trade in one factorial: 500 MPa maximised aerobic kill and maximised lactoferrin activity loss, so choosing the microbial maximum spent the quality claim that had justified avoiding 75 °C [9].</w:t>
+        <w:t xml:space="preserve">. Donkey milk shows the trade in one factorial: 500 MPa maximised aerobic kill and maximised lactoferrin activity loss [9]. Choosing the microbial maximum spent the quality claim that had justified avoiding 75 °C.</w:t>
       </w:r>
     </w:p>
     <w:bookmarkEnd w:id="38"/>
@@ -3266,7 +3302,7 @@
         <w:t xml:space="preserve"> </w:t>
       </w:r>
       <w:r>
-        <w:t xml:space="preserve">hardness fell from 312 g untreated to 38 g at 600 MPa (about 88% drop), with compression distance halved [10]. That kelp is not a ready-to-eat meat, but it is a reminder that 600 MPa is not gentle for every gel. Macroalgae-fortified sausages gained minerals and, immediately after HPP, total aerobic mesophiles &lt;1.0 log CFU/g in the fortified HPP batch [30]. Pumpkin pulp with a natural preservative plus HPP showed no microbial growth for 45 days, with better colour and firmness than a thermal comparator in the NBP formulations [31]. Minimally processed potatoes lost lightness and gained ΔE after HPP or HPP/ultrasound; Enterobacteriaceae became undetectable after HPP, while combined ultrasound did not stay different from untreated APC by day 14 [32]. Quality and kill can trade in either direction.</w:t>
+        <w:t xml:space="preserve">hardness fell from 312 g untreated to 38 g at 600 MPa (about 88% drop), with compression distance halved [10]. That kelp is not a ready-to-eat meat. It is a reminder that 600 MPa is not gentle for every gel. Macroalgae-fortified sausages gained minerals and, immediately after HPP, total aerobic mesophiles &lt;1.0 log CFU/g in the fortified HPP batch [30]. Pumpkin pulp with a natural preservative plus HPP showed no microbial growth for 45 days, with better colour and firmness than a thermal comparator in the NBP formulations [31]. Minimally processed potatoes lost lightness and gained ΔE after HPP or HPP/ultrasound [32]. Enterobacteriaceae became undetectable after HPP, while combined ultrasound did not stay different from untreated APC by day 14 [32]. Quality and kill can trade in either direction.</w:t>
       </w:r>
     </w:p>
     <w:bookmarkEnd w:id="39"/>
@@ -3328,7 +3364,7 @@
         <w:t xml:space="preserve"> </w:t>
       </w:r>
       <w:r>
-        <w:t xml:space="preserve">graph. Castrica’s dual-species fillet trial is the cleanest storage design among the included fish papers: treated salmon and plaice stayed acceptable to day 12 while untreated flora ran ahead, and histamine stayed low [33]. Wang’s mackerel fish balls at 250–350 MPa started &lt;1 log CFU/g versus about 2.2 in controls and stayed down for 7 days at 4 °C; counts can look similar to a 121 °C retort at day 7 while the thermal product is a different food [34]. Nilsuwan’s mint extract plus 400 MPa on squid delayed total viable count relative to pressure or extract alone, with several treatments still crossing a TVC limit by day 6 without the mint; the extra kill is modest, so the benefit is days of delay rather than a spore cook [35]. Precooked crab needed 300 MPa more than 100 MPa to move</w:t>
+        <w:t xml:space="preserve">graph. In a dual-species fillet trial, treated salmon and plaice stayed acceptable to day 12 while untreated flora ran ahead, and histamine stayed low [33]. Mackerel fish balls at 250–350 MPa started &lt;1 log CFU/g versus about 2.2 in controls and stayed down for 7 days at 4 °C [34]. Counts can look similar to a 121 °C retort at day 7, while the thermal product is a different food. Mint extract plus 400 MPa on squid delayed total viable count relative to pressure or extract alone [35]. Several treatments still crossed a TVC limit by day 6 without the mint. The extra kill is modest, so the benefit is days of delay rather than a spore cook. Precooked crab needed 300 MPa more than 100 MPa to move</w:t>
       </w:r>
       <w:r>
         <w:t xml:space="preserve"> </w:t>
@@ -3385,7 +3421,7 @@
         <w:t xml:space="preserve"> </w:t>
       </w:r>
       <w:r>
-        <w:t xml:space="preserve">on prawn), so topography limited a process that looked excellent in buffer [36]. Lamb burgers with lupin flour dropped coliforms and</w:t>
+        <w:t xml:space="preserve">on prawn) [36]. Topography limited a process that looked excellent in buffer. Lamb burgers with lupin flour dropped coliforms and</w:t>
       </w:r>
       <w:r>
         <w:t xml:space="preserve"> </w:t>
@@ -3401,7 +3437,7 @@
         <w:t xml:space="preserve"> </w:t>
       </w:r>
       <w:r>
-        <w:t xml:space="preserve">below 1 log whether a long hold or two short HHP cycles were used [23]. Sous-vide products after high hydrostatic pressure stayed below 1.30 log CFU/g on TSA through day 45 in one trial while controls exceeded 5 log [37]. An aquatic-food UHP review collects these patterns without a pooled shelf-life [38]. Ultrasound-assisted ultra-high pressure in a lactic fermentation changed antioxidant readings and sugar consumption at 24–40 h; that is process intensification of a ferment, not pasteurisation of a pathogen [39]. Marçal’s mineral-fortified sausages and Rossi Ribeiro’s pumpkin pulp show HPP as a shelf-life tool in formulated products where</w:t>
+        <w:t xml:space="preserve">below 1 log whether a long hold or two short HHP cycles were used [23]. Sous-vide products after high hydrostatic pressure stayed below 1.30 log CFU/g on TSA through day 45 in one trial, while controls exceeded 5 log [37]. An aquatic-food UHP review collects these patterns without a pooled shelf-life [38]. Ultrasound-assisted ultra-high pressure in a lactic fermentation changed antioxidant readings and sugar consumption at 24–40 h [39]. That is process intensification of a ferment, not pasteurisation of a pathogen. Mineral-fortified sausages and pumpkin pulp with a natural preservative show HPP as a shelf-life tool in formulated products where</w:t>
       </w:r>
       <w:r>
         <w:t xml:space="preserve"> </w:t>
@@ -3507,7 +3543,7 @@
         <w:jc w:val="both"/>
       </w:pPr>
       <w:r>
-        <w:t xml:space="preserve">Broad matrix reviews rank HPP among options with typical vegetative reductions of 3–6 log10 and a high technology-readiness level, while insisting that no method is universal [43]. Beverage reviews argue that nonthermal methods can match thermal preservation with better nutrient retention, reciting a soy smoothie at 650 MPa / 20 °C / 3 min among examples [44]. Those sentences are maps. They do not override Tables 1–3. Weihe’s ranking of fields by typical log10 and readiness is useful for an engineer choosing a vessel; it is not a substitute for the milk opinion or the RTE-meat scoping range [2,7,43]. Jeevitha’s smoothie example sits at 650 MPa, which is already above many commercial 600 MPa ceilings discussed for plant foods [4,44]. Hashemi’s mycotoxin percentages come from long ultrasonic treatments that would not be confused with a 3-minute HPP juice cycle if the methods were read [3,40]. Mukhtar’s sugarcane ranking of HHP versus ohmic heating is matrix-bound [41]. Zhang’s ultrasound-assisted ultra-high pressure fermentation is a different unit operation again: antioxidants and sugar use in a lactic culture, not a pathogen specification [39]. Folding those rows into Tables 1–2 would mix unit operations that share a slogan more than a mechanism.</w:t>
+        <w:t xml:space="preserve">Broad matrix reviews rank HPP among options with typical vegetative reductions of 3–6 log10 and a high technology-readiness level, while insisting that no method is universal [43]. Beverage reviews argue that nonthermal methods can match thermal preservation with better nutrient retention, reciting a soy smoothie at 650 MPa / 20 °C / 3 min among examples [44]. Those sentences are maps. They do not override Tables 1–3. Ranking fields by typical log10 and readiness is useful for an engineer choosing a vessel [43]. It is not a substitute for the milk opinion or the RTE-meat scoping range [2,7]. The smoothie example sits at 650 MPa, which is already above many commercial 600 MPa ceilings discussed for plant foods [4,44]. Mycotoxin percentages come from long ultrasonic treatments that would not be confused with a 3-minute HPP juice cycle if the methods were read [3,40]. Ranking of HHP versus ohmic heating in sugarcane juice is matrix-bound [41]. Ultrasound-assisted ultra-high pressure fermentation is a different unit operation: antioxidants and sugar use in a lactic culture, not a pathogen specification [39]. Folding those rows into Tables 1–2 would mix unit operations that share a label more than a mechanism.</w:t>
       </w:r>
     </w:p>
     <w:p>
@@ -3537,7 +3573,7 @@
         <w:jc w:val="both"/>
       </w:pPr>
       <w:r>
-        <w:t xml:space="preserve">Two readings of HPP can both be true, and they stay true for mechanistic reasons rather than for marketing ones. Commercially, 500–600 MPa for a few minutes is already a vegetative pasteurisation for refrigerated juices, guacamole-style herb pastes, and post-lethality RTE meats, because those products need a Listeria or spoilage hurdle without a second cook, and because a cold chain is already part of the labelled life [4,7]. On milk, the same window is not equivalent to legal pasteurisation on EFSA’s comparison: indicator enzymes do not transfer,</w:t>
+        <w:t xml:space="preserve">The included literature supports two conclusions that look opposed only if they are forced into one sentence. At 500–600 MPa for a few minutes, HPP repeatedly reduces vegetative flora in refrigerated juices, guacamole-style herb pastes, and post-lethality RTE meats [4,7]. Those products can avoid a second cook while a cold chain remains part of the labelled life. On milk, the same window is not equivalent to legal pasteurisation on EFSA’s comparison. Indicator enzymes do not transfer.</w:t>
       </w:r>
       <w:r>
         <w:t xml:space="preserve"> </w:t>
@@ -3553,7 +3589,7 @@
         <w:t xml:space="preserve"> </w:t>
       </w:r>
       <w:r>
-        <w:t xml:space="preserve">is repeatedly the more resistant vegetative pathogen, and bioactive-protein preservation has not been co-validated with 5-log pathogen kill on enough shared batches [2,25]. Collapsing those readings into one</w:t>
+        <w:t xml:space="preserve">is repeatedly the more resistant vegetative pathogen. Bioactive-protein preservation has not been co-validated with 5-log pathogen kill on enough shared batches [2,25]. Those are different questions: a commercial vegetative hurdle versus legal heat equivalence. Collapsing them into</w:t>
       </w:r>
       <w:r>
         <w:t xml:space="preserve"> </w:t>
@@ -3571,16 +3607,16 @@
         <w:t xml:space="preserve"> </w:t>
       </w:r>
       <w:r>
-        <w:t xml:space="preserve">sentence is how a narrative review would mislead, and it is why the logs cannot be pooled.</w:t>
-      </w:r>
-    </w:p>
-    <w:p>
-      <w:pPr>
-        <w:pStyle w:val="BodyText"/>
-        <w:jc w:val="both"/>
-      </w:pPr>
-      <w:r>
-        <w:t xml:space="preserve">Guzel’s scoping review refused a meta-analysis because variance, D-values-only papers, and single-strain challenges broke the table [7]. Torrents-Masoliver showed that fruit and agar can multiply apparent kill [13]. Serra-Castelló showed that lactate, a normal ham ingredient, subtracts kill [22]. Wu collected injury as a systematic after-effect of nonthermal culture success [5]. Averaging 1 log and 7 log at</w:t>
+        <w:t xml:space="preserve">is not licensed by the measurements.</w:t>
+      </w:r>
+    </w:p>
+    <w:p>
+      <w:pPr>
+        <w:pStyle w:val="BodyText"/>
+        <w:jc w:val="both"/>
+      </w:pPr>
+      <w:r>
+        <w:t xml:space="preserve">The spread of reported logs is information about coefficients, not a reason to average them. A scoping review of RTE meats refused meta-analysis because variance, D-value-only papers, and single-strain challenges broke the table [7]. Fruit composition and agar changed apparent kill [13]. Lactate, a normal ham ingredient, subtracted kill [22]. Injury and viable-but-nonculturable states can coexist with culture success [5]. Averaging 1 log and 7 log at</w:t>
       </w:r>
       <w:r>
         <w:t xml:space="preserve"> </w:t>
@@ -3607,16 +3643,25 @@
         <w:jc w:val="both"/>
       </w:pPr>
       <w:r>
-        <w:t xml:space="preserve">Quality claims need that same refusal to average unlike thermometers. PPO, lysozyme, kelp hardness, and APC do not move together. Eran Nagar’s grape juice is the exhibit: similar microbial drops, unlike enzyme drops, across HPP, ohmic, and thermal [8]. Braspaiboon’s allergenicity trends are a fifth thermometer still largely unconnected to the Listeria rows [6].</w:t>
-      </w:r>
-    </w:p>
-    <w:p>
-      <w:pPr>
-        <w:pStyle w:val="BodyText"/>
-        <w:jc w:val="both"/>
-      </w:pPr>
-      <w:r>
-        <w:t xml:space="preserve">Ultrasound, plasma, and irradiation are too thinly evidenced here to rank against HPP. Ultrasound missed 5-log in apple juice [3]. Plasma lost about 2–3 log moving from bench lettuce to pilot [20]. Irradiation evidence here is a mini-review [42]. High-pressure carbon dioxide looked strong in suspension and weaker on prawn [36]. Substituting</w:t>
+        <w:t xml:space="preserve">Quality claims need the same refusal. PPO, lysozyme, kelp hardness, and APC do not move together. Grape juice showed similar microbial drops and unlike enzyme drops across HPP, ohmic, and thermal treatments [8]. Allergenicity trends after HHP are a further endpoint, still largely unconnected to the Listeria rows [6]. A cycle can therefore be adequate on one specification and inadequate on another. The specification has to be named.</w:t>
+      </w:r>
+    </w:p>
+    <w:p>
+      <w:pPr>
+        <w:pStyle w:val="BodyText"/>
+        <w:jc w:val="both"/>
+      </w:pPr>
+      <w:r>
+        <w:t xml:space="preserve">Taken together, lethality, legal status, and quality are not properties of a megapascal value. They emerge from the interaction of pressure with ice, solute, pH, water activity, strain, recovery medium, and the endpoint that was actually assayed. That is why an RTE-meat success, an EFSA milk non-equivalence, and a grape-juice APC result can all be true without licensing a single industrial claim.</w:t>
+      </w:r>
+    </w:p>
+    <w:p>
+      <w:pPr>
+        <w:pStyle w:val="BodyText"/>
+        <w:jc w:val="both"/>
+      </w:pPr>
+      <w:r>
+        <w:t xml:space="preserve">Ultrasound, plasma, and irradiation remain too thinly evidenced here to rank against HPP as substitutes. The included sonicator missed a 5-log pathogen criterion in apple juice [3]. Plasma-functionalised water lost about 2–3 log moving from bench lettuce to a pilot wash [20]. Irradiation evidence here is a mini-review with a different legal history [42]. High-pressure carbon dioxide looked strong in suspension and weaker on prawn [36]. Substituting</w:t>
       </w:r>
       <w:r>
         <w:t xml:space="preserve"> </w:t>
@@ -3652,16 +3697,16 @@
         <w:t xml:space="preserve"> </w:t>
       </w:r>
       <w:r>
-        <w:t xml:space="preserve">in a conclusion would erase those differences.</w:t>
-      </w:r>
-    </w:p>
-    <w:p>
-      <w:pPr>
-        <w:pStyle w:val="BodyText"/>
-        <w:jc w:val="both"/>
-      </w:pPr>
-      <w:r>
-        <w:t xml:space="preserve">Even inside HPP, pH still splits the safety class. Low-acid vegetable juices (pH above 4.6) remain a botulinum problem if the cold chain fails; processors still have to show that the product cannot support growth and toxin within its labelled life [4]. Refrigeration after HPP is therefore not only a quality choice. It is the control that makes commercial 600 MPa cycles legal for soups and some vegetable juices that would otherwise need a full sterilisation mentality [4,16]. Fruit juices below pH 4.6 are kinder, but acid-tolerant</w:t>
+        <w:t xml:space="preserve">in a conclusion would erase those differences of mechanism, scale, and regulation.</w:t>
+      </w:r>
+    </w:p>
+    <w:p>
+      <w:pPr>
+        <w:pStyle w:val="BodyText"/>
+        <w:jc w:val="both"/>
+      </w:pPr>
+      <w:r>
+        <w:t xml:space="preserve">Even inside HPP, pH still splits the safety class. Low-acid vegetable juices (pH above 4.6) remain a botulinum problem if the cold chain fails [4]. Processors still have to show that the product cannot support growth and toxin within its labelled life. Refrigeration after HPP is therefore not only a quality choice. It is the control that makes commercial 600 MPa cycles legal for soups and some vegetable juices that would otherwise need a full sterilisation mentality [4,16]. Fruit juices below pH 4.6 are kinder to vegetative control, but acid-tolerant</w:t>
       </w:r>
       <w:r>
         <w:t xml:space="preserve"> </w:t>
@@ -3693,16 +3738,16 @@
         <w:t xml:space="preserve"> </w:t>
       </w:r>
       <w:r>
-        <w:t xml:space="preserve">can survive for weeks at low pH with a low infectious dose, which is why a named-pathogen 5-log test is not optional [4]. The included grape and celery papers did not run that test [11,28].</w:t>
-      </w:r>
-    </w:p>
-    <w:p>
-      <w:pPr>
-        <w:pStyle w:val="BodyText"/>
-        <w:jc w:val="both"/>
-      </w:pPr>
-      <w:r>
-        <w:t xml:space="preserve">Limitations of the studies are also limitations of this review. Named-pathogen juice validations (</w:t>
+        <w:t xml:space="preserve">can survive for weeks at low pH with a low infectious dose [4]. A named-pathogen 5-log test is not optional on that reading. The included grape and celery papers did not run that test [11,28].</w:t>
+      </w:r>
+    </w:p>
+    <w:p>
+      <w:pPr>
+        <w:pStyle w:val="BodyText"/>
+        <w:jc w:val="both"/>
+      </w:pPr>
+      <w:r>
+        <w:t xml:space="preserve">What cannot currently be concluded follows from those holes rather than from a generic call for more work. Named-pathogen juice validations (</w:t>
       </w:r>
       <w:r>
         <w:rPr>
@@ -3731,16 +3776,16 @@
         <w:t xml:space="preserve"> </w:t>
       </w:r>
       <w:r>
-        <w:t xml:space="preserve">under HPP) and a paired bovine-milk HTST versus HPP trial with both pathogen and protein endpoints are not among the included full texts. Abstracts can disagree with results (donkey milk [9]). Several reviews recycle the same spore examples. Honey, kelp, crab, and cream are not one population. None of the included primary papers is a randomised trial of human foodborne disease. The plant-food kinetics review adds D-values and equipment limits; it does not add a new inoculation [4].</w:t>
-      </w:r>
-    </w:p>
-    <w:p>
-      <w:pPr>
-        <w:pStyle w:val="BodyText"/>
-        <w:jc w:val="both"/>
-      </w:pPr>
-      <w:r>
-        <w:t xml:space="preserve">What should be measured next follows from those holes rather than from a generic call for more work. A bovine-milk HPP versus high-temperature short-time experiment that reports the same pathogen cocktail (including</w:t>
+        <w:t xml:space="preserve">under HPP) and a paired bovine-milk high-temperature short-time versus HPP trial with both pathogen and protein endpoints are not among the included full texts. Abstracts can disagree with results, as in donkey milk [9]. Several reviews recycle the same spore examples. Honey, kelp, crab, and cream are not one population. None of the included primary papers is a randomised trial of human foodborne disease. The plant-food kinetics review adds D-values and equipment limits; it does not add a new inoculation [4]. Those limits do not weaken the vegetative-hurdle claim. They bound it.</w:t>
+      </w:r>
+    </w:p>
+    <w:p>
+      <w:pPr>
+        <w:pStyle w:val="BodyText"/>
+        <w:jc w:val="both"/>
+      </w:pPr>
+      <w:r>
+        <w:t xml:space="preserve">What should be measured next follows from the same bounds. A bovine-milk HPP versus high-temperature short-time experiment that reports the same pathogen cocktail (including</w:t>
       </w:r>
       <w:r>
         <w:t xml:space="preserve"> </w:t>

</xml_diff>